<commit_message>
Update HYPSTAT Full Documentation.docx
</commit_message>
<xml_diff>
--- a/HYPSTAT Full Documentation.docx
+++ b/HYPSTAT Full Documentation.docx
@@ -503,23 +503,34 @@
     <w:p>
       <w:pPr>
         <w:pStyle w:val="NRELHead01"/>
+        <w:rPr>
+          <w:del w:id="12" w:author="Li, Yijin" w:date="2024-12-11T12:56:00Z" w16du:dateUtc="2024-12-11T20:56:00Z"/>
+        </w:rPr>
       </w:pPr>
       <w:r>
         <w:br w:type="page"/>
       </w:r>
-      <w:bookmarkStart w:id="12" w:name="_Toc179465200"/>
+      <w:bookmarkStart w:id="13" w:name="_Toc179465200"/>
       <w:r>
         <w:lastRenderedPageBreak/>
-        <w:t>Executive Summary</w:t>
-      </w:r>
-      <w:bookmarkEnd w:id="12"/>
+        <w:t xml:space="preserve">Executive </w:t>
+      </w:r>
+      <w:proofErr w:type="spellStart"/>
+      <w:r>
+        <w:t>Summary</w:t>
+      </w:r>
+      <w:bookmarkEnd w:id="13"/>
     </w:p>
     <w:p>
       <w:pPr>
         <w:pStyle w:val="NRELBodyText"/>
       </w:pPr>
       <w:r>
-        <w:t>You may include the Executive Summary in the Table of Contents (using “NREL_Head_01”) or omit it (using “NREL_Head_01_Not in TOC”).</w:t>
+        <w:t>The</w:t>
+      </w:r>
+      <w:proofErr w:type="spellEnd"/>
+      <w:r>
+        <w:t xml:space="preserve"> Hydrogen Production, Storage, and Transmission Analysis Tool (HYPSTAT) is a modeling framework developed by the National Renewable Energy Laboratory (NREL) to support the analysis of hydrogen systems. HYPSTAT focuses on key components of hydrogen infrastructure, particularly electrolytic hydrogen production, hydrogen storage, and hydrogen transmission, as part of the transition to decarbonized energy systems</w:t>
       </w:r>
     </w:p>
     <w:p>
@@ -527,115 +538,55 @@
         <w:pStyle w:val="NRELBodyText"/>
       </w:pPr>
       <w:r>
-        <w:t xml:space="preserve">Body text is </w:t>
-      </w:r>
-      <w:r>
-        <w:t>Times New Roman</w:t>
-      </w:r>
-      <w:r>
-        <w:t xml:space="preserve"> 12. Enter body text. Enter body text.</w:t>
-      </w:r>
-      <w:r>
-        <w:t xml:space="preserve"> </w:t>
-      </w:r>
-      <w:r>
-        <w:t>Enter body text.</w:t>
-      </w:r>
-      <w:r>
-        <w:t xml:space="preserve"> </w:t>
-      </w:r>
-      <w:r>
-        <w:t>Enter body text.</w:t>
-      </w:r>
-      <w:r>
-        <w:t xml:space="preserve"> </w:t>
-      </w:r>
-      <w:r>
-        <w:t>Enter body text.</w:t>
-      </w:r>
-      <w:r>
-        <w:t xml:space="preserve"> </w:t>
-      </w:r>
-      <w:r>
-        <w:t>Enter body text.</w:t>
-      </w:r>
-      <w:r>
-        <w:t xml:space="preserve"> </w:t>
-      </w:r>
-      <w:r>
-        <w:t>Enter body text.</w:t>
-      </w:r>
-      <w:r>
-        <w:t xml:space="preserve"> </w:t>
-      </w:r>
-      <w:r>
-        <w:t>Enter body text.</w:t>
-      </w:r>
-      <w:r>
-        <w:t xml:space="preserve"> </w:t>
-      </w:r>
-      <w:r>
-        <w:t>Enter body text.</w:t>
-      </w:r>
-      <w:r>
-        <w:t xml:space="preserve"> </w:t>
-      </w:r>
-      <w:r>
-        <w:t>Enter body text.</w:t>
-      </w:r>
-      <w:r>
-        <w:t xml:space="preserve"> </w:t>
-      </w:r>
-      <w:r>
-        <w:t>Enter body text.</w:t>
-      </w:r>
-      <w:r>
-        <w:t xml:space="preserve"> </w:t>
-      </w:r>
-      <w:r>
-        <w:t>Enter body text.</w:t>
-      </w:r>
-      <w:r>
-        <w:t xml:space="preserve"> </w:t>
-      </w:r>
-      <w:r>
-        <w:t>Enter body text.</w:t>
-      </w:r>
-      <w:r>
-        <w:t xml:space="preserve"> </w:t>
-      </w:r>
-      <w:r>
-        <w:t>Enter body text.</w:t>
-      </w:r>
-      <w:r>
-        <w:t xml:space="preserve"> </w:t>
-      </w:r>
-      <w:r>
-        <w:t>Enter body text.</w:t>
-      </w:r>
-      <w:r>
-        <w:t xml:space="preserve"> </w:t>
-      </w:r>
-      <w:r>
-        <w:t>Enter body text.</w:t>
-      </w:r>
-      <w:r>
-        <w:t xml:space="preserve"> </w:t>
-      </w:r>
-      <w:r>
-        <w:t>Enter body text.</w:t>
-      </w:r>
-      <w:r>
-        <w:t xml:space="preserve"> </w:t>
-      </w:r>
-      <w:r>
-        <w:t>Enter body text.</w:t>
+        <w:t xml:space="preserve">HYPSTAT operates as a supply-to-demand model, taking a fixed exogenous demand as input and optimizing the design and operation of the hydrogen system to meet that demand. It determines cost-optimal configurations based on specified technology options and system constraints. HYPSTAT formulates the hydrogen system as a linear or mixed-integer linear optimization problem using the </w:t>
+      </w:r>
+      <w:proofErr w:type="spellStart"/>
+      <w:r>
+        <w:t>Pyomo</w:t>
+      </w:r>
+      <w:proofErr w:type="spellEnd"/>
+      <w:r>
+        <w:t xml:space="preserve"> package in Python. The tool supports key processes such as input handling, model formulation, and solving. While basic output processing capabilities are under development, the primary focus remains on model formulation and optimization. HYPSTAT can be configured in two optimization modes: mixed-integer and fully linear. The mixed-integer mode captures non-linear pipeline costs, while the fully linear mode simplifies the formulation and reduces solve times.</w:t>
       </w:r>
     </w:p>
     <w:p>
       <w:pPr>
         <w:pStyle w:val="NRELBodyText"/>
       </w:pPr>
+      <w:r>
+        <w:t>HYPSTAT does not account for endogenous market dynamics such as fluctuating supply and demand conditions or hydrogen pricing. The demand is treated as fixed, and the results capture system costs but do not estimate hydrogen market prices directly. Additionally, the model is designed to simulate a single year at a time, making it unsuitable for capacity expansion analysis, although the input structure allows for easy execution of multiple year analyses to draw insights about long-term capacity growth.</w:t>
+      </w:r>
+    </w:p>
+    <w:p>
+      <w:pPr>
+        <w:pStyle w:val="NRELBodyText"/>
+      </w:pPr>
+      <w:r>
+        <w:t>To improve pipeline location results, HYPSTAT supports a two-step solve approach, first using coarser resolution and then refining with higher resolution. The tool also offers flexible time resolution, allowing users to down-sample input data for faster model solves.</w:t>
+      </w:r>
+    </w:p>
+    <w:p>
+      <w:pPr>
+        <w:pStyle w:val="NRELBodyText"/>
+      </w:pPr>
+      <w:r>
+        <w:t>HYPSTAT is designed to assist in evaluating system-level hydrogen infrastructure needs, offering insights into optimal system configurations, including the integration of renewable energy and hydrogen production systems. Its outputs can inform decision-making for policymakers, system planners, and energy developers, especially in areas focused on the transition to clean energy systems. While HYPSTAT provides valuable insights into hydrogen system operations and infrastructure needs, it has some limitations. These include its inability to capture dynamic market behaviors and the omission of non-electrolytic hydrogen production. Additionally, limited output processing capabilities are currently under development, suggesting further expansion of HYPSTAT’s functionality in future versions.</w:t>
+      </w:r>
+    </w:p>
+    <w:p>
+      <w:pPr>
+        <w:pStyle w:val="NRELBodyText"/>
+      </w:pPr>
+    </w:p>
+    <w:p>
+      <w:pPr>
+        <w:pStyle w:val="NRELBodyText"/>
+      </w:pPr>
+    </w:p>
+    <w:p>
+      <w:pPr>
+        <w:pStyle w:val="NRELBodyText"/>
+      </w:pPr>
     </w:p>
     <w:p>
       <w:pPr>
@@ -644,7 +595,7 @@
       <w:r>
         <w:br w:type="page"/>
       </w:r>
-      <w:bookmarkStart w:id="13" w:name="_Toc291051268"/>
+      <w:bookmarkStart w:id="14" w:name="_Toc291051268"/>
       <w:r>
         <w:lastRenderedPageBreak/>
         <w:t xml:space="preserve">Table of </w:t>
@@ -652,7 +603,7 @@
       <w:r>
         <w:t>Contents</w:t>
       </w:r>
-      <w:bookmarkEnd w:id="13"/>
+      <w:bookmarkEnd w:id="14"/>
     </w:p>
     <w:p>
       <w:pPr>
@@ -4960,14 +4911,14 @@
       <w:r>
         <w:br w:type="page"/>
       </w:r>
-      <w:bookmarkStart w:id="14" w:name="_Toc291051269"/>
-      <w:bookmarkStart w:id="15" w:name="_Toc352071744"/>
+      <w:bookmarkStart w:id="15" w:name="_Toc291051269"/>
+      <w:bookmarkStart w:id="16" w:name="_Toc352071744"/>
       <w:r>
         <w:lastRenderedPageBreak/>
         <w:t>List of Figures</w:t>
       </w:r>
-      <w:bookmarkEnd w:id="14"/>
       <w:bookmarkEnd w:id="15"/>
+      <w:bookmarkEnd w:id="16"/>
     </w:p>
     <w:p>
       <w:pPr>
@@ -5163,17 +5114,17 @@
       <w:pPr>
         <w:pStyle w:val="NRELHead01NotinTOC"/>
       </w:pPr>
-      <w:bookmarkStart w:id="16" w:name="_Toc291051270"/>
-      <w:bookmarkStart w:id="17" w:name="_Toc352071745"/>
+      <w:bookmarkStart w:id="17" w:name="_Toc291051270"/>
+      <w:bookmarkStart w:id="18" w:name="_Toc352071745"/>
       <w:r>
         <w:t>List of Tables</w:t>
       </w:r>
-      <w:bookmarkEnd w:id="16"/>
       <w:bookmarkEnd w:id="17"/>
-    </w:p>
-    <w:bookmarkStart w:id="18" w:name="_Toc131925443"/>
-    <w:bookmarkStart w:id="19" w:name="_Toc131925489"/>
-    <w:bookmarkStart w:id="20" w:name="_Toc225583134"/>
+      <w:bookmarkEnd w:id="18"/>
+    </w:p>
+    <w:bookmarkStart w:id="19" w:name="_Toc131925443"/>
+    <w:bookmarkStart w:id="20" w:name="_Toc131925489"/>
+    <w:bookmarkStart w:id="21" w:name="_Toc225583134"/>
     <w:p>
       <w:pPr>
         <w:pStyle w:val="TableofFigures"/>
@@ -5524,18 +5475,17 @@
       <w:r>
         <w:br w:type="page"/>
       </w:r>
-      <w:bookmarkStart w:id="21" w:name="_Toc291051272"/>
-      <w:bookmarkStart w:id="22" w:name="_Toc291052384"/>
-      <w:bookmarkStart w:id="23" w:name="_Toc314819176"/>
-      <w:bookmarkStart w:id="24" w:name="_Toc314823678"/>
-      <w:bookmarkStart w:id="25" w:name="_Toc352071746"/>
+      <w:bookmarkStart w:id="22" w:name="_Toc291051272"/>
+      <w:bookmarkStart w:id="23" w:name="_Toc291052384"/>
+      <w:bookmarkStart w:id="24" w:name="_Toc314819176"/>
+      <w:bookmarkStart w:id="25" w:name="_Toc314823678"/>
+      <w:bookmarkStart w:id="26" w:name="_Toc352071746"/>
     </w:p>
     <w:p>
       <w:pPr>
         <w:pStyle w:val="NRELHead01Numbered"/>
       </w:pPr>
-      <w:bookmarkStart w:id="26" w:name="_Toc179465201"/>
-      <w:bookmarkEnd w:id="18"/>
+      <w:bookmarkStart w:id="27" w:name="_Toc179465201"/>
       <w:bookmarkEnd w:id="19"/>
       <w:bookmarkEnd w:id="20"/>
       <w:bookmarkEnd w:id="21"/>
@@ -5543,73 +5493,796 @@
       <w:bookmarkEnd w:id="23"/>
       <w:bookmarkEnd w:id="24"/>
       <w:bookmarkEnd w:id="25"/>
+      <w:bookmarkEnd w:id="26"/>
       <w:r>
         <w:lastRenderedPageBreak/>
         <w:t>Quick Start Guide</w:t>
       </w:r>
-      <w:bookmarkEnd w:id="26"/>
+      <w:bookmarkEnd w:id="27"/>
     </w:p>
     <w:p>
       <w:pPr>
         <w:pStyle w:val="NRELBodyText"/>
       </w:pPr>
       <w:r>
-        <w:t>Brief overview of HYPSTAT</w:t>
+        <w:t xml:space="preserve">HYPSTAT is a supply-to-demand hydrogen system modeling tool developed by the National Renewable Energy Laboratory (NREL) to analyze hydrogen production, storage, and transmission infrastructure. It focuses on cost-optimization of hydrogen systems based on fixed exogenous demand, electrolytic hydrogen production, hydrogen storage, and transmission. HYPSTAT utilizes linear and mixed-integer linear optimization models, primarily formulated using the </w:t>
+      </w:r>
+      <w:proofErr w:type="spellStart"/>
+      <w:r>
+        <w:t>Pyomo</w:t>
+      </w:r>
+      <w:proofErr w:type="spellEnd"/>
+      <w:r>
+        <w:t xml:space="preserve"> package in Python. It is designed to simulate system-wide hydrogen infrastructure needs, offering insights into system configurations and helping policymakers and energy planners make informed decisions.</w:t>
       </w:r>
     </w:p>
     <w:p>
       <w:pPr>
         <w:pStyle w:val="NRELHead02Numbered"/>
       </w:pPr>
-      <w:bookmarkStart w:id="27" w:name="_Toc179465202"/>
+      <w:bookmarkStart w:id="28" w:name="_Toc179465202"/>
       <w:r>
         <w:t>Designing your system</w:t>
       </w:r>
-      <w:bookmarkEnd w:id="27"/>
+      <w:bookmarkEnd w:id="28"/>
     </w:p>
     <w:p>
       <w:pPr>
         <w:pStyle w:val="NRELBodyText"/>
       </w:pPr>
       <w:r>
-        <w:t>Text</w:t>
-      </w:r>
+        <w:t>Hydrogen demand: Specify fixed exogenous hydrogen demand amounts and profile for a defined model time window.</w:t>
+      </w:r>
+    </w:p>
+    <w:p>
+      <w:pPr>
+        <w:pStyle w:val="NRELBodyText"/>
+      </w:pPr>
+      <w:r>
+        <w:t xml:space="preserve">Technology options: Select or define relevant hydrogen production (e.g., </w:t>
+      </w:r>
+      <w:proofErr w:type="spellStart"/>
+      <w:r>
+        <w:t>electrolyzers</w:t>
+      </w:r>
+      <w:proofErr w:type="spellEnd"/>
+      <w:r>
+        <w:t>), storage, and transmission technologies. HYPSTAT supports renewable-powered electrolytic production but does not currently support non-electrolytic production methods.</w:t>
+      </w:r>
+    </w:p>
+    <w:p>
+      <w:pPr>
+        <w:pStyle w:val="NRELBodyText"/>
+      </w:pPr>
+      <w:r>
+        <w:t xml:space="preserve">Hydrogen system network: Define </w:t>
+      </w:r>
+      <w:r>
+        <w:t xml:space="preserve">hydrogen network, design </w:t>
+      </w:r>
+      <w:r>
+        <w:t>node</w:t>
+      </w:r>
+      <w:r>
+        <w:t xml:space="preserve">, </w:t>
+      </w:r>
+      <w:r>
+        <w:t>link</w:t>
+      </w:r>
+      <w:r>
+        <w:t xml:space="preserve"> distances, and</w:t>
+      </w:r>
+      <w:r>
+        <w:t xml:space="preserve"> physical constraints</w:t>
+      </w:r>
+      <w:r>
+        <w:t xml:space="preserve"> for the network</w:t>
+      </w:r>
+    </w:p>
+    <w:tbl>
+      <w:tblPr>
+        <w:tblW w:w="0" w:type="auto"/>
+        <w:jc w:val="center"/>
+        <w:tblBorders>
+          <w:top w:val="single" w:sz="8" w:space="0" w:color="4F81BD"/>
+          <w:bottom w:val="single" w:sz="8" w:space="0" w:color="4F81BD"/>
+        </w:tblBorders>
+        <w:tblLook w:val="04A0" w:firstRow="1" w:lastRow="0" w:firstColumn="1" w:lastColumn="0" w:noHBand="0" w:noVBand="1"/>
+      </w:tblPr>
+      <w:tblGrid>
+        <w:gridCol w:w="2207"/>
+        <w:gridCol w:w="5551"/>
+      </w:tblGrid>
+      <w:tr>
+        <w:trPr>
+          <w:cantSplit/>
+          <w:tblHeader/>
+          <w:jc w:val="center"/>
+        </w:trPr>
+        <w:tc>
+          <w:tcPr>
+            <w:tcW w:w="0" w:type="auto"/>
+            <w:tcBorders>
+              <w:top w:val="single" w:sz="4" w:space="0" w:color="808080" w:themeColor="background1" w:themeShade="80"/>
+              <w:left w:val="nil"/>
+              <w:bottom w:val="single" w:sz="4" w:space="0" w:color="808080" w:themeColor="background1" w:themeShade="80"/>
+              <w:right w:val="nil"/>
+            </w:tcBorders>
+            <w:shd w:val="clear" w:color="auto" w:fill="auto"/>
+          </w:tcPr>
+          <w:p>
+            <w:pPr>
+              <w:pStyle w:val="NRELTableHeader"/>
+            </w:pPr>
+            <w:r>
+              <w:t>Technology/input</w:t>
+            </w:r>
+          </w:p>
+        </w:tc>
+        <w:tc>
+          <w:tcPr>
+            <w:tcW w:w="5551" w:type="dxa"/>
+            <w:tcBorders>
+              <w:top w:val="single" w:sz="4" w:space="0" w:color="808080" w:themeColor="background1" w:themeShade="80"/>
+              <w:left w:val="nil"/>
+              <w:bottom w:val="single" w:sz="4" w:space="0" w:color="808080" w:themeColor="background1" w:themeShade="80"/>
+              <w:right w:val="nil"/>
+            </w:tcBorders>
+            <w:shd w:val="clear" w:color="auto" w:fill="auto"/>
+          </w:tcPr>
+          <w:p>
+            <w:pPr>
+              <w:pStyle w:val="NRELTableHeader"/>
+            </w:pPr>
+            <w:r>
+              <w:t>Suggested scope</w:t>
+            </w:r>
+          </w:p>
+        </w:tc>
+      </w:tr>
+      <w:tr>
+        <w:trPr>
+          <w:jc w:val="center"/>
+        </w:trPr>
+        <w:tc>
+          <w:tcPr>
+            <w:tcW w:w="0" w:type="auto"/>
+            <w:tcBorders>
+              <w:top w:val="single" w:sz="4" w:space="0" w:color="808080" w:themeColor="background1" w:themeShade="80"/>
+              <w:left w:val="nil"/>
+              <w:right w:val="nil"/>
+            </w:tcBorders>
+            <w:shd w:val="clear" w:color="auto" w:fill="D3DFEE"/>
+          </w:tcPr>
+          <w:p>
+            <w:pPr>
+              <w:pStyle w:val="NRELTableContent"/>
+            </w:pPr>
+            <w:r>
+              <w:t>Nodes</w:t>
+            </w:r>
+          </w:p>
+        </w:tc>
+        <w:tc>
+          <w:tcPr>
+            <w:tcW w:w="5551" w:type="dxa"/>
+            <w:tcBorders>
+              <w:top w:val="single" w:sz="4" w:space="0" w:color="808080" w:themeColor="background1" w:themeShade="80"/>
+              <w:left w:val="nil"/>
+              <w:right w:val="nil"/>
+            </w:tcBorders>
+            <w:shd w:val="clear" w:color="auto" w:fill="D3DFEE"/>
+          </w:tcPr>
+          <w:p>
+            <w:pPr>
+              <w:pStyle w:val="NRELTableContent"/>
+            </w:pPr>
+            <w:r>
+              <w:t>5-15 nodes</w:t>
+            </w:r>
+          </w:p>
+        </w:tc>
+      </w:tr>
+      <w:tr>
+        <w:trPr>
+          <w:jc w:val="center"/>
+        </w:trPr>
+        <w:tc>
+          <w:tcPr>
+            <w:tcW w:w="0" w:type="auto"/>
+            <w:tcBorders>
+              <w:right w:val="nil"/>
+            </w:tcBorders>
+            <w:shd w:val="clear" w:color="auto" w:fill="auto"/>
+          </w:tcPr>
+          <w:p>
+            <w:pPr>
+              <w:pStyle w:val="NRELTableContent"/>
+              <w:rPr>
+                <w:sz w:val="18"/>
+                <w:szCs w:val="18"/>
+              </w:rPr>
+            </w:pPr>
+            <w:r>
+              <w:t>Links</w:t>
+            </w:r>
+          </w:p>
+        </w:tc>
+        <w:tc>
+          <w:tcPr>
+            <w:tcW w:w="5551" w:type="dxa"/>
+            <w:tcBorders>
+              <w:left w:val="nil"/>
+            </w:tcBorders>
+            <w:shd w:val="clear" w:color="auto" w:fill="auto"/>
+          </w:tcPr>
+          <w:p>
+            <w:pPr>
+              <w:pStyle w:val="NRELTableContent"/>
+              <w:rPr>
+                <w:sz w:val="18"/>
+                <w:szCs w:val="18"/>
+              </w:rPr>
+            </w:pPr>
+            <w:r>
+              <w:t>10-30 links</w:t>
+            </w:r>
+          </w:p>
+        </w:tc>
+      </w:tr>
+      <w:tr>
+        <w:trPr>
+          <w:jc w:val="center"/>
+        </w:trPr>
+        <w:tc>
+          <w:tcPr>
+            <w:tcW w:w="0" w:type="auto"/>
+            <w:tcBorders>
+              <w:right w:val="nil"/>
+            </w:tcBorders>
+            <w:shd w:val="clear" w:color="auto" w:fill="DBE5F1" w:themeFill="accent1" w:themeFillTint="33"/>
+          </w:tcPr>
+          <w:p>
+            <w:pPr>
+              <w:pStyle w:val="NRELTableContent"/>
+              <w:rPr>
+                <w:sz w:val="18"/>
+                <w:szCs w:val="18"/>
+              </w:rPr>
+            </w:pPr>
+            <w:r>
+              <w:t>Renewable production</w:t>
+            </w:r>
+          </w:p>
+        </w:tc>
+        <w:tc>
+          <w:tcPr>
+            <w:tcW w:w="5551" w:type="dxa"/>
+            <w:tcBorders>
+              <w:left w:val="nil"/>
+            </w:tcBorders>
+            <w:shd w:val="clear" w:color="auto" w:fill="DBE5F1" w:themeFill="accent1" w:themeFillTint="33"/>
+          </w:tcPr>
+          <w:p>
+            <w:pPr>
+              <w:pStyle w:val="NRELTableContent"/>
+              <w:rPr>
+                <w:sz w:val="18"/>
+                <w:szCs w:val="18"/>
+              </w:rPr>
+            </w:pPr>
+            <w:r>
+              <w:t>3-5 technologies with 1-3 tranches per technology and node</w:t>
+            </w:r>
+          </w:p>
+        </w:tc>
+      </w:tr>
+      <w:tr>
+        <w:trPr>
+          <w:jc w:val="center"/>
+        </w:trPr>
+        <w:tc>
+          <w:tcPr>
+            <w:tcW w:w="0" w:type="auto"/>
+            <w:tcBorders>
+              <w:right w:val="nil"/>
+            </w:tcBorders>
+            <w:shd w:val="clear" w:color="auto" w:fill="auto"/>
+          </w:tcPr>
+          <w:p>
+            <w:pPr>
+              <w:pStyle w:val="NRELTableContent"/>
+              <w:rPr>
+                <w:sz w:val="18"/>
+                <w:szCs w:val="18"/>
+              </w:rPr>
+            </w:pPr>
+            <w:r>
+              <w:t>Hydrogen storage</w:t>
+            </w:r>
+          </w:p>
+        </w:tc>
+        <w:tc>
+          <w:tcPr>
+            <w:tcW w:w="5551" w:type="dxa"/>
+            <w:tcBorders>
+              <w:left w:val="nil"/>
+            </w:tcBorders>
+            <w:shd w:val="clear" w:color="auto" w:fill="auto"/>
+          </w:tcPr>
+          <w:p>
+            <w:pPr>
+              <w:pStyle w:val="NRELTableContent"/>
+              <w:rPr>
+                <w:sz w:val="18"/>
+                <w:szCs w:val="18"/>
+              </w:rPr>
+            </w:pPr>
+            <w:r>
+              <w:t>2-4 technologies</w:t>
+            </w:r>
+          </w:p>
+        </w:tc>
+      </w:tr>
+      <w:tr>
+        <w:trPr>
+          <w:jc w:val="center"/>
+        </w:trPr>
+        <w:tc>
+          <w:tcPr>
+            <w:tcW w:w="0" w:type="auto"/>
+            <w:tcBorders>
+              <w:right w:val="nil"/>
+            </w:tcBorders>
+            <w:shd w:val="clear" w:color="auto" w:fill="DBE5F1" w:themeFill="accent1" w:themeFillTint="33"/>
+          </w:tcPr>
+          <w:p>
+            <w:pPr>
+              <w:pStyle w:val="NRELTableContent"/>
+            </w:pPr>
+            <w:r>
+              <w:t>Time period</w:t>
+            </w:r>
+          </w:p>
+        </w:tc>
+        <w:tc>
+          <w:tcPr>
+            <w:tcW w:w="5551" w:type="dxa"/>
+            <w:tcBorders>
+              <w:left w:val="nil"/>
+            </w:tcBorders>
+            <w:shd w:val="clear" w:color="auto" w:fill="DBE5F1" w:themeFill="accent1" w:themeFillTint="33"/>
+          </w:tcPr>
+          <w:p>
+            <w:pPr>
+              <w:pStyle w:val="NRELTableContent"/>
+            </w:pPr>
+            <w:r>
+              <w:t>Coarse resolution: ~daily</w:t>
+            </w:r>
+          </w:p>
+          <w:p>
+            <w:pPr>
+              <w:pStyle w:val="NRELTableContent"/>
+            </w:pPr>
+            <w:r>
+              <w:t>Fine resolution: 1-4 hourly</w:t>
+            </w:r>
+          </w:p>
+        </w:tc>
+      </w:tr>
+      <w:tr>
+        <w:trPr>
+          <w:jc w:val="center"/>
+        </w:trPr>
+        <w:tc>
+          <w:tcPr>
+            <w:tcW w:w="0" w:type="auto"/>
+            <w:tcBorders>
+              <w:left w:val="nil"/>
+              <w:right w:val="nil"/>
+            </w:tcBorders>
+            <w:shd w:val="clear" w:color="auto" w:fill="FFFFFF" w:themeFill="background1"/>
+          </w:tcPr>
+          <w:p>
+            <w:pPr>
+              <w:pStyle w:val="NRELTableContent"/>
+            </w:pPr>
+            <w:r>
+              <w:t>Time window</w:t>
+            </w:r>
+          </w:p>
+        </w:tc>
+        <w:tc>
+          <w:tcPr>
+            <w:tcW w:w="5551" w:type="dxa"/>
+            <w:tcBorders>
+              <w:left w:val="nil"/>
+              <w:right w:val="nil"/>
+            </w:tcBorders>
+            <w:shd w:val="clear" w:color="auto" w:fill="FFFFFF" w:themeFill="background1"/>
+          </w:tcPr>
+          <w:p>
+            <w:pPr>
+              <w:pStyle w:val="NRELTableContent"/>
+            </w:pPr>
+            <w:r>
+              <w:t>1 year</w:t>
+            </w:r>
+          </w:p>
+        </w:tc>
+      </w:tr>
+    </w:tbl>
+    <w:p>
+      <w:pPr>
+        <w:pStyle w:val="NRELBodyText"/>
+      </w:pPr>
+    </w:p>
+    <w:p>
+      <w:pPr>
+        <w:pStyle w:val="NRELBodyText"/>
+      </w:pPr>
+      <w:r>
+        <w:t>Constraints: Establish system constraints such as import/export limits, technology-specific capacities for each node.</w:t>
+      </w:r>
+    </w:p>
+    <w:p>
+      <w:pPr>
+        <w:pStyle w:val="NRELBodyText"/>
+      </w:pPr>
+      <w:r>
+        <w:t>Technology cost: Define economic parameters like CAPEX and OPEX, along with financial parameters such as WACC.</w:t>
+      </w:r>
+    </w:p>
+    <w:p>
+      <w:pPr>
+        <w:pStyle w:val="NRELBodyText"/>
+        <w:rPr>
+          <w:del w:id="29" w:author="Li, Yijin" w:date="2024-12-11T13:12:00Z" w16du:dateUtc="2024-12-11T21:12:00Z"/>
+        </w:rPr>
+      </w:pPr>
+      <w:r>
+        <w:t xml:space="preserve">Transmission (pipeline or tank-based) location &amp; size: For accurate pipeline location, use the two-step solve approach, which refines pipeline locations after an initial coarser resolution </w:t>
+      </w:r>
+      <w:proofErr w:type="spellStart"/>
+      <w:r>
+        <w:t>solve.</w:t>
+      </w:r>
+      <w:del w:id="30" w:author="Li, Yijin" w:date="2024-12-11T13:03:00Z" w16du:dateUtc="2024-12-11T21:03:00Z">
+        <w:r>
+          <w:delText>ext</w:delText>
+        </w:r>
+      </w:del>
     </w:p>
     <w:p>
       <w:pPr>
         <w:pStyle w:val="NRELHead02Numbered"/>
       </w:pPr>
-      <w:bookmarkStart w:id="28" w:name="_Toc179465203"/>
-      <w:r>
-        <w:t>Formatting your inputs</w:t>
-      </w:r>
-      <w:bookmarkEnd w:id="28"/>
+      <w:bookmarkStart w:id="31" w:name="_Toc179465203"/>
+      <w:r>
+        <w:t>Formatting</w:t>
+      </w:r>
+      <w:proofErr w:type="spellEnd"/>
+      <w:r>
+        <w:t xml:space="preserve"> your inputs</w:t>
+      </w:r>
+      <w:bookmarkEnd w:id="31"/>
     </w:p>
     <w:p>
       <w:pPr>
         <w:pStyle w:val="NRELBodyText"/>
-      </w:pPr>
-      <w:r>
-        <w:t>Text</w:t>
-      </w:r>
+        <w:rPr>
+          <w:ins w:id="32" w:author="Li, Yijin" w:date="2024-12-11T13:16:00Z" w16du:dateUtc="2024-12-11T21:16:00Z"/>
+        </w:rPr>
+      </w:pPr>
+    </w:p>
+    <w:p>
+      <w:pPr>
+        <w:pStyle w:val="NRELBodyText"/>
+        <w:rPr>
+          <w:del w:id="33" w:author="Li, Yijin" w:date="2024-12-11T13:16:00Z" w16du:dateUtc="2024-12-11T21:16:00Z"/>
+        </w:rPr>
+      </w:pPr>
+      <w:r>
+        <w:lastRenderedPageBreak/>
+        <w:t xml:space="preserve">YAML Configuration </w:t>
+      </w:r>
+      <w:proofErr w:type="spellStart"/>
+      <w:r>
+        <w:t>File:</w:t>
+      </w:r>
+    </w:p>
+    <w:p>
+      <w:pPr>
+        <w:pStyle w:val="NRELBodyText"/>
+      </w:pPr>
+      <w:r>
+        <w:t>Input</w:t>
+      </w:r>
+      <w:proofErr w:type="spellEnd"/>
+      <w:r>
+        <w:t xml:space="preserve"> your scenario configuration into a YAML file.</w:t>
+      </w:r>
+    </w:p>
+    <w:p>
+      <w:pPr>
+        <w:pStyle w:val="NRELBodyText"/>
+      </w:pPr>
+      <w:r>
+        <w:t>Specify paths to input files for technology costs, generation profiles, and demand data.</w:t>
+      </w:r>
+    </w:p>
+    <w:p>
+      <w:pPr>
+        <w:pStyle w:val="NRELBodyText"/>
+      </w:pPr>
+      <w:r>
+        <w:t>Technology Costs:</w:t>
+      </w:r>
+    </w:p>
+    <w:p>
+      <w:pPr>
+        <w:pStyle w:val="NRELBodyText"/>
+      </w:pPr>
+      <w:r>
+        <w:t>Define annual CAPEX, fixed OPEX, and variable OPEX for each technology.</w:t>
+      </w:r>
+    </w:p>
+    <w:p>
+      <w:pPr>
+        <w:pStyle w:val="NRELBodyText"/>
+      </w:pPr>
+      <w:r>
+        <w:t>Costs are scaled based on the model time window.</w:t>
+      </w:r>
+    </w:p>
+    <w:p>
+      <w:pPr>
+        <w:pStyle w:val="NRELBodyText"/>
+      </w:pPr>
+      <w:r>
+        <w:t>Time Resolution:</w:t>
+      </w:r>
+    </w:p>
+    <w:p>
+      <w:pPr>
+        <w:pStyle w:val="NRELBodyText"/>
+      </w:pPr>
+      <w:r>
+        <w:t>Define time-based inputs like renewable generation profiles, hydrogen demand, and storage dynamics.</w:t>
+      </w:r>
+    </w:p>
+    <w:p>
+      <w:pPr>
+        <w:pStyle w:val="NRELBodyText"/>
+      </w:pPr>
+      <w:r>
+        <w:t>The model supports down-sampling of input resolution but cannot up-sample.</w:t>
+      </w:r>
+    </w:p>
+    <w:p>
+      <w:pPr>
+        <w:pStyle w:val="NRELBodyText"/>
+      </w:pPr>
+      <w:r>
+        <w:t>Pipeline Inputs:</w:t>
+      </w:r>
+    </w:p>
+    <w:p>
+      <w:pPr>
+        <w:pStyle w:val="NRELBodyText"/>
+      </w:pPr>
+      <w:r>
+        <w:t>For mixed-integer optimization mode, input binary variables to optimize pipeline locations.</w:t>
+      </w:r>
+    </w:p>
+    <w:p>
+      <w:pPr>
+        <w:pStyle w:val="NRELBodyText"/>
+      </w:pPr>
+      <w:r>
+        <w:t>For fully linear optimization mode, input fixed pipeline costs.</w:t>
+      </w:r>
+      <w:del w:id="34" w:author="Li, Yijin" w:date="2024-12-11T13:14:00Z" w16du:dateUtc="2024-12-11T21:14:00Z">
+        <w:r>
+          <w:delText>xt</w:delText>
+        </w:r>
+      </w:del>
     </w:p>
     <w:p>
       <w:pPr>
         <w:pStyle w:val="NRELHead02Numbered"/>
       </w:pPr>
-      <w:bookmarkStart w:id="29" w:name="_Toc179465204"/>
+      <w:bookmarkStart w:id="35" w:name="_Toc179465204"/>
       <w:r>
         <w:t>Running the model</w:t>
       </w:r>
-      <w:bookmarkEnd w:id="29"/>
+      <w:bookmarkEnd w:id="35"/>
     </w:p>
     <w:p>
       <w:pPr>
         <w:pStyle w:val="NRELBodyText"/>
       </w:pPr>
       <w:r>
-        <w:t>Text</w:t>
-      </w:r>
+        <w:t>Load Inputs:</w:t>
+      </w:r>
+    </w:p>
+    <w:p>
+      <w:pPr>
+        <w:pStyle w:val="NRELBodyText"/>
+      </w:pPr>
+      <w:r>
+        <w:t xml:space="preserve">Use the HYPSTAT class to load your inputs from the YAML configuration file using the </w:t>
+      </w:r>
+      <w:proofErr w:type="spellStart"/>
+      <w:r>
+        <w:t>load_inputs</w:t>
+      </w:r>
+      <w:proofErr w:type="spellEnd"/>
+      <w:r>
+        <w:t xml:space="preserve"> method.</w:t>
+      </w:r>
+    </w:p>
+    <w:p>
+      <w:pPr>
+        <w:pStyle w:val="NRELBodyText"/>
+      </w:pPr>
+      <w:r>
+        <w:t>Model Formulation:</w:t>
+      </w:r>
+    </w:p>
+    <w:p>
+      <w:pPr>
+        <w:pStyle w:val="NRELBodyText"/>
+      </w:pPr>
+      <w:r>
+        <w:t xml:space="preserve">Call </w:t>
+      </w:r>
+      <w:proofErr w:type="spellStart"/>
+      <w:r>
+        <w:t>load_model</w:t>
+      </w:r>
+      <w:proofErr w:type="spellEnd"/>
+      <w:r>
+        <w:t xml:space="preserve"> and </w:t>
+      </w:r>
+      <w:proofErr w:type="spellStart"/>
+      <w:r>
+        <w:t>load_constraints</w:t>
+      </w:r>
+      <w:proofErr w:type="spellEnd"/>
+      <w:r>
+        <w:t xml:space="preserve"> methods to set up the optimization problem.</w:t>
+      </w:r>
+    </w:p>
+    <w:p>
+      <w:pPr>
+        <w:pStyle w:val="NRELBodyText"/>
+      </w:pPr>
+      <w:r>
+        <w:t>Define constraints related to generation, production, storage, and transmission technologies.</w:t>
+      </w:r>
+    </w:p>
+    <w:p>
+      <w:pPr>
+        <w:pStyle w:val="NRELBodyText"/>
+      </w:pPr>
+      <w:r>
+        <w:t>Solve the Model:</w:t>
+      </w:r>
+    </w:p>
+    <w:p>
+      <w:pPr>
+        <w:pStyle w:val="NRELBodyText"/>
+      </w:pPr>
+      <w:r>
+        <w:t xml:space="preserve">Use the </w:t>
+      </w:r>
+      <w:proofErr w:type="spellStart"/>
+      <w:r>
+        <w:t>solve_model</w:t>
+      </w:r>
+      <w:proofErr w:type="spellEnd"/>
+      <w:r>
+        <w:t xml:space="preserve"> method with the desired solver (GLPK or </w:t>
+      </w:r>
+      <w:proofErr w:type="spellStart"/>
+      <w:r>
+        <w:t>Gurobi</w:t>
+      </w:r>
+      <w:proofErr w:type="spellEnd"/>
+      <w:r>
+        <w:t xml:space="preserve"> recommended).</w:t>
+      </w:r>
+    </w:p>
+    <w:p>
+      <w:pPr>
+        <w:pStyle w:val="NRELBodyText"/>
+      </w:pPr>
+      <w:r>
+        <w:t xml:space="preserve">Pass the </w:t>
+      </w:r>
+      <w:proofErr w:type="spellStart"/>
+      <w:r>
+        <w:t>optimize_pipelines</w:t>
+      </w:r>
+      <w:proofErr w:type="spellEnd"/>
+      <w:r>
+        <w:t xml:space="preserve"> parameter to select between mixed-integer (pipeline optimization) or fully linear (fixed pipeline locations) modes.</w:t>
+      </w:r>
+    </w:p>
+    <w:p>
+      <w:pPr>
+        <w:pStyle w:val="NRELBodyText"/>
+      </w:pPr>
+      <w:r>
+        <w:t>Two-Step Solve Approach:</w:t>
+      </w:r>
+    </w:p>
+    <w:p>
+      <w:pPr>
+        <w:pStyle w:val="NRELBodyText"/>
+      </w:pPr>
+      <w:r>
+        <w:t>For accurate pipeline location results, run the model twice: first with coarser resolution (daily) and then refine with finer resolution (e.g., 1-2 hourly) using fully linear optimization for accurate dynamic results.</w:t>
+      </w:r>
+    </w:p>
+    <w:p>
+      <w:pPr>
+        <w:pStyle w:val="NRELBodyText"/>
+      </w:pPr>
+      <w:r>
+        <w:lastRenderedPageBreak/>
+        <w:t>Write Outputs:</w:t>
+      </w:r>
+    </w:p>
+    <w:p>
+      <w:pPr>
+        <w:pStyle w:val="NRELBodyText"/>
+      </w:pPr>
+      <w:r>
+        <w:t xml:space="preserve">Use the </w:t>
+      </w:r>
+      <w:proofErr w:type="spellStart"/>
+      <w:r>
+        <w:t>write_outputs</w:t>
+      </w:r>
+      <w:proofErr w:type="spellEnd"/>
+      <w:r>
+        <w:t xml:space="preserve"> method to save model results to CSV files.</w:t>
+      </w:r>
+    </w:p>
+    <w:p>
+      <w:pPr>
+        <w:pStyle w:val="NRELBodyText"/>
+      </w:pPr>
+      <w:r>
+        <w:t xml:space="preserve">Specify output paths and handle overwriting options </w:t>
+      </w:r>
+      <w:proofErr w:type="spellStart"/>
+      <w:r>
+        <w:t>as</w:t>
+      </w:r>
+      <w:del w:id="36" w:author="Li, Yijin" w:date="2024-12-11T13:15:00Z" w16du:dateUtc="2024-12-11T21:15:00Z">
+        <w:r>
+          <w:delText xml:space="preserve"> </w:delText>
+        </w:r>
+        <w:r>
+          <w:delText>---</w:delText>
+        </w:r>
+      </w:del>
+      <w:r>
+        <w:t>necessary</w:t>
+      </w:r>
+      <w:proofErr w:type="spellEnd"/>
+      <w:r>
+        <w:t>. ---</w:t>
+      </w:r>
+    </w:p>
+    <w:p>
+      <w:pPr>
+        <w:pStyle w:val="NRELBodyText"/>
+      </w:pPr>
     </w:p>
     <w:p>
       <w:r>
@@ -5620,33 +6293,91 @@
       <w:pPr>
         <w:pStyle w:val="NRELHead01Numbered"/>
       </w:pPr>
-      <w:bookmarkStart w:id="30" w:name="_Toc179465205"/>
+      <w:bookmarkStart w:id="37" w:name="_Toc179465205"/>
       <w:r>
         <w:lastRenderedPageBreak/>
         <w:t>Detailed Documentation</w:t>
       </w:r>
-      <w:bookmarkEnd w:id="30"/>
+      <w:bookmarkEnd w:id="37"/>
     </w:p>
     <w:p>
       <w:pPr>
         <w:pStyle w:val="NRELHead02Numbered"/>
       </w:pPr>
-      <w:bookmarkStart w:id="31" w:name="_Toc179465206"/>
+      <w:bookmarkStart w:id="38" w:name="_Toc179465206"/>
       <w:r>
         <w:t>Overview</w:t>
       </w:r>
-      <w:bookmarkEnd w:id="31"/>
+      <w:bookmarkEnd w:id="38"/>
     </w:p>
     <w:p>
       <w:pPr>
         <w:pStyle w:val="NRELBodyText"/>
       </w:pPr>
-      <w:bookmarkStart w:id="32" w:name="_Toc100058847"/>
-      <w:bookmarkStart w:id="33" w:name="_Toc100827776"/>
-      <w:bookmarkEnd w:id="32"/>
-      <w:bookmarkEnd w:id="33"/>
-      <w:r>
-        <w:t>The Hydrogen Production, Storage, and Transmission Analysis Tool (HYPSTAT) is a supply-to-demand hydrogen modeling tool developed at the National Renewable Energy Laboratory (NREL). HYPSTAT is used to represent hydrogen systems, particularly for transitioning to decarbonized energy systems and focusing on electrolytic hydrogen production along with hydrogen storage and transmission.</w:t>
+      <w:bookmarkStart w:id="39" w:name="_Toc100058847"/>
+      <w:bookmarkStart w:id="40" w:name="_Toc100827776"/>
+      <w:bookmarkEnd w:id="39"/>
+      <w:bookmarkEnd w:id="40"/>
+      <w:r>
+        <w:t xml:space="preserve">The Hydrogen Production, Storage, and Transmission Analysis Tool (HYPSTAT) is a supply-to-demand hydrogen </w:t>
+      </w:r>
+      <w:ins w:id="41" w:author="Li, Yijin" w:date="2024-12-10T16:00:00Z" w16du:dateUtc="2024-12-11T00:00:00Z">
+        <w:r>
+          <w:t xml:space="preserve">system </w:t>
+        </w:r>
+      </w:ins>
+      <w:r>
+        <w:t xml:space="preserve">modeling tool developed at the National Renewable Energy Laboratory (NREL). HYPSTAT is used to represent </w:t>
+      </w:r>
+      <w:ins w:id="42" w:author="Li, Yijin" w:date="2024-12-10T16:01:00Z" w16du:dateUtc="2024-12-11T00:01:00Z">
+        <w:r>
+          <w:t xml:space="preserve">system-wide </w:t>
+        </w:r>
+      </w:ins>
+      <w:r>
+        <w:t xml:space="preserve">hydrogen </w:t>
+      </w:r>
+      <w:del w:id="43" w:author="Li, Yijin" w:date="2024-12-10T16:02:00Z" w16du:dateUtc="2024-12-11T00:02:00Z">
+        <w:r>
+          <w:delText>systems</w:delText>
+        </w:r>
+      </w:del>
+      <w:ins w:id="44" w:author="Li, Yijin" w:date="2024-12-10T16:02:00Z" w16du:dateUtc="2024-12-11T00:02:00Z">
+        <w:r>
+          <w:t xml:space="preserve">infrastructure </w:t>
+        </w:r>
+        <w:proofErr w:type="gramStart"/>
+        <w:r>
+          <w:t>needs</w:t>
+        </w:r>
+      </w:ins>
+      <w:r>
+        <w:t>,</w:t>
+      </w:r>
+      <w:ins w:id="45" w:author="Li, Yijin" w:date="2024-12-10T16:02:00Z" w16du:dateUtc="2024-12-11T00:02:00Z">
+        <w:r>
+          <w:t xml:space="preserve"> </w:t>
+        </w:r>
+      </w:ins>
+      <w:r>
+        <w:t xml:space="preserve"> particularly</w:t>
+      </w:r>
+      <w:proofErr w:type="gramEnd"/>
+      <w:r>
+        <w:t xml:space="preserve"> for transitioning to decarbonized energy systems </w:t>
+      </w:r>
+      <w:del w:id="46" w:author="Li, Yijin" w:date="2024-12-10T16:04:00Z" w16du:dateUtc="2024-12-11T00:04:00Z">
+        <w:r>
+          <w:delText>and focusing</w:delText>
+        </w:r>
+      </w:del>
+      <w:ins w:id="47" w:author="Li, Yijin" w:date="2024-12-10T16:04:00Z" w16du:dateUtc="2024-12-11T00:04:00Z">
+        <w:r>
+          <w:t>with a focus</w:t>
+        </w:r>
+      </w:ins>
+      <w:r>
+        <w:t xml:space="preserve"> on electrolytic hydrogen production along with hydrogen storage and transmission.</w:t>
       </w:r>
     </w:p>
     <w:p>
@@ -5654,7 +6385,28 @@
         <w:pStyle w:val="NRELBodyText"/>
       </w:pPr>
       <w:r>
-        <w:t>HYPSTAT is a supply-to-demand model: it is fed a fixed demand and determines the cost-optimal system design and operation to meet that demand based on specified technology options and system constraints. It models a single year at a time—that is, it is not a capacity expansion model. However, HYPSTAT inputs are set up to easily run separate, individual analyses for several different years to infer insights about capacity expansion.</w:t>
+        <w:t>HYPSTAT is a supply-to-demand model: it is fed</w:t>
+      </w:r>
+      <w:ins w:id="48" w:author="Li, Yijin" w:date="2024-12-10T16:06:00Z" w16du:dateUtc="2024-12-11T00:06:00Z">
+        <w:r>
+          <w:t xml:space="preserve"> exogenously</w:t>
+        </w:r>
+      </w:ins>
+      <w:r>
+        <w:t xml:space="preserve"> a fixed demand and determines the cost-optimal system design and operation to meet that demand based on specified technology options and system constraints. It models a single year at a time</w:t>
+      </w:r>
+      <w:ins w:id="49" w:author="Li, Yijin" w:date="2024-12-10T16:05:00Z" w16du:dateUtc="2024-12-11T00:05:00Z">
+        <w:r>
+          <w:t xml:space="preserve">; </w:t>
+        </w:r>
+      </w:ins>
+      <w:del w:id="50" w:author="Li, Yijin" w:date="2024-12-10T16:05:00Z" w16du:dateUtc="2024-12-11T00:05:00Z">
+        <w:r>
+          <w:delText>—</w:delText>
+        </w:r>
+      </w:del>
+      <w:r>
+        <w:t>that is, it is not a capacity expansion model. However, HYPSTAT inputs are set up to easily run separate, individual analyses for several different years to infer insights about capacity expansion.</w:t>
       </w:r>
     </w:p>
     <w:p>
@@ -5662,7 +6414,23 @@
         <w:pStyle w:val="NRELBodyText"/>
       </w:pPr>
       <w:r>
-        <w:t>HYPSTAT also does not include market dynamics around supply and demand. The demand is fixed, and systems defined by the results have associated costs but do not specifically estimate hydrogen prices.</w:t>
+        <w:t xml:space="preserve">HYPSTAT also does not include </w:t>
+      </w:r>
+      <w:ins w:id="51" w:author="Li, Yijin" w:date="2024-12-10T16:06:00Z" w16du:dateUtc="2024-12-11T00:06:00Z">
+        <w:r>
+          <w:t xml:space="preserve">endogenous </w:t>
+        </w:r>
+      </w:ins>
+      <w:r>
+        <w:t xml:space="preserve">market dynamics around supply and demand. The demand is fixed, and systems defined by the results have associated costs but do not specifically estimate hydrogen </w:t>
+      </w:r>
+      <w:ins w:id="52" w:author="Li, Yijin" w:date="2024-12-10T16:07:00Z" w16du:dateUtc="2024-12-11T00:07:00Z">
+        <w:r>
+          <w:t xml:space="preserve">market </w:t>
+        </w:r>
+      </w:ins>
+      <w:r>
+        <w:t>prices.</w:t>
       </w:r>
     </w:p>
     <w:p>
@@ -5670,18 +6438,31 @@
         <w:pStyle w:val="NRELBodyText"/>
       </w:pPr>
       <w:r>
-        <w:t>HYPSTAT formulates the specified hydrogen system as a linear or mixed-integer linear optimization using the Pyomo package in Python. It also includes code for input processing; limited output processing capabilities are in development.</w:t>
+        <w:t>HYPSTAT formulates the specified hydrogen system as a linear or mixed-integer linear optimization using the Pyomo package in Python. It also includes code for input processing</w:t>
+      </w:r>
+      <w:ins w:id="53" w:author="Li, Yijin" w:date="2024-12-10T16:08:00Z" w16du:dateUtc="2024-12-11T00:08:00Z">
+        <w:r>
+          <w:t xml:space="preserve">, </w:t>
+        </w:r>
+      </w:ins>
+      <w:del w:id="54" w:author="Li, Yijin" w:date="2024-12-10T16:07:00Z" w16du:dateUtc="2024-12-11T00:07:00Z">
+        <w:r>
+          <w:delText xml:space="preserve">; </w:delText>
+        </w:r>
+      </w:del>
+      <w:r>
+        <w:t>limited output processing capabilities are in development.</w:t>
       </w:r>
     </w:p>
     <w:p>
       <w:pPr>
         <w:pStyle w:val="NRELHead03Numbered"/>
       </w:pPr>
-      <w:bookmarkStart w:id="34" w:name="_Toc179465207"/>
+      <w:bookmarkStart w:id="55" w:name="_Toc179465207"/>
       <w:r>
         <w:t>Terminology</w:t>
       </w:r>
-      <w:bookmarkEnd w:id="34"/>
+      <w:bookmarkEnd w:id="55"/>
     </w:p>
     <w:p>
       <w:pPr>
@@ -5779,6 +6560,7 @@
           <w:b/>
           <w:bCs/>
         </w:rPr>
+        <w:lastRenderedPageBreak/>
         <w:t>Node</w:t>
       </w:r>
       <w:r>
@@ -5794,7 +6576,6 @@
           <w:b/>
           <w:bCs/>
         </w:rPr>
-        <w:lastRenderedPageBreak/>
         <w:t>Link</w:t>
       </w:r>
       <w:r>
@@ -5858,7 +6639,25 @@
         <w:t>period</w:t>
       </w:r>
       <w:r>
-        <w:t>: the individual unit of time for which the model considers dynamics of the hydrogen system—hydrogen production, storage injections and withdrawals, etc. (e.g., hourly).</w:t>
+        <w:t xml:space="preserve">: the individual unit of time for which the model considers dynamics of the hydrogen system—hydrogen production, </w:t>
+      </w:r>
+      <w:ins w:id="56" w:author="Li, Yijin" w:date="2024-12-11T09:59:00Z" w16du:dateUtc="2024-12-11T17:59:00Z">
+        <w:r>
+          <w:t>electricity production, hydrogen</w:t>
+        </w:r>
+      </w:ins>
+      <w:ins w:id="57" w:author="Li, Yijin" w:date="2024-12-11T10:00:00Z" w16du:dateUtc="2024-12-11T18:00:00Z">
+        <w:r>
+          <w:t xml:space="preserve"> transmission,</w:t>
+        </w:r>
+      </w:ins>
+      <w:ins w:id="58" w:author="Li, Yijin" w:date="2024-12-11T09:59:00Z" w16du:dateUtc="2024-12-11T17:59:00Z">
+        <w:r>
+          <w:t xml:space="preserve"> </w:t>
+        </w:r>
+      </w:ins>
+      <w:r>
+        <w:t>storage injections and withdrawals, etc. (e.g., hourly).</w:t>
       </w:r>
     </w:p>
     <w:p>
@@ -5898,8 +6697,35 @@
         <w:t>Storage level</w:t>
       </w:r>
       <w:r>
-        <w:t>: the amount of hydrogen that is stored in a hydrogen storage resource at a given time.</w:t>
-      </w:r>
+        <w:t>: the amount of hydrogen that is stored in a hydrogen storage resource at a given time</w:t>
+      </w:r>
+      <w:ins w:id="59" w:author="Li, Yijin" w:date="2024-12-11T10:02:00Z" w16du:dateUtc="2024-12-11T18:02:00Z">
+        <w:r>
+          <w:t xml:space="preserve">, </w:t>
+        </w:r>
+      </w:ins>
+      <w:ins w:id="60" w:author="Li, Yijin" w:date="2024-12-11T10:03:00Z" w16du:dateUtc="2024-12-11T18:03:00Z">
+        <w:r>
+          <w:t>typically measured in kilograms (kg) of H</w:t>
+        </w:r>
+        <w:r>
+          <w:rPr>
+            <w:vertAlign w:val="subscript"/>
+            <w:rPrChange w:id="61" w:author="Li, Yijin" w:date="2024-12-11T10:03:00Z" w16du:dateUtc="2024-12-11T18:03:00Z">
+              <w:rPr/>
+            </w:rPrChange>
+          </w:rPr>
+          <w:t>2</w:t>
+        </w:r>
+        <w:r>
+          <w:t>.</w:t>
+        </w:r>
+      </w:ins>
+      <w:del w:id="62" w:author="Li, Yijin" w:date="2024-12-11T10:02:00Z" w16du:dateUtc="2024-12-11T18:02:00Z">
+        <w:r>
+          <w:delText>.</w:delText>
+        </w:r>
+      </w:del>
     </w:p>
     <w:p>
       <w:pPr>
@@ -5921,8 +6747,33 @@
       </w:r>
       <w:proofErr w:type="gramEnd"/>
       <w:r>
-        <w:t xml:space="preserve"> charging a battery).</w:t>
-      </w:r>
+        <w:t xml:space="preserve"> charging a battery)</w:t>
+      </w:r>
+      <w:ins w:id="63" w:author="Li, Yijin" w:date="2024-12-11T10:02:00Z" w16du:dateUtc="2024-12-11T18:02:00Z">
+        <w:r>
+          <w:t xml:space="preserve">, </w:t>
+        </w:r>
+      </w:ins>
+      <w:ins w:id="64" w:author="Li, Yijin" w:date="2024-12-11T10:03:00Z" w16du:dateUtc="2024-12-11T18:03:00Z">
+        <w:r>
+          <w:t xml:space="preserve">typically measured in </w:t>
+        </w:r>
+      </w:ins>
+      <w:ins w:id="65" w:author="Li, Yijin" w:date="2024-12-11T10:04:00Z" w16du:dateUtc="2024-12-11T18:04:00Z">
+        <w:r>
+          <w:t>kg</w:t>
+        </w:r>
+      </w:ins>
+      <w:ins w:id="66" w:author="Li, Yijin" w:date="2024-12-11T10:03:00Z" w16du:dateUtc="2024-12-11T18:03:00Z">
+        <w:r>
+          <w:t xml:space="preserve"> of H₂ per time period.</w:t>
+        </w:r>
+      </w:ins>
+      <w:del w:id="67" w:author="Li, Yijin" w:date="2024-12-11T10:02:00Z" w16du:dateUtc="2024-12-11T18:02:00Z">
+        <w:r>
+          <w:delText>.</w:delText>
+        </w:r>
+      </w:del>
     </w:p>
     <w:p>
       <w:pPr>
@@ -5947,8 +6798,29 @@
       </w:r>
       <w:proofErr w:type="gramEnd"/>
       <w:r>
-        <w:t xml:space="preserve"> discharging or using energy from a battery).</w:t>
-      </w:r>
+        <w:t xml:space="preserve"> discharging or using energy from a battery)</w:t>
+      </w:r>
+      <w:ins w:id="68" w:author="Li, Yijin" w:date="2024-12-11T10:04:00Z" w16du:dateUtc="2024-12-11T18:04:00Z">
+        <w:r>
+          <w:t xml:space="preserve">, </w:t>
+        </w:r>
+      </w:ins>
+      <w:del w:id="69" w:author="Li, Yijin" w:date="2024-12-11T10:04:00Z" w16du:dateUtc="2024-12-11T18:04:00Z">
+        <w:r>
+          <w:delText>.</w:delText>
+        </w:r>
+      </w:del>
+      <w:ins w:id="70" w:author="Li, Yijin" w:date="2024-12-11T10:04:00Z" w16du:dateUtc="2024-12-11T18:04:00Z">
+        <w:r>
+          <w:t xml:space="preserve">typically measured in </w:t>
+        </w:r>
+        <w:r>
+          <w:t xml:space="preserve">kg </w:t>
+        </w:r>
+        <w:r>
+          <w:t>of H₂ per time period.</w:t>
+        </w:r>
+      </w:ins>
     </w:p>
     <w:p>
       <w:pPr>
@@ -5962,8 +6834,29 @@
         <w:t>CAPEX</w:t>
       </w:r>
       <w:r>
-        <w:t>: overnight capital expenses to build a given technology.</w:t>
-      </w:r>
+        <w:t>: overnight capital expenses to build a given technology</w:t>
+      </w:r>
+      <w:ins w:id="71" w:author="Li, Yijin" w:date="2024-12-11T10:05:00Z" w16du:dateUtc="2024-12-11T18:05:00Z">
+        <w:r>
+          <w:t>, i</w:t>
+        </w:r>
+        <w:r>
+          <w:t xml:space="preserve">ncluding renewable energy systems, </w:t>
+        </w:r>
+        <w:proofErr w:type="spellStart"/>
+        <w:r>
+          <w:t>electrolyzers</w:t>
+        </w:r>
+        <w:proofErr w:type="spellEnd"/>
+        <w:r>
+          <w:t>, storage, and transmission technologies.</w:t>
+        </w:r>
+      </w:ins>
+      <w:del w:id="72" w:author="Li, Yijin" w:date="2024-12-11T10:04:00Z" w16du:dateUtc="2024-12-11T18:04:00Z">
+        <w:r>
+          <w:delText>.</w:delText>
+        </w:r>
+      </w:del>
     </w:p>
     <w:p>
       <w:pPr>
@@ -5992,8 +6885,21 @@
         <w:t>Variable OPEX</w:t>
       </w:r>
       <w:r>
-        <w:t>: operating expenses to operate a given technology per unit of production or per unit of some form of use (e.g., per kg of hydrogen stored or transmitted).</w:t>
-      </w:r>
+        <w:t xml:space="preserve">: </w:t>
+      </w:r>
+      <w:ins w:id="73" w:author="Li, Yijin" w:date="2024-12-11T10:07:00Z" w16du:dateUtc="2024-12-11T18:07:00Z">
+        <w:r>
+          <w:t>o</w:t>
+        </w:r>
+        <w:r>
+          <w:t>perating expenses incurred for using a given technology, calculated per unit of production or use (e.g., per kilogram of hydrogen stored or transmitted).</w:t>
+        </w:r>
+      </w:ins>
+      <w:del w:id="74" w:author="Li, Yijin" w:date="2024-12-11T10:07:00Z" w16du:dateUtc="2024-12-11T18:07:00Z">
+        <w:r>
+          <w:delText>operating expenses to operate a given technology per unit of production or per unit of some form of use (e.g., per kg of hydrogen stored or transmitted).</w:delText>
+        </w:r>
+      </w:del>
     </w:p>
     <w:p>
       <w:pPr>
@@ -6022,8 +6928,24 @@
         <w:t>Overserved hydrogen</w:t>
       </w:r>
       <w:r>
-        <w:t>: hydrogen which is produced but not needed to meet demand or exports. This is also mostly a modeling tool and is assigned a cost (e.g., a rough cost of storing excess hydrogen) to mostly prevent odd outputs like an excess of hydrogen production because of policy incentives.</w:t>
-      </w:r>
+        <w:t xml:space="preserve">: </w:t>
+      </w:r>
+      <w:ins w:id="75" w:author="Li, Yijin" w:date="2024-12-11T10:08:00Z" w16du:dateUtc="2024-12-11T18:08:00Z">
+        <w:r>
+          <w:t xml:space="preserve">Hydrogen that is produced but not required to meet demand or exports. This is primarily a modeling </w:t>
+        </w:r>
+        <w:r>
+          <w:t>feature</w:t>
+        </w:r>
+        <w:r>
+          <w:t xml:space="preserve"> and is assigned a cost (e.g., an approximate cost of storing excess hydrogen) to help prevent unrealistic outputs, such as excessive hydrogen production driven by policy incentives.</w:t>
+        </w:r>
+      </w:ins>
+      <w:del w:id="76" w:author="Li, Yijin" w:date="2024-12-11T10:08:00Z" w16du:dateUtc="2024-12-11T18:08:00Z">
+        <w:r>
+          <w:delText>hydrogen which is produced but not needed to meet demand or exports. This is also mostly a modeling tool and is assigned a cost (e.g., a rough cost of storing excess hydrogen) to mostly prevent odd outputs like an excess of hydrogen production because of policy incentives.</w:delText>
+        </w:r>
+      </w:del>
     </w:p>
     <w:p>
       <w:pPr>
@@ -6068,18 +6990,22 @@
       <w:pPr>
         <w:pStyle w:val="NRELHead03Numbered"/>
       </w:pPr>
-      <w:bookmarkStart w:id="35" w:name="_Toc179465208"/>
+      <w:bookmarkStart w:id="77" w:name="_Toc179465208"/>
       <w:r>
         <w:t>Fundamental units</w:t>
       </w:r>
-      <w:bookmarkEnd w:id="35"/>
+      <w:bookmarkEnd w:id="77"/>
     </w:p>
     <w:p>
       <w:pPr>
         <w:pStyle w:val="NRELBodyText"/>
       </w:pPr>
       <w:r>
-        <w:t xml:space="preserve">HYPSTAT treats inputs and variables as having standardized units, shown below for different kinds of inputs and variables. A user could set up a HYPSTAT model such that it uses different units, but they must be consistent across the categories below to avoid errors. </w:t>
+        <w:t xml:space="preserve">HYPSTAT treats inputs and variables as having standardized units, shown below for different kinds of inputs and variables. A user could set up a HYPSTAT model such that it uses different </w:t>
+      </w:r>
+      <w:r>
+        <w:lastRenderedPageBreak/>
+        <w:t xml:space="preserve">units, but they must be consistent across the categories below to avoid errors. </w:t>
       </w:r>
       <w:r>
         <w:rPr>
@@ -6118,181 +7044,371 @@
         <w:pStyle w:val="NRELBullet01"/>
       </w:pPr>
       <w:r>
-        <w:t>Electricity generation and hydrogen production capacity: kW</w:t>
-      </w:r>
+        <w:t>Electricity generation and hydrogen production</w:t>
+      </w:r>
+      <w:ins w:id="78" w:author="Li, Yijin" w:date="2024-12-11T10:12:00Z" w16du:dateUtc="2024-12-11T18:12:00Z">
+        <w:r>
+          <w:t xml:space="preserve"> (</w:t>
+        </w:r>
+      </w:ins>
+      <w:proofErr w:type="spellStart"/>
+      <w:ins w:id="79" w:author="Li, Yijin" w:date="2024-12-11T10:11:00Z" w16du:dateUtc="2024-12-11T18:11:00Z">
+        <w:r>
+          <w:t>electrolyzer</w:t>
+        </w:r>
+      </w:ins>
+      <w:proofErr w:type="spellEnd"/>
+      <w:ins w:id="80" w:author="Li, Yijin" w:date="2024-12-11T10:12:00Z" w16du:dateUtc="2024-12-11T18:12:00Z">
+        <w:r>
+          <w:t>)</w:t>
+        </w:r>
+      </w:ins>
+      <w:r>
+        <w:t xml:space="preserve"> capacity: </w:t>
+      </w:r>
+      <w:ins w:id="81" w:author="Li, Yijin" w:date="2024-12-11T10:12:00Z" w16du:dateUtc="2024-12-11T18:12:00Z">
+        <w:r>
+          <w:t>kilowatts (kW)</w:t>
+        </w:r>
+      </w:ins>
+      <w:del w:id="82" w:author="Li, Yijin" w:date="2024-12-11T10:12:00Z" w16du:dateUtc="2024-12-11T18:12:00Z">
+        <w:r>
+          <w:delText>kW</w:delText>
+        </w:r>
+      </w:del>
     </w:p>
     <w:p>
       <w:pPr>
         <w:pStyle w:val="NRELBullet01"/>
       </w:pPr>
       <w:r>
-        <w:t>Electricity generation amounts: kWh</w:t>
-      </w:r>
+        <w:t xml:space="preserve">Electricity generation amounts: </w:t>
+      </w:r>
+      <w:ins w:id="83" w:author="Li, Yijin" w:date="2024-12-11T10:11:00Z" w16du:dateUtc="2024-12-11T18:11:00Z">
+        <w:r>
+          <w:t>kilowatt-hours (kWh)</w:t>
+        </w:r>
+      </w:ins>
+      <w:del w:id="84" w:author="Li, Yijin" w:date="2024-12-11T10:11:00Z" w16du:dateUtc="2024-12-11T18:11:00Z">
+        <w:r>
+          <w:delText>kWh</w:delText>
+        </w:r>
+      </w:del>
     </w:p>
     <w:p>
       <w:pPr>
         <w:pStyle w:val="NRELBullet01"/>
-      </w:pPr>
-      <w:r>
-        <w:t>Hydrogen storage capacity and production, storage, and transmission amounts: kg</w:t>
-      </w:r>
+        <w:rPr>
+          <w:ins w:id="85" w:author="Li, Yijin" w:date="2024-12-11T10:09:00Z" w16du:dateUtc="2024-12-11T18:09:00Z"/>
+        </w:rPr>
+      </w:pPr>
+      <w:r>
+        <w:t>Hydrogen storage capacity and production, storage</w:t>
+      </w:r>
+      <w:ins w:id="86" w:author="Li, Yijin" w:date="2024-12-11T10:10:00Z" w16du:dateUtc="2024-12-11T18:10:00Z">
+        <w:r>
+          <w:t xml:space="preserve"> level</w:t>
+        </w:r>
+      </w:ins>
+      <w:r>
+        <w:t xml:space="preserve">, and transmission amounts: </w:t>
+      </w:r>
+      <w:ins w:id="87" w:author="Li, Yijin" w:date="2024-12-11T10:12:00Z" w16du:dateUtc="2024-12-11T18:12:00Z">
+        <w:r>
+          <w:t>kilograms (kg</w:t>
+        </w:r>
+        <w:r>
+          <w:t>) of H2</w:t>
+        </w:r>
+      </w:ins>
+      <w:del w:id="88" w:author="Li, Yijin" w:date="2024-12-11T10:12:00Z" w16du:dateUtc="2024-12-11T18:12:00Z">
+        <w:r>
+          <w:delText>kg</w:delText>
+        </w:r>
+      </w:del>
     </w:p>
     <w:p>
       <w:pPr>
         <w:pStyle w:val="NRELBullet01"/>
       </w:pPr>
+      <w:ins w:id="89" w:author="Li, Yijin" w:date="2024-12-11T10:09:00Z" w16du:dateUtc="2024-12-11T18:09:00Z">
+        <w:r>
+          <w:t xml:space="preserve">Hydrogen </w:t>
+        </w:r>
+        <w:r>
+          <w:t>storage charge and discharge</w:t>
+        </w:r>
+        <w:r>
+          <w:t xml:space="preserve">: </w:t>
+        </w:r>
+        <w:r>
+          <w:t>kg/</w:t>
+        </w:r>
+        <w:proofErr w:type="spellStart"/>
+        <w:r>
+          <w:t>hr</w:t>
+        </w:r>
+        <w:proofErr w:type="spellEnd"/>
+        <w:r>
+          <w:t xml:space="preserve"> (in inputs) or kg/period (in code</w:t>
+        </w:r>
+        <w:r>
+          <w:t xml:space="preserve"> and model outputs)</w:t>
+        </w:r>
+      </w:ins>
+    </w:p>
+    <w:p>
+      <w:pPr>
+        <w:pStyle w:val="NRELBullet01"/>
+      </w:pPr>
+      <w:r>
+        <w:t xml:space="preserve">Hydrogen transmission </w:t>
+      </w:r>
+      <w:del w:id="90" w:author="Li, Yijin" w:date="2024-12-11T10:10:00Z" w16du:dateUtc="2024-12-11T18:10:00Z">
+        <w:r>
+          <w:delText>capacity and amounts</w:delText>
+        </w:r>
+      </w:del>
+      <w:ins w:id="91" w:author="Li, Yijin" w:date="2024-12-11T10:10:00Z" w16du:dateUtc="2024-12-11T18:10:00Z">
+        <w:r>
+          <w:t>flow</w:t>
+        </w:r>
+      </w:ins>
+      <w:ins w:id="92" w:author="Li, Yijin" w:date="2024-12-11T10:13:00Z" w16du:dateUtc="2024-12-11T18:13:00Z">
+        <w:r>
+          <w:t xml:space="preserve"> amounts</w:t>
+        </w:r>
+      </w:ins>
+      <w:r>
+        <w:t xml:space="preserve">: </w:t>
+      </w:r>
+      <w:r>
+        <w:t>kg/</w:t>
+      </w:r>
+      <w:proofErr w:type="spellStart"/>
+      <w:r>
+        <w:t>hr</w:t>
+      </w:r>
+      <w:proofErr w:type="spellEnd"/>
+      <w:r>
+        <w:t xml:space="preserve"> (in inputs) or kg/period (in code</w:t>
+      </w:r>
+      <w:r>
+        <w:t xml:space="preserve"> and model outputs)</w:t>
+      </w:r>
+    </w:p>
+    <w:p>
+      <w:pPr>
+        <w:pStyle w:val="NRELHead02Numbered"/>
+      </w:pPr>
+      <w:bookmarkStart w:id="93" w:name="_Ref179382197"/>
+      <w:bookmarkStart w:id="94" w:name="_Toc179465209"/>
+      <w:r>
+        <w:t>Scope and Functionality</w:t>
+      </w:r>
+      <w:bookmarkEnd w:id="93"/>
+      <w:bookmarkEnd w:id="94"/>
+    </w:p>
+    <w:p>
+      <w:pPr>
+        <w:pStyle w:val="NRELBodyText"/>
+      </w:pPr>
+      <w:r>
+        <w:t xml:space="preserve">HYPSTAT is designed to capture </w:t>
+      </w:r>
+      <w:ins w:id="95" w:author="Li, Yijin" w:date="2024-12-11T10:23:00Z" w16du:dateUtc="2024-12-11T18:23:00Z">
+        <w:r>
+          <w:t>h</w:t>
+        </w:r>
+      </w:ins>
+      <w:ins w:id="96" w:author="Li, Yijin" w:date="2024-12-11T10:24:00Z" w16du:dateUtc="2024-12-11T18:24:00Z">
+        <w:r>
+          <w:t xml:space="preserve">ydrogen </w:t>
+        </w:r>
+      </w:ins>
+      <w:r>
+        <w:t xml:space="preserve">systems defined by sets of nodes and potential linkages. </w:t>
+      </w:r>
+      <w:ins w:id="97" w:author="Li, Yijin" w:date="2024-12-11T10:25:00Z" w16du:dateUtc="2024-12-11T18:25:00Z">
+        <w:r>
+          <w:t xml:space="preserve">Each node can accommodate hydrogen production, demand, and storage, while each link </w:t>
+        </w:r>
+        <w:r>
+          <w:t xml:space="preserve">can </w:t>
+        </w:r>
+        <w:r>
+          <w:t>represent potential hydrogen transmission between nodes.</w:t>
+        </w:r>
+      </w:ins>
+      <w:del w:id="98" w:author="Li, Yijin" w:date="2024-12-11T10:25:00Z" w16du:dateUtc="2024-12-11T18:25:00Z">
+        <w:r>
+          <w:delText>Each node can have potential for hydrogen production, demand, and storage; and each link can have potential for hydrogen transmission between nodes</w:delText>
+        </w:r>
+      </w:del>
+      <w:r>
+        <w:t xml:space="preserve">. HYPSTAT </w:t>
+      </w:r>
+      <w:ins w:id="99" w:author="Li, Yijin" w:date="2024-12-11T10:26:00Z" w16du:dateUtc="2024-12-11T18:26:00Z">
+        <w:r>
+          <w:t>primarily</w:t>
+        </w:r>
+      </w:ins>
+      <w:ins w:id="100" w:author="Li, Yijin" w:date="2024-12-11T10:29:00Z" w16du:dateUtc="2024-12-11T18:29:00Z">
+        <w:r>
+          <w:t xml:space="preserve"> </w:t>
+        </w:r>
+      </w:ins>
+      <w:r>
+        <w:t>focuses on electrolytic hydrogen production from renewable energy, so production potential at nodes is built around representation of renewable energy and electrolysis. This can be adapted for other technologies, such as grid-powered electrolysis. Note that non-electrolytic hydrogen production is not currently supported in HYPSTAT.</w:t>
+      </w:r>
+    </w:p>
+    <w:p>
+      <w:pPr>
+        <w:pStyle w:val="NRELBodyText"/>
+      </w:pPr>
+      <w:r>
+        <w:t>HYPSTAT allows for flexible representation of any number of electricity generation and hydrogen storage technologies. For example, a HYPSTAT model could include:</w:t>
+      </w:r>
+    </w:p>
+    <w:p>
+      <w:pPr>
+        <w:pStyle w:val="NRELBullet01"/>
+      </w:pPr>
+      <w:r>
+        <w:t>Electricity generation technologies:</w:t>
+      </w:r>
+    </w:p>
+    <w:p>
+      <w:pPr>
+        <w:pStyle w:val="NRELBullet02"/>
+      </w:pPr>
+      <w:r>
+        <w:t>Land-based wind</w:t>
+      </w:r>
+    </w:p>
+    <w:p>
+      <w:pPr>
+        <w:pStyle w:val="NRELBullet02"/>
+      </w:pPr>
+      <w:r>
+        <w:t>Solar PV</w:t>
+      </w:r>
+    </w:p>
+    <w:p>
+      <w:pPr>
+        <w:pStyle w:val="NRELBullet02"/>
+      </w:pPr>
+      <w:r>
+        <w:t>Offshore wind</w:t>
+      </w:r>
+    </w:p>
+    <w:p>
+      <w:pPr>
+        <w:pStyle w:val="NRELBullet02"/>
+      </w:pPr>
+      <w:r>
+        <w:t>Grid electricity</w:t>
+      </w:r>
+    </w:p>
+    <w:p>
+      <w:pPr>
+        <w:pStyle w:val="NRELBullet01"/>
+      </w:pPr>
+      <w:r>
+        <w:t>Storage technologies:</w:t>
+      </w:r>
+    </w:p>
+    <w:p>
+      <w:pPr>
+        <w:pStyle w:val="NRELBullet02"/>
+      </w:pPr>
+      <w:r>
+        <w:t>Above ground tank storage</w:t>
+      </w:r>
+    </w:p>
+    <w:p>
+      <w:pPr>
+        <w:pStyle w:val="NRELBullet02"/>
+      </w:pPr>
+      <w:r>
+        <w:t>Buried pipe storage</w:t>
+      </w:r>
+    </w:p>
+    <w:p>
+      <w:pPr>
+        <w:pStyle w:val="NRELBullet02"/>
+      </w:pPr>
+      <w:r>
+        <w:t>Geologic salt cavern storage</w:t>
+      </w:r>
+    </w:p>
+    <w:p>
+      <w:pPr>
+        <w:pStyle w:val="NRELBodyText"/>
+      </w:pPr>
+      <w:r>
+        <w:t xml:space="preserve">The names of these technologies are set via user inputs. We recommended names with no spaces. Note that electricity generation technologies and storage technologies cannot have the same </w:t>
+      </w:r>
       <w:r>
         <w:lastRenderedPageBreak/>
-        <w:t xml:space="preserve">Hydrogen transmission capacity and amounts: </w:t>
-      </w:r>
-      <w:r>
-        <w:t>kg/</w:t>
+        <w:t xml:space="preserve">name, nor can any technology be </w:t>
+      </w:r>
+      <w:r>
+        <w:t>named ‘Electrolyzer’</w:t>
+      </w:r>
+      <w:r>
+        <w:t xml:space="preserve"> or ‘Pipelines’</w:t>
+      </w:r>
+      <w:r>
+        <w:t>, as this</w:t>
+      </w:r>
+      <w:r>
+        <w:t xml:space="preserve"> will cause errors in how the model reads and processes inputs.</w:t>
+      </w:r>
+    </w:p>
+    <w:p>
+      <w:pPr>
+        <w:pStyle w:val="NRELBodyText"/>
+      </w:pPr>
+      <w:r>
+        <w:t>Currently, HYPSTAT only allows for two transmission technologies: pipeline transmission and tank-based transmission via trucks. (Generalization of additional transmission technologies may be added in the future.) These are referred to as ‘Pipelines’ and ‘Trucks’ in the model inputs and code base. HYPSTAT also only allows one type of hydrogen production technology, electrolysis, which is referred to via the technology name ‘</w:t>
       </w:r>
       <w:proofErr w:type="spellStart"/>
       <w:r>
-        <w:t>hr</w:t>
+        <w:t>Electrolyzer</w:t>
       </w:r>
       <w:proofErr w:type="spellEnd"/>
       <w:r>
-        <w:t xml:space="preserve"> (in inputs) or kg/period (in code</w:t>
-      </w:r>
-      <w:r>
-        <w:t xml:space="preserve"> and model outputs)</w:t>
-      </w:r>
-    </w:p>
-    <w:p>
-      <w:pPr>
-        <w:pStyle w:val="NRELHead02Numbered"/>
-      </w:pPr>
-      <w:bookmarkStart w:id="36" w:name="_Ref179382197"/>
-      <w:bookmarkStart w:id="37" w:name="_Toc179465209"/>
-      <w:r>
-        <w:t>Scope and Functionality</w:t>
-      </w:r>
-      <w:bookmarkEnd w:id="36"/>
-      <w:bookmarkEnd w:id="37"/>
+        <w:t>’ in model inputs.</w:t>
+      </w:r>
+      <w:ins w:id="101" w:author="Li, Yijin" w:date="2024-12-11T10:31:00Z" w16du:dateUtc="2024-12-11T18:31:00Z">
+        <w:r>
+          <w:t xml:space="preserve"> (</w:t>
+        </w:r>
+        <w:proofErr w:type="gramStart"/>
+        <w:r>
+          <w:t>additional</w:t>
+        </w:r>
+        <w:proofErr w:type="gramEnd"/>
+        <w:r>
+          <w:t xml:space="preserve"> </w:t>
+        </w:r>
+        <w:r>
+          <w:t xml:space="preserve">hydrogen production </w:t>
+        </w:r>
+        <w:r>
+          <w:t>technologies may be added.</w:t>
+        </w:r>
+        <w:r>
+          <w:t>)</w:t>
+        </w:r>
+      </w:ins>
     </w:p>
     <w:p>
       <w:pPr>
         <w:pStyle w:val="NRELBodyText"/>
       </w:pPr>
       <w:r>
-        <w:t>HYPSTAT is designed to capture systems defined by sets of nodes and potential linkages. Each node can have potential for hydrogen production, demand, and storage; and each link can have potential for hydrogen transmission between nodes. HYPSTAT focuses on electrolytic hydrogen production from renewable energy, so production potential at nodes is built around representation of renewable energy and electrolysis. This can be adapted for other technologies, such as grid-powered electrolysis. Note that non-electrolytic hydrogen production is not currently supported in HYPSTAT.</w:t>
-      </w:r>
-    </w:p>
-    <w:p>
-      <w:pPr>
-        <w:pStyle w:val="NRELBodyText"/>
-      </w:pPr>
-      <w:r>
-        <w:t>HYPSTAT allows for flexible representation of any number of electricity generation and hydrogen storage technologies. For example, a HYPSTAT model could include:</w:t>
-      </w:r>
-    </w:p>
-    <w:p>
-      <w:pPr>
-        <w:pStyle w:val="NRELBullet01"/>
-      </w:pPr>
-      <w:r>
-        <w:t>Electricity generation technologies:</w:t>
-      </w:r>
-    </w:p>
-    <w:p>
-      <w:pPr>
-        <w:pStyle w:val="NRELBullet02"/>
-      </w:pPr>
-      <w:r>
-        <w:t>Land-based wind</w:t>
-      </w:r>
-    </w:p>
-    <w:p>
-      <w:pPr>
-        <w:pStyle w:val="NRELBullet02"/>
-      </w:pPr>
-      <w:r>
-        <w:t>Solar PV</w:t>
-      </w:r>
-    </w:p>
-    <w:p>
-      <w:pPr>
-        <w:pStyle w:val="NRELBullet02"/>
-      </w:pPr>
-      <w:r>
-        <w:t>Offshore wind</w:t>
-      </w:r>
-    </w:p>
-    <w:p>
-      <w:pPr>
-        <w:pStyle w:val="NRELBullet02"/>
-      </w:pPr>
-      <w:r>
-        <w:t>Grid electricity</w:t>
-      </w:r>
-    </w:p>
-    <w:p>
-      <w:pPr>
-        <w:pStyle w:val="NRELBullet01"/>
-      </w:pPr>
-      <w:r>
-        <w:t>Storage technologies:</w:t>
-      </w:r>
-    </w:p>
-    <w:p>
-      <w:pPr>
-        <w:pStyle w:val="NRELBullet02"/>
-      </w:pPr>
-      <w:r>
-        <w:t>Above ground tank storage</w:t>
-      </w:r>
-    </w:p>
-    <w:p>
-      <w:pPr>
-        <w:pStyle w:val="NRELBullet02"/>
-      </w:pPr>
-      <w:r>
-        <w:t>Buried pipe storage</w:t>
-      </w:r>
-    </w:p>
-    <w:p>
-      <w:pPr>
-        <w:pStyle w:val="NRELBullet02"/>
-      </w:pPr>
-      <w:r>
-        <w:t>Geologic salt cavern storage</w:t>
-      </w:r>
-    </w:p>
-    <w:p>
-      <w:pPr>
-        <w:pStyle w:val="NRELBodyText"/>
-      </w:pPr>
-      <w:r>
-        <w:t xml:space="preserve">The names of these technologies are set via user inputs. We recommended names with no spaces. Note that electricity generation technologies and storage technologies cannot have the same name, nor can any technology be </w:t>
-      </w:r>
-      <w:r>
-        <w:t>named ‘Electrolyzer’</w:t>
-      </w:r>
-      <w:r>
-        <w:t xml:space="preserve"> or ‘Pipelines’</w:t>
-      </w:r>
-      <w:r>
-        <w:t>, as this</w:t>
-      </w:r>
-      <w:r>
-        <w:t xml:space="preserve"> will cause errors in how the model reads and processes inputs.</w:t>
-      </w:r>
-    </w:p>
-    <w:p>
-      <w:pPr>
-        <w:pStyle w:val="NRELBodyText"/>
-      </w:pPr>
-      <w:r>
-        <w:t>Currently, HYPSTAT only allows for two transmission technologies: pipeline transmission and tank-based transmission via trucks. (Generalization of additional transmission technologies may be added in the future.) These are referred to as ‘Pipelines’ and ‘Trucks’ in the model inputs and code base. HYPSTAT also only allows one type of hydrogen production technology, electrolysis, which is referred to via the technology name ‘Electrolyzer’ in model inputs.</w:t>
-      </w:r>
-    </w:p>
-    <w:p>
-      <w:pPr>
-        <w:pStyle w:val="NRELBodyText"/>
-      </w:pPr>
-      <w:r>
         <w:t>The technologies are set up in HYPSTAT to perform their inherent functionality and are further defined by costs and constraints which are user inputs. Further details are described below.</w:t>
       </w:r>
     </w:p>
@@ -6300,13 +7416,12 @@
       <w:pPr>
         <w:pStyle w:val="NRELTableCaption"/>
       </w:pPr>
-      <w:bookmarkStart w:id="38" w:name="_Toc263697319"/>
-      <w:bookmarkStart w:id="39" w:name="_Toc291052369"/>
-      <w:bookmarkStart w:id="40" w:name="_Toc346798626"/>
-      <w:bookmarkStart w:id="41" w:name="_Toc352071042"/>
-      <w:bookmarkStart w:id="42" w:name="_Toc101789561"/>
-      <w:r>
-        <w:lastRenderedPageBreak/>
+      <w:bookmarkStart w:id="102" w:name="_Toc263697319"/>
+      <w:bookmarkStart w:id="103" w:name="_Toc291052369"/>
+      <w:bookmarkStart w:id="104" w:name="_Toc346798626"/>
+      <w:bookmarkStart w:id="105" w:name="_Toc352071042"/>
+      <w:bookmarkStart w:id="106" w:name="_Toc101789561"/>
+      <w:r>
         <w:t xml:space="preserve">Table </w:t>
       </w:r>
       <w:r>
@@ -6342,11 +7457,11 @@
       <w:r>
         <w:t xml:space="preserve">. </w:t>
       </w:r>
-      <w:bookmarkEnd w:id="38"/>
-      <w:bookmarkEnd w:id="39"/>
-      <w:bookmarkEnd w:id="40"/>
-      <w:bookmarkEnd w:id="41"/>
-      <w:bookmarkEnd w:id="42"/>
+      <w:bookmarkEnd w:id="102"/>
+      <w:bookmarkEnd w:id="103"/>
+      <w:bookmarkEnd w:id="104"/>
+      <w:bookmarkEnd w:id="105"/>
+      <w:bookmarkEnd w:id="106"/>
       <w:r>
         <w:t>Technology options in HYPSTAT</w:t>
       </w:r>
@@ -6362,12 +7477,12 @@
         <w:tblLook w:val="04A0" w:firstRow="1" w:lastRow="0" w:firstColumn="1" w:lastColumn="0" w:noHBand="0" w:noVBand="1"/>
       </w:tblPr>
       <w:tblGrid>
-        <w:gridCol w:w="1328"/>
-        <w:gridCol w:w="1517"/>
-        <w:gridCol w:w="1155"/>
-        <w:gridCol w:w="1790"/>
-        <w:gridCol w:w="1651"/>
-        <w:gridCol w:w="1811"/>
+        <w:gridCol w:w="1286"/>
+        <w:gridCol w:w="1396"/>
+        <w:gridCol w:w="1139"/>
+        <w:gridCol w:w="2284"/>
+        <w:gridCol w:w="1524"/>
+        <w:gridCol w:w="1623"/>
       </w:tblGrid>
       <w:tr>
         <w:trPr>
@@ -6389,7 +7504,7 @@
             <w:pPr>
               <w:pStyle w:val="NRELTableHeader"/>
             </w:pPr>
-            <w:bookmarkStart w:id="43" w:name="_Hlk179383786"/>
+            <w:bookmarkStart w:id="107" w:name="_Hlk179383786"/>
             <w:r>
               <w:rPr>
                 <w:bCs/>
@@ -6640,12 +7755,66 @@
             <w:pPr>
               <w:pStyle w:val="NRELTableContent"/>
             </w:pPr>
+            <w:ins w:id="108" w:author="Li, Yijin" w:date="2024-12-11T12:22:00Z" w16du:dateUtc="2024-12-11T20:22:00Z">
+              <w:r>
+                <w:rPr>
+                  <w:sz w:val="18"/>
+                  <w:szCs w:val="18"/>
+                </w:rPr>
+                <w:t>Capacity build</w:t>
+              </w:r>
+            </w:ins>
+            <w:ins w:id="109" w:author="Li, Yijin" w:date="2024-12-11T12:21:00Z" w16du:dateUtc="2024-12-11T20:21:00Z">
+              <w:r>
+                <w:rPr>
+                  <w:sz w:val="18"/>
+                  <w:szCs w:val="18"/>
+                </w:rPr>
+                <w:t xml:space="preserve"> </w:t>
+              </w:r>
+              <w:proofErr w:type="spellStart"/>
+              <w:r>
+                <w:rPr>
+                  <w:sz w:val="18"/>
+                  <w:szCs w:val="18"/>
+                </w:rPr>
+                <w:t>constaint</w:t>
+              </w:r>
+            </w:ins>
+            <w:proofErr w:type="spellEnd"/>
+            <w:ins w:id="110" w:author="Li, Yijin" w:date="2024-12-11T12:22:00Z" w16du:dateUtc="2024-12-11T20:22:00Z">
+              <w:r>
+                <w:rPr>
+                  <w:sz w:val="18"/>
+                  <w:szCs w:val="18"/>
+                </w:rPr>
+                <w:t xml:space="preserve"> and </w:t>
+              </w:r>
+            </w:ins>
+            <w:ins w:id="111" w:author="Li, Yijin" w:date="2024-12-11T12:21:00Z" w16du:dateUtc="2024-12-11T20:21:00Z">
+              <w:r>
+                <w:rPr>
+                  <w:sz w:val="18"/>
+                  <w:szCs w:val="18"/>
+                </w:rPr>
+                <w:t>g</w:t>
+              </w:r>
+            </w:ins>
+            <w:del w:id="112" w:author="Li, Yijin" w:date="2024-12-11T12:21:00Z" w16du:dateUtc="2024-12-11T20:21:00Z">
+              <w:r>
+                <w:rPr>
+                  <w:sz w:val="18"/>
+                  <w:szCs w:val="18"/>
+                </w:rPr>
+                <w:delText>G</w:delText>
+              </w:r>
+            </w:del>
             <w:r>
               <w:rPr>
                 <w:sz w:val="18"/>
                 <w:szCs w:val="18"/>
               </w:rPr>
-              <w:t xml:space="preserve">Generation profiles which specify how much is electricity can be produced in each </w:t>
+              <w:t xml:space="preserve">eneration profiles which specify how much is electricity can be produced in each </w:t>
             </w:r>
             <w:proofErr w:type="gramStart"/>
             <w:r>
@@ -6780,6 +7949,42 @@
               </w:rPr>
               <w:t>CAPEX and fixed OPEX</w:t>
             </w:r>
+            <w:ins w:id="113" w:author="Li, Yijin" w:date="2024-12-11T12:22:00Z" w16du:dateUtc="2024-12-11T20:22:00Z">
+              <w:r>
+                <w:rPr>
+                  <w:sz w:val="18"/>
+                  <w:szCs w:val="18"/>
+                </w:rPr>
+                <w:t xml:space="preserve">, </w:t>
+              </w:r>
+            </w:ins>
+            <w:ins w:id="114" w:author="Li, Yijin" w:date="2024-12-11T12:23:00Z" w16du:dateUtc="2024-12-11T20:23:00Z">
+              <w:r>
+                <w:rPr>
+                  <w:sz w:val="18"/>
+                  <w:szCs w:val="18"/>
+                </w:rPr>
+                <w:t>(</w:t>
+              </w:r>
+            </w:ins>
+            <w:ins w:id="115" w:author="Li, Yijin" w:date="2024-12-11T12:22:00Z" w16du:dateUtc="2024-12-11T20:22:00Z">
+              <w:r>
+                <w:rPr>
+                  <w:sz w:val="18"/>
+                  <w:szCs w:val="18"/>
+                </w:rPr>
+                <w:t xml:space="preserve">variable OPEX </w:t>
+              </w:r>
+            </w:ins>
+            <w:ins w:id="116" w:author="Li, Yijin" w:date="2024-12-11T12:23:00Z" w16du:dateUtc="2024-12-11T20:23:00Z">
+              <w:r>
+                <w:rPr>
+                  <w:sz w:val="18"/>
+                  <w:szCs w:val="18"/>
+                </w:rPr>
+                <w:t xml:space="preserve">may be added) </w:t>
+              </w:r>
+            </w:ins>
           </w:p>
         </w:tc>
         <w:tc>
@@ -6996,7 +8201,7 @@
           </w:p>
         </w:tc>
       </w:tr>
-      <w:bookmarkEnd w:id="43"/>
+      <w:bookmarkEnd w:id="107"/>
       <w:tr>
         <w:tc>
           <w:tcPr>
@@ -7100,29 +8305,48 @@
                 <w:szCs w:val="18"/>
               </w:rPr>
             </w:pPr>
-            <w:r>
-              <w:rPr>
-                <w:sz w:val="18"/>
-                <w:szCs w:val="18"/>
-              </w:rPr>
-              <w:t xml:space="preserve">CAPEX based on pipeline size and a fixed CAPEX adder for </w:t>
-            </w:r>
-            <w:proofErr w:type="gramStart"/>
-            <w:r>
-              <w:rPr>
-                <w:sz w:val="18"/>
-                <w:szCs w:val="18"/>
-              </w:rPr>
-              <w:t>whether or not</w:t>
-            </w:r>
-            <w:proofErr w:type="gramEnd"/>
-            <w:r>
-              <w:rPr>
-                <w:sz w:val="18"/>
-                <w:szCs w:val="18"/>
-              </w:rPr>
-              <w:t xml:space="preserve"> a pipeline is built, fixed OPEX as a fraction of CAPEX, and variable OPEX for pipeline flow in either direction</w:t>
-            </w:r>
+            <w:ins w:id="117" w:author="Li, Yijin" w:date="2024-12-11T12:24:00Z" w16du:dateUtc="2024-12-11T20:24:00Z">
+              <w:r>
+                <w:rPr>
+                  <w:sz w:val="18"/>
+                  <w:szCs w:val="18"/>
+                </w:rPr>
+                <w:t xml:space="preserve">CAPEX is based on pipeline size and includes a fixed CAPEX adder for </w:t>
+              </w:r>
+              <w:proofErr w:type="gramStart"/>
+              <w:r>
+                <w:rPr>
+                  <w:sz w:val="18"/>
+                  <w:szCs w:val="18"/>
+                </w:rPr>
+                <w:t>whether or not</w:t>
+              </w:r>
+              <w:proofErr w:type="gramEnd"/>
+              <w:r>
+                <w:rPr>
+                  <w:sz w:val="18"/>
+                  <w:szCs w:val="18"/>
+                </w:rPr>
+                <w:t xml:space="preserve"> the pipeline is built. Fixed OPEX is calculated as a </w:t>
+              </w:r>
+              <w:r>
+                <w:rPr>
+                  <w:sz w:val="18"/>
+                  <w:szCs w:val="18"/>
+                </w:rPr>
+                <w:lastRenderedPageBreak/>
+                <w:t>fraction of CAPEX, while variable OPEX applies to pipeline flow in either direction.</w:t>
+              </w:r>
+            </w:ins>
+            <w:del w:id="118" w:author="Li, Yijin" w:date="2024-12-11T12:24:00Z" w16du:dateUtc="2024-12-11T20:24:00Z">
+              <w:r>
+                <w:rPr>
+                  <w:sz w:val="18"/>
+                  <w:szCs w:val="18"/>
+                </w:rPr>
+                <w:delText>CAPEX based on pipeline size and a fixed CAPEX adder for whether or not a pipeline is built, fixed OPEX as a fraction of CAPEX, and variable OPEX for pipeline flow in either direction</w:delText>
+              </w:r>
+            </w:del>
           </w:p>
         </w:tc>
         <w:tc>
@@ -7147,6 +8371,7 @@
                 <w:sz w:val="18"/>
                 <w:szCs w:val="18"/>
               </w:rPr>
+              <w:lastRenderedPageBreak/>
               <w:t>Allows user input for maximum pipeline size for each link</w:t>
             </w:r>
           </w:p>
@@ -7359,11 +8584,11 @@
       <w:pPr>
         <w:pStyle w:val="NRELHead03Numbered"/>
       </w:pPr>
-      <w:bookmarkStart w:id="44" w:name="_Toc179465210"/>
+      <w:bookmarkStart w:id="119" w:name="_Toc179465210"/>
       <w:r>
         <w:t>Electricity Generation Technologies</w:t>
       </w:r>
-      <w:bookmarkEnd w:id="44"/>
+      <w:bookmarkEnd w:id="119"/>
     </w:p>
     <w:p>
       <w:pPr>
@@ -7386,19 +8611,45 @@
       </w:r>
       <w:proofErr w:type="gramEnd"/>
       <w:r>
-        <w:t xml:space="preserve">. This is primarily meant to </w:t>
-      </w:r>
-      <w:r>
-        <w:lastRenderedPageBreak/>
-        <w:t xml:space="preserve">represent renewable resources for which profiles can be obtained using a tool like the System Advisor Model or </w:t>
-      </w:r>
-      <w:proofErr w:type="spellStart"/>
-      <w:r>
-        <w:t>reV.</w:t>
-      </w:r>
-      <w:proofErr w:type="spellEnd"/>
-      <w:r>
-        <w:t xml:space="preserve"> For each technology at each node, a technology can have one or more tranches which each contain a potential profile and a capacity limit. Tranches can be used to represent differing levels of resources within the area represented by a node, i.e., to capture a renewable supply curve. For example, perhaps a region has a small area of good land-based wind resource and a larger area of worse land-based wind resource. This could be represented in HYPSTAT with two tranches for land-based wind at that node, each with different generation profiles and capacity limits.</w:t>
+        <w:t xml:space="preserve">. This is primarily meant to represent renewable resources for which profiles can be obtained using a tool like the System Advisor Model or </w:t>
+      </w:r>
+      <w:del w:id="120" w:author="Li, Yijin" w:date="2024-12-11T12:26:00Z" w16du:dateUtc="2024-12-11T20:26:00Z">
+        <w:r>
+          <w:delText>reV</w:delText>
+        </w:r>
+      </w:del>
+      <w:ins w:id="121" w:author="Li, Yijin" w:date="2024-12-11T12:26:00Z" w16du:dateUtc="2024-12-11T20:26:00Z">
+        <w:r>
+          <w:t xml:space="preserve">NREL’s </w:t>
+        </w:r>
+        <w:r>
+          <w:t>Renewable Energy Potential</w:t>
+        </w:r>
+        <w:r>
+          <w:t xml:space="preserve"> (</w:t>
+        </w:r>
+        <w:proofErr w:type="spellStart"/>
+        <w:r>
+          <w:t>reV</w:t>
+        </w:r>
+        <w:proofErr w:type="spellEnd"/>
+        <w:r>
+          <w:t>)</w:t>
+        </w:r>
+        <w:r>
+          <w:t xml:space="preserve"> Model</w:t>
+        </w:r>
+      </w:ins>
+      <w:r>
+        <w:t xml:space="preserve">. For each technology at each node, a technology can have one or more </w:t>
+      </w:r>
+      <w:ins w:id="122" w:author="Li, Yijin" w:date="2024-12-11T12:26:00Z" w16du:dateUtc="2024-12-11T20:26:00Z">
+        <w:r>
+          <w:t xml:space="preserve">supply curve profile </w:t>
+        </w:r>
+      </w:ins>
+      <w:r>
+        <w:t>tranches which each contain a potential profile and a capacity limit. Tranches can be used to represent differing levels of resources within the area represented by a node, i.e., to capture a renewable supply curve. For example, perhaps a region has a small area of good land-based wind resource and a larger area of worse land-based wind resource. This could be represented in HYPSTAT with two tranches for land-based wind at that node, each with different generation profiles and capacity limits.</w:t>
       </w:r>
     </w:p>
     <w:p>
@@ -7406,7 +8657,15 @@
         <w:pStyle w:val="NRELBodyText"/>
       </w:pPr>
       <w:r>
-        <w:t xml:space="preserve">While electricity generation technologies are designed around renewables, they can also be used to represent other electricity sources such as the grid using the variable operating expense inputs. HYPSTAT supports profiles for operating expenses on a per unit (e.g., kWh) basis for each </w:t>
+        <w:t xml:space="preserve">While electricity generation technologies are designed around renewables, they can also be used to represent other electricity sources such as the grid </w:t>
+      </w:r>
+      <w:ins w:id="123" w:author="Li, Yijin" w:date="2024-12-11T12:29:00Z" w16du:dateUtc="2024-12-11T20:29:00Z">
+        <w:r>
+          <w:t xml:space="preserve">electricity </w:t>
+        </w:r>
+      </w:ins>
+      <w:r>
+        <w:t xml:space="preserve">using the variable operating expense inputs. HYPSTAT supports profiles for operating expenses on a per unit (e.g., kWh) basis for each </w:t>
       </w:r>
       <w:proofErr w:type="gramStart"/>
       <w:r>
@@ -7420,10 +8679,24 @@
     <w:p>
       <w:pPr>
         <w:pStyle w:val="NRELBodyText"/>
-      </w:pPr>
-      <w:r>
-        <w:t>Based on the profiles and capacity that is built, HYPSTAT determines a maximum electricity generation or generation potential and chooses how much to send to hydrogen production and how much to curtail. This decision of how much to curtail includes how much grid electricity to purchase, since the variable OPEX which represents grid prices are only incurred for used electricity.</w:t>
-      </w:r>
+        <w:rPr>
+          <w:del w:id="124" w:author="Li, Yijin" w:date="2024-12-11T12:32:00Z" w16du:dateUtc="2024-12-11T20:32:00Z"/>
+        </w:rPr>
+      </w:pPr>
+      <w:ins w:id="125" w:author="Li, Yijin" w:date="2024-12-11T12:32:00Z" w16du:dateUtc="2024-12-11T20:32:00Z">
+        <w:r>
+          <w:lastRenderedPageBreak/>
+          <w:t>Based on the profiles and capacity built, HYPSTAT determines the maximum electricity generation or generation potential and decides how much to allocate to hydrogen production and how much to curtail. The decision on curtailment also considers how much grid electricity to purchase, as variable OPEX—representing grid electricity costs—is only incurred for electricity that is actually used.</w:t>
+        </w:r>
+        <w:r>
+          <w:t xml:space="preserve"> </w:t>
+        </w:r>
+      </w:ins>
+      <w:del w:id="126" w:author="Li, Yijin" w:date="2024-12-11T12:32:00Z" w16du:dateUtc="2024-12-11T20:32:00Z">
+        <w:r>
+          <w:delText>Based on the profiles and capacity that is built, HYPSTAT determines a maximum electricity generation or generation potential and chooses how much to send to hydrogen production and how much to curtail. This decision of how much to curtail includes how much grid electricity to purchase, since the variable OPEX which represents grid prices are only incurred for used electricity.</w:delText>
+        </w:r>
+      </w:del>
     </w:p>
     <w:p>
       <w:pPr>
@@ -7437,14 +8710,14 @@
       <w:pPr>
         <w:pStyle w:val="NRELHead03Numbered"/>
       </w:pPr>
-      <w:bookmarkStart w:id="45" w:name="_Toc179465211"/>
+      <w:bookmarkStart w:id="127" w:name="_Toc179465211"/>
       <w:r>
         <w:t>Hydrogen Production</w:t>
       </w:r>
       <w:r>
         <w:t xml:space="preserve"> and Demand</w:t>
       </w:r>
-      <w:bookmarkEnd w:id="45"/>
+      <w:bookmarkEnd w:id="127"/>
     </w:p>
     <w:p>
       <w:pPr>
@@ -7469,12 +8742,11 @@
       <w:pPr>
         <w:pStyle w:val="NRELHead03Numbered"/>
       </w:pPr>
-      <w:bookmarkStart w:id="46" w:name="_Toc179465212"/>
-      <w:r>
-        <w:lastRenderedPageBreak/>
+      <w:bookmarkStart w:id="128" w:name="_Toc179465212"/>
+      <w:r>
         <w:t>Technology Costs</w:t>
       </w:r>
-      <w:bookmarkEnd w:id="46"/>
+      <w:bookmarkEnd w:id="128"/>
     </w:p>
     <w:p>
       <w:pPr>
@@ -7500,6 +8772,7 @@
         <w:rPr>
           <w:noProof/>
         </w:rPr>
+        <w:lastRenderedPageBreak/>
         <w:drawing>
           <wp:inline distT="0" distB="0" distL="0" distR="0" wp14:anchorId="5D914017" wp14:editId="285499E8">
             <wp:extent cx="2286000" cy="1714500"/>
@@ -7551,12 +8824,12 @@
       <w:pPr>
         <w:pStyle w:val="NRELFigureCaption"/>
       </w:pPr>
-      <w:bookmarkStart w:id="47" w:name="_Toc263697387"/>
-      <w:bookmarkStart w:id="48" w:name="_Toc291052379"/>
-      <w:bookmarkStart w:id="49" w:name="_Toc346798624"/>
-      <w:bookmarkStart w:id="50" w:name="_Toc352071641"/>
-      <w:bookmarkStart w:id="51" w:name="_Toc352748106"/>
-      <w:bookmarkStart w:id="52" w:name="_Toc97540172"/>
+      <w:bookmarkStart w:id="129" w:name="_Toc263697387"/>
+      <w:bookmarkStart w:id="130" w:name="_Toc291052379"/>
+      <w:bookmarkStart w:id="131" w:name="_Toc346798624"/>
+      <w:bookmarkStart w:id="132" w:name="_Toc352071641"/>
+      <w:bookmarkStart w:id="133" w:name="_Toc352748106"/>
+      <w:bookmarkStart w:id="134" w:name="_Toc97540172"/>
       <w:r>
         <w:t xml:space="preserve">Figure </w:t>
       </w:r>
@@ -7593,12 +8866,12 @@
       <w:r>
         <w:t xml:space="preserve">. </w:t>
       </w:r>
-      <w:bookmarkEnd w:id="47"/>
-      <w:bookmarkEnd w:id="48"/>
-      <w:bookmarkEnd w:id="49"/>
-      <w:bookmarkEnd w:id="50"/>
-      <w:bookmarkEnd w:id="51"/>
-      <w:bookmarkEnd w:id="52"/>
+      <w:bookmarkEnd w:id="129"/>
+      <w:bookmarkEnd w:id="130"/>
+      <w:bookmarkEnd w:id="131"/>
+      <w:bookmarkEnd w:id="132"/>
+      <w:bookmarkEnd w:id="133"/>
+      <w:bookmarkEnd w:id="134"/>
       <w:r>
         <w:t>Approximation of pipeline costs used in HYPSTAT</w:t>
       </w:r>
@@ -7616,18 +8889,34 @@
         <w:pStyle w:val="NRELBodyText"/>
       </w:pPr>
       <w:r>
-        <w:t>HYPSTAT does not currently support variable OPEX for hydrogen production, since variable OPEX on a per kg basis is inevitable given fixed production to meet the given hydrogen demand (i.e., this variable OPEX would not affect the optimization results). We recommend that the user adds in or considers variable OPEX for hydrogen production in output processing steps for analyzing results.</w:t>
+        <w:t xml:space="preserve">HYPSTAT does not currently support variable OPEX for hydrogen production, since variable OPEX on a per kg basis is inevitable given fixed production to meet the given hydrogen demand </w:t>
+      </w:r>
+      <w:commentRangeStart w:id="135"/>
+      <w:r>
+        <w:t>(i.e., this variable OPEX would not affect the optimization results</w:t>
+      </w:r>
+      <w:commentRangeEnd w:id="135"/>
+      <w:r>
+        <w:rPr>
+          <w:rStyle w:val="CommentReference"/>
+          <w:rFonts w:eastAsia="Times New Roman"/>
+          <w:color w:val="auto"/>
+        </w:rPr>
+        <w:commentReference w:id="135"/>
+      </w:r>
+      <w:r>
+        <w:t>). We recommend that the user adds in or considers variable OPEX for hydrogen production in output processing steps for analyzing results.</w:t>
       </w:r>
     </w:p>
     <w:p>
       <w:pPr>
         <w:pStyle w:val="NRELHead03Numbered"/>
       </w:pPr>
-      <w:bookmarkStart w:id="53" w:name="_Toc179465213"/>
+      <w:bookmarkStart w:id="136" w:name="_Toc179465213"/>
       <w:r>
         <w:t>Imports and Exports</w:t>
       </w:r>
-      <w:bookmarkEnd w:id="53"/>
+      <w:bookmarkEnd w:id="136"/>
     </w:p>
     <w:p>
       <w:pPr>
@@ -7649,11 +8938,11 @@
       <w:pPr>
         <w:pStyle w:val="NRELHead03Numbered"/>
       </w:pPr>
-      <w:bookmarkStart w:id="54" w:name="_Toc179465214"/>
+      <w:bookmarkStart w:id="137" w:name="_Toc179465214"/>
       <w:r>
         <w:t>System Outputs</w:t>
       </w:r>
-      <w:bookmarkEnd w:id="54"/>
+      <w:bookmarkEnd w:id="137"/>
     </w:p>
     <w:p>
       <w:pPr>
@@ -7676,32 +8965,139 @@
         <w:pStyle w:val="NRELBullet02"/>
       </w:pPr>
       <w:r>
+        <w:t>Optimal capacity for electricity generation, hydrogen production, and hydrogen storage technologies at each node.</w:t>
+      </w:r>
+    </w:p>
+    <w:p>
+      <w:pPr>
+        <w:pStyle w:val="NRELBullet02"/>
+      </w:pPr>
+      <w:r>
+        <w:t>Optimal links for pipelines and the optimal size of each pipeline.</w:t>
+      </w:r>
+    </w:p>
+    <w:p>
+      <w:pPr>
+        <w:pStyle w:val="NRELBullet01"/>
+      </w:pPr>
+      <w:r>
+        <w:t>System operation:</w:t>
+      </w:r>
+    </w:p>
+    <w:p>
+      <w:pPr>
+        <w:pStyle w:val="NRELBullet02"/>
+      </w:pPr>
+      <w:r>
+        <w:t xml:space="preserve">Electricity generation and curtailment for each technology at each node in each </w:t>
+      </w:r>
+      <w:proofErr w:type="gramStart"/>
+      <w:r>
+        <w:t>time period</w:t>
+      </w:r>
+      <w:proofErr w:type="gramEnd"/>
+    </w:p>
+    <w:p>
+      <w:pPr>
+        <w:pStyle w:val="NRELBullet02"/>
+      </w:pPr>
+      <w:r>
+        <w:t xml:space="preserve">Hydrogen production at each node in each </w:t>
+      </w:r>
+      <w:proofErr w:type="gramStart"/>
+      <w:r>
+        <w:t>time period</w:t>
+      </w:r>
+      <w:proofErr w:type="gramEnd"/>
+    </w:p>
+    <w:p>
+      <w:pPr>
+        <w:pStyle w:val="NRELBullet02"/>
+      </w:pPr>
+      <w:r>
+        <w:t xml:space="preserve">Injections and withdrawals from storage at each node in each </w:t>
+      </w:r>
+      <w:proofErr w:type="gramStart"/>
+      <w:r>
+        <w:t>time period</w:t>
+      </w:r>
+      <w:proofErr w:type="gramEnd"/>
+    </w:p>
+    <w:p>
+      <w:pPr>
+        <w:pStyle w:val="NRELBullet02"/>
+      </w:pPr>
+      <w:r>
+        <w:t xml:space="preserve">The amount of stored hydrogen (storage level) at each node in each </w:t>
+      </w:r>
+      <w:proofErr w:type="gramStart"/>
+      <w:r>
+        <w:t>time period</w:t>
+      </w:r>
+      <w:proofErr w:type="gramEnd"/>
+    </w:p>
+    <w:p>
+      <w:pPr>
+        <w:pStyle w:val="NRELBullet02"/>
+      </w:pPr>
+      <w:r>
         <w:lastRenderedPageBreak/>
-        <w:t>Optimal capacity for electricity generation, hydrogen production, and hydrogen storage technologies at each node.</w:t>
-      </w:r>
+        <w:t xml:space="preserve">Hydrogen flows via pipeline and via truck transmission for each link in each </w:t>
+      </w:r>
+      <w:proofErr w:type="gramStart"/>
+      <w:r>
+        <w:t>time period</w:t>
+      </w:r>
+      <w:proofErr w:type="gramEnd"/>
     </w:p>
     <w:p>
       <w:pPr>
         <w:pStyle w:val="NRELBullet02"/>
       </w:pPr>
       <w:r>
-        <w:t>Optimal links for pipelines and the optimal size of each pipeline.</w:t>
-      </w:r>
-    </w:p>
-    <w:p>
-      <w:pPr>
-        <w:pStyle w:val="NRELBullet01"/>
-      </w:pPr>
-      <w:r>
-        <w:t>System operation:</w:t>
-      </w:r>
+        <w:t xml:space="preserve">The amounts of imports and exports at each node in each </w:t>
+      </w:r>
+      <w:proofErr w:type="gramStart"/>
+      <w:r>
+        <w:t>time period</w:t>
+      </w:r>
+      <w:proofErr w:type="gramEnd"/>
     </w:p>
     <w:p>
       <w:pPr>
         <w:pStyle w:val="NRELBullet02"/>
-      </w:pPr>
-      <w:r>
-        <w:t xml:space="preserve">Electricity generation and curtailment for each technology at each node in each </w:t>
+        <w:rPr>
+          <w:del w:id="138" w:author="Li, Yijin" w:date="2024-12-11T12:43:00Z" w16du:dateUtc="2024-12-11T20:43:00Z"/>
+        </w:rPr>
+      </w:pPr>
+      <w:ins w:id="139" w:author="Li, Yijin" w:date="2024-12-11T12:43:00Z" w16du:dateUtc="2024-12-11T20:43:00Z">
+        <w:r>
+          <w:t xml:space="preserve">The extent to which demand is met at each node in each </w:t>
+        </w:r>
+        <w:proofErr w:type="gramStart"/>
+        <w:r>
+          <w:t>time period</w:t>
+        </w:r>
+        <w:proofErr w:type="gramEnd"/>
+        <w:r>
+          <w:t xml:space="preserve"> (to verify if input demand is fully satisfied or to track when flexible demands are met).</w:t>
+        </w:r>
+        <w:r>
+          <w:t xml:space="preserve"> </w:t>
+        </w:r>
+      </w:ins>
+      <w:del w:id="140" w:author="Li, Yijin" w:date="2024-12-11T12:43:00Z" w16du:dateUtc="2024-12-11T20:43:00Z">
+        <w:r>
+          <w:delText>How much demand is met at each node in each time period (to verify that input demand is met, or to see when demand is met in the case of flexible demands)</w:delText>
+        </w:r>
+      </w:del>
+    </w:p>
+    <w:p>
+      <w:pPr>
+        <w:pStyle w:val="NRELBullet02"/>
+      </w:pPr>
+      <w:r>
+        <w:t xml:space="preserve">If there is unserved hydrogen (i.e., demand that is impossible to meet) or excess hydrogen produced at any node in any </w:t>
       </w:r>
       <w:proofErr w:type="gramStart"/>
       <w:r>
@@ -7711,130 +9107,76 @@
     </w:p>
     <w:p>
       <w:pPr>
-        <w:pStyle w:val="NRELBullet02"/>
-      </w:pPr>
-      <w:r>
-        <w:t xml:space="preserve">Hydrogen production at each node in each </w:t>
+        <w:pStyle w:val="NRELHead03Numbered"/>
+      </w:pPr>
+      <w:bookmarkStart w:id="141" w:name="_Toc179465215"/>
+      <w:r>
+        <w:t>Recommended Scope</w:t>
+      </w:r>
+      <w:bookmarkEnd w:id="141"/>
+    </w:p>
+    <w:p>
+      <w:pPr>
+        <w:pStyle w:val="NRELBodyText"/>
+      </w:pPr>
+      <w:r>
+        <w:t xml:space="preserve">HYPSTAT models the hydrogen system at a time resolution which can be flexibly specified by the user. While this is flexible, HYPSTAT was designed to be modeled at a granular level </w:t>
       </w:r>
       <w:proofErr w:type="gramStart"/>
       <w:r>
-        <w:t>time period</w:t>
+        <w:t>in order to</w:t>
       </w:r>
       <w:proofErr w:type="gramEnd"/>
-    </w:p>
-    <w:p>
-      <w:pPr>
-        <w:pStyle w:val="NRELBullet02"/>
-      </w:pPr>
-      <w:r>
-        <w:t xml:space="preserve">Injections and withdrawals from storage at each node in each </w:t>
-      </w:r>
-      <w:proofErr w:type="gramStart"/>
-      <w:r>
-        <w:t>time period</w:t>
-      </w:r>
-      <w:proofErr w:type="gramEnd"/>
-    </w:p>
-    <w:p>
-      <w:pPr>
-        <w:pStyle w:val="NRELBullet02"/>
-      </w:pPr>
-      <w:r>
-        <w:t xml:space="preserve">The amount of stored hydrogen (storage level) at each node in each </w:t>
-      </w:r>
-      <w:proofErr w:type="gramStart"/>
-      <w:r>
-        <w:t>time period</w:t>
-      </w:r>
-      <w:proofErr w:type="gramEnd"/>
-    </w:p>
-    <w:p>
-      <w:pPr>
-        <w:pStyle w:val="NRELBullet02"/>
-      </w:pPr>
-      <w:r>
-        <w:t xml:space="preserve">Hydrogen flows via pipeline and via truck transmission for each link in each </w:t>
-      </w:r>
-      <w:proofErr w:type="gramStart"/>
-      <w:r>
-        <w:t>time period</w:t>
-      </w:r>
-      <w:proofErr w:type="gramEnd"/>
-    </w:p>
-    <w:p>
-      <w:pPr>
-        <w:pStyle w:val="NRELBullet02"/>
-      </w:pPr>
-      <w:r>
-        <w:t xml:space="preserve">The amounts of imports and exports at each node in each </w:t>
-      </w:r>
-      <w:proofErr w:type="gramStart"/>
-      <w:r>
-        <w:t>time period</w:t>
-      </w:r>
-      <w:proofErr w:type="gramEnd"/>
-    </w:p>
-    <w:p>
-      <w:pPr>
-        <w:pStyle w:val="NRELBullet02"/>
-      </w:pPr>
-      <w:r>
-        <w:t xml:space="preserve">How much demand is met at each node in each </w:t>
-      </w:r>
-      <w:proofErr w:type="gramStart"/>
-      <w:r>
-        <w:t>time period</w:t>
-      </w:r>
-      <w:proofErr w:type="gramEnd"/>
-      <w:r>
-        <w:t xml:space="preserve"> (to verify that input demand is met, or to see when demand is met in the case of flexible demands)</w:t>
-      </w:r>
-    </w:p>
-    <w:p>
-      <w:pPr>
-        <w:pStyle w:val="NRELBullet02"/>
-      </w:pPr>
-      <w:r>
-        <w:t xml:space="preserve">If there is unserved hydrogen (i.e., demand that is impossible to meet) or excess hydrogen produced at any node in any </w:t>
-      </w:r>
-      <w:proofErr w:type="gramStart"/>
-      <w:r>
-        <w:t>time period</w:t>
-      </w:r>
-      <w:proofErr w:type="gramEnd"/>
-    </w:p>
-    <w:p>
-      <w:pPr>
-        <w:pStyle w:val="NRELHead03Numbered"/>
-      </w:pPr>
-      <w:bookmarkStart w:id="55" w:name="_Toc179465215"/>
-      <w:r>
-        <w:t>Recommended Scope</w:t>
-      </w:r>
-      <w:bookmarkEnd w:id="55"/>
+      <w:r>
+        <w:t xml:space="preserve"> capture intra-year storage dynamics. HYPSTAT is also designed to model systems for a full year, but it can be set up to run for shorter model time windows (e.g., for quick solves and testing). </w:t>
+      </w:r>
+      <w:ins w:id="142" w:author="Li, Yijin" w:date="2024-12-11T12:45:00Z" w16du:dateUtc="2024-12-11T20:45:00Z">
+        <w:r>
+          <w:t xml:space="preserve">In theory, HYPSTAT could be set up to </w:t>
+        </w:r>
+        <w:r>
+          <w:t>run</w:t>
+        </w:r>
+        <w:r>
+          <w:t xml:space="preserve"> periods longer than a year, but this has not been tested.</w:t>
+        </w:r>
+      </w:ins>
+      <w:ins w:id="143" w:author="Li, Yijin" w:date="2024-12-11T12:46:00Z" w16du:dateUtc="2024-12-11T20:46:00Z">
+        <w:r>
+          <w:t xml:space="preserve"> </w:t>
+        </w:r>
+      </w:ins>
+      <w:del w:id="144" w:author="Li, Yijin" w:date="2024-12-11T12:45:00Z" w16du:dateUtc="2024-12-11T20:45:00Z">
+        <w:r>
+          <w:delText>In theory, it could be set up to run for more than a year, but this has not been tested.</w:delText>
+        </w:r>
+      </w:del>
     </w:p>
     <w:p>
       <w:pPr>
         <w:pStyle w:val="NRELBodyText"/>
       </w:pPr>
       <w:r>
-        <w:t xml:space="preserve">HYPSTAT models the hydrogen system at a time resolution which can be flexibly specified by the user. While this is flexible, HYPSTAT was designed to be modeled at a granular level </w:t>
-      </w:r>
-      <w:proofErr w:type="gramStart"/>
-      <w:r>
-        <w:t>in order to</w:t>
-      </w:r>
-      <w:proofErr w:type="gramEnd"/>
-      <w:r>
-        <w:t xml:space="preserve"> capture intra-year storage dynamics. HYPSTAT is also designed to model systems for a full year, but it can be set up to run for shorter model time windows (e.g., for quick solves and testing). In theory, it could be set up to run for more than a year, but this has not been tested.</w:t>
-      </w:r>
-    </w:p>
-    <w:p>
-      <w:pPr>
-        <w:pStyle w:val="NRELBodyText"/>
-      </w:pPr>
-      <w:r>
-        <w:t>While HYPSTAT is inherently flexible for the scope and scale of the systems it represents, we recommend limiting the scope to roughly these ranges:</w:t>
+        <w:t>While HYPSTAT is inherently flexible for the scope and scale of the systems it represents, we recommend limiting the scope to roughly these ranges</w:t>
+      </w:r>
+      <w:ins w:id="145" w:author="Li, Yijin" w:date="2024-12-11T12:46:00Z" w16du:dateUtc="2024-12-11T20:46:00Z">
+        <w:r>
+          <w:t xml:space="preserve"> </w:t>
+        </w:r>
+      </w:ins>
+      <w:ins w:id="146" w:author="Li, Yijin" w:date="2024-12-11T12:48:00Z" w16du:dateUtc="2024-12-11T20:48:00Z">
+        <w:r>
+          <w:t xml:space="preserve">for a single HYPSTAT run. However, multiple runs can be submitted either in parallel </w:t>
+        </w:r>
+        <w:r>
+          <w:t xml:space="preserve">or consecutively </w:t>
+        </w:r>
+        <w:r>
+          <w:t>for a comprehensive study of the desired scenarios</w:t>
+        </w:r>
+      </w:ins>
+      <w:r>
+        <w:t>:</w:t>
       </w:r>
     </w:p>
     <w:tbl>
@@ -8185,22 +9527,19 @@
       </w:r>
       <w:proofErr w:type="spellEnd"/>
       <w:r>
-        <w:t xml:space="preserve">). HYPSTAT could easily represent a smaller system, which may solve even faster. HYPSTAT could represent a larger system, but this has the potential to create very long and impractical solve times. Note that </w:t>
-      </w:r>
+        <w:t>). HYPSTAT could easily represent a smaller system, which may solve even faster. HYPSTAT could represent a larger system, but this has the potential to create very long and impractical solve times. Note that there are also many inherent design parameters of the system that can be independent of system size that may affect solve times (often related to the ease of meeting demand: for example, a system with significant flexible imports typically solves much faster than the same system when imports are restricted). Depending on these factors, a system in the above size/scope ranges could solve much faster or slower than expected.</w:t>
+      </w:r>
+    </w:p>
+    <w:p>
+      <w:pPr>
+        <w:pStyle w:val="NRELHead02Numbered"/>
+      </w:pPr>
+      <w:bookmarkStart w:id="147" w:name="_Toc179465216"/>
       <w:r>
         <w:lastRenderedPageBreak/>
-        <w:t>there are also many inherent design parameters of the system that can be independent of system size that may affect solve times (often related to the ease of meeting demand: for example, a system with significant flexible imports typically solves much faster than the same system when imports are restricted). Depending on these factors, a system in the above size/scope ranges could solve much faster or slower than expected.</w:t>
-      </w:r>
-    </w:p>
-    <w:p>
-      <w:pPr>
-        <w:pStyle w:val="NRELHead02Numbered"/>
-      </w:pPr>
-      <w:bookmarkStart w:id="56" w:name="_Toc179465216"/>
-      <w:r>
         <w:t>Workflow</w:t>
       </w:r>
-      <w:bookmarkEnd w:id="56"/>
+      <w:bookmarkEnd w:id="147"/>
     </w:p>
     <w:p>
       <w:pPr>
@@ -8230,7 +9569,7 @@
       <w:pPr>
         <w:pStyle w:val="NRELHead03Numbered"/>
       </w:pPr>
-      <w:bookmarkStart w:id="57" w:name="_Toc179465217"/>
+      <w:bookmarkStart w:id="148" w:name="_Toc179465217"/>
       <w:r>
         <w:t xml:space="preserve">Input </w:t>
       </w:r>
@@ -8240,7 +9579,7 @@
       <w:r>
         <w:t>andling</w:t>
       </w:r>
-      <w:bookmarkEnd w:id="57"/>
+      <w:bookmarkEnd w:id="148"/>
     </w:p>
     <w:p>
       <w:pPr>
@@ -8351,81 +9690,92 @@
       <w:pPr>
         <w:pStyle w:val="NRELHead03Numbered"/>
       </w:pPr>
-      <w:bookmarkStart w:id="58" w:name="_Toc179465218"/>
+      <w:bookmarkStart w:id="149" w:name="_Toc179465218"/>
+      <w:r>
+        <w:t xml:space="preserve">Model </w:t>
+      </w:r>
+      <w:r>
+        <w:t>F</w:t>
+      </w:r>
+      <w:r>
+        <w:t>ormulation</w:t>
+      </w:r>
+      <w:bookmarkEnd w:id="149"/>
+    </w:p>
+    <w:p>
+      <w:pPr>
+        <w:pStyle w:val="NRELBodyText"/>
+      </w:pPr>
+      <w:r>
+        <w:t xml:space="preserve">Model formulation is broken into two steps in HYPSTAT. First, the model loads index sets, parameters, and variables into the Pyomo optimization formulation via the </w:t>
+      </w:r>
+      <w:proofErr w:type="spellStart"/>
+      <w:r>
+        <w:t>load_model</w:t>
+      </w:r>
+      <w:proofErr w:type="spellEnd"/>
+      <w:r>
+        <w:t xml:space="preserve"> method. Next, HYPSTAT formulates the optimization problem with appropriate constraints and the objective function via the </w:t>
+      </w:r>
+      <w:proofErr w:type="spellStart"/>
+      <w:r>
+        <w:t>load_constraints</w:t>
+      </w:r>
+      <w:proofErr w:type="spellEnd"/>
+      <w:r>
+        <w:t xml:space="preserve"> method. From a high level, the constraints define the behavior of generation, production, storage, and transmission technologies based on physical principles, input constraints, and mass balances. The constraints also ensure that hydrogen </w:t>
+      </w:r>
       <w:r>
         <w:lastRenderedPageBreak/>
-        <w:t xml:space="preserve">Model </w:t>
-      </w:r>
-      <w:r>
-        <w:t>F</w:t>
-      </w:r>
-      <w:r>
-        <w:t>ormulation</w:t>
-      </w:r>
-      <w:bookmarkEnd w:id="58"/>
+        <w:t>demand is met, either rigidly or flexibly. The objective function represents the costs incurred by the system design and operation and is minimized. See the detailed model formulation for more information on the design and purpose of specific constraints and the objective function.</w:t>
+      </w:r>
+    </w:p>
+    <w:p>
+      <w:pPr>
+        <w:pStyle w:val="NRELHead03Numbered"/>
+      </w:pPr>
+      <w:bookmarkStart w:id="150" w:name="_Toc179465219"/>
+      <w:r>
+        <w:t xml:space="preserve">Solving the </w:t>
+      </w:r>
+      <w:r>
+        <w:t>M</w:t>
+      </w:r>
+      <w:r>
+        <w:t>odel</w:t>
+      </w:r>
+      <w:bookmarkEnd w:id="150"/>
     </w:p>
     <w:p>
       <w:pPr>
         <w:pStyle w:val="NRELBodyText"/>
       </w:pPr>
       <w:r>
-        <w:t xml:space="preserve">Model formulation is broken into two steps in HYPSTAT. First, the model loads index sets, parameters, and variables into the Pyomo optimization formulation via the </w:t>
+        <w:t xml:space="preserve">The model solves via the </w:t>
       </w:r>
       <w:proofErr w:type="spellStart"/>
       <w:r>
-        <w:t>load_model</w:t>
+        <w:t>solve_model</w:t>
       </w:r>
       <w:proofErr w:type="spellEnd"/>
       <w:r>
-        <w:t xml:space="preserve"> method. Next, HYPSTAT formulates the optimization problem with appropriate constraints and the objective function via the </w:t>
+        <w:t xml:space="preserve"> method. This method is passed a string identifier for the solver which determines which solver Pyomo tries to use to solve the optimization problem. Currently, only GLPK and </w:t>
       </w:r>
       <w:proofErr w:type="spellStart"/>
       <w:r>
-        <w:t>load_constraints</w:t>
+        <w:t>Gurobi</w:t>
       </w:r>
       <w:proofErr w:type="spellEnd"/>
       <w:r>
-        <w:t xml:space="preserve"> method. From a high level, the constraints define the behavior of generation, production, storage, and transmission technologies based on physical principles, input constraints, and mass balances. The constraints also ensure that hydrogen demand is met, either rigidly or flexibly. The objective function represents the costs incurred by the system design and operation and is minimized. See the detailed model formulation for more information on the design and purpose of specific constraints and the objective function.</w:t>
-      </w:r>
-    </w:p>
-    <w:p>
-      <w:pPr>
-        <w:pStyle w:val="NRELHead03Numbered"/>
-      </w:pPr>
-      <w:bookmarkStart w:id="59" w:name="_Toc179465219"/>
-      <w:r>
-        <w:t xml:space="preserve">Solving the </w:t>
-      </w:r>
-      <w:r>
-        <w:t>M</w:t>
-      </w:r>
-      <w:r>
-        <w:t>odel</w:t>
-      </w:r>
-      <w:bookmarkEnd w:id="59"/>
-    </w:p>
-    <w:p>
-      <w:pPr>
-        <w:pStyle w:val="NRELBodyText"/>
-      </w:pPr>
-      <w:r>
-        <w:t xml:space="preserve">The model solves via the </w:t>
+        <w:t xml:space="preserve"> are supported, but we encourage users to simply program their own lines or edit how the </w:t>
       </w:r>
       <w:proofErr w:type="spellStart"/>
       <w:r>
-        <w:t>solve_model</w:t>
+        <w:t>Pyomo</w:t>
       </w:r>
       <w:proofErr w:type="spellEnd"/>
       <w:r>
-        <w:t xml:space="preserve"> method. This method is passed a string identifier for the solver which determines which solver Pyomo tries to use to solve the optimization problem. Currently, only GLPK and </w:t>
-      </w:r>
-      <w:proofErr w:type="spellStart"/>
-      <w:r>
-        <w:t>Gurobi</w:t>
-      </w:r>
-      <w:proofErr w:type="spellEnd"/>
-      <w:r>
-        <w:t xml:space="preserve"> are supported, but we encourage users to simply program their own lines or edit how the Pyomo </w:t>
+        <w:t xml:space="preserve"> </w:t>
       </w:r>
       <w:proofErr w:type="spellStart"/>
       <w:r>
@@ -8559,42 +9909,42 @@
       <w:pPr>
         <w:pStyle w:val="NRELHead03Numbered"/>
       </w:pPr>
-      <w:bookmarkStart w:id="60" w:name="_Toc179465220"/>
+      <w:bookmarkStart w:id="151" w:name="_Toc179465220"/>
+      <w:r>
+        <w:t>Recommended Two-Step Solve Process</w:t>
+      </w:r>
+      <w:bookmarkEnd w:id="151"/>
+    </w:p>
+    <w:p>
+      <w:pPr>
+        <w:pStyle w:val="NRELBodyText"/>
+      </w:pPr>
+      <w:r>
+        <w:t xml:space="preserve">For scenarios where the optimal location of pipelines is an important question, we have developed a recommended methodology and streamlined approach in HYPSTAT to address this while attempting to reduce solve times. We recommend loading and solving the model twice: first using a mixed-integer optimization with </w:t>
+      </w:r>
+      <w:proofErr w:type="spellStart"/>
+      <w:r>
+        <w:t>optimize_pipelines</w:t>
+      </w:r>
+      <w:proofErr w:type="spellEnd"/>
+      <w:r>
+        <w:t xml:space="preserve"> set to True but with a coarser time resolution—e.g., daily—then using a fully linear optimization with </w:t>
+      </w:r>
+      <w:proofErr w:type="spellStart"/>
+      <w:r>
+        <w:t>optimize_pipelines</w:t>
+      </w:r>
+      <w:proofErr w:type="spellEnd"/>
+      <w:r>
+        <w:t xml:space="preserve"> set to False with a finer time resolution, e.g., 1-2 hourly. The second optimization utilizes the locations of pipelines identified in the first optimization.</w:t>
+      </w:r>
+    </w:p>
+    <w:p>
+      <w:pPr>
+        <w:pStyle w:val="NRELBodyText"/>
+      </w:pPr>
       <w:r>
         <w:lastRenderedPageBreak/>
-        <w:t>Recommended Two-Step Solve Process</w:t>
-      </w:r>
-      <w:bookmarkEnd w:id="60"/>
-    </w:p>
-    <w:p>
-      <w:pPr>
-        <w:pStyle w:val="NRELBodyText"/>
-      </w:pPr>
-      <w:r>
-        <w:t xml:space="preserve">For scenarios where the optimal location of pipelines is an important question, we have developed a recommended methodology and streamlined approach in HYPSTAT to address this while attempting to reduce solve times. We recommend loading and solving the model twice: first using a mixed-integer optimization with </w:t>
-      </w:r>
-      <w:proofErr w:type="spellStart"/>
-      <w:r>
-        <w:t>optimize_pipelines</w:t>
-      </w:r>
-      <w:proofErr w:type="spellEnd"/>
-      <w:r>
-        <w:t xml:space="preserve"> set to True but with a coarser time resolution—e.g., daily—then using a fully linear optimization with </w:t>
-      </w:r>
-      <w:proofErr w:type="spellStart"/>
-      <w:r>
-        <w:t>optimize_pipelines</w:t>
-      </w:r>
-      <w:proofErr w:type="spellEnd"/>
-      <w:r>
-        <w:t xml:space="preserve"> set to False with a finer time resolution, e.g., 1-2 hourly. The second optimization utilizes the locations of pipelines identified in the first optimization.</w:t>
-      </w:r>
-    </w:p>
-    <w:p>
-      <w:pPr>
-        <w:pStyle w:val="NRELBodyText"/>
-      </w:pPr>
-      <w:r>
         <w:t xml:space="preserve">We find this approach to be effective for several reasons. Model solve time tends to increase dramatically and in a non-linear way with model complexity: e.g., making the time resolution twice as fine (roughly doubling the size of the model) typically results in much greater than 2x solve times. So, by simplifying the first optimization to a ~daily level, we achieve a 12-24x reduction in model size which dramatically reduces solve times. On an HPC system, these systems usually solve in a </w:t>
       </w:r>
       <w:r>
@@ -8682,7 +10032,7 @@
       <w:pPr>
         <w:pStyle w:val="NRELHead03Numbered"/>
       </w:pPr>
-      <w:bookmarkStart w:id="61" w:name="_Toc179465221"/>
+      <w:bookmarkStart w:id="152" w:name="_Toc179465221"/>
       <w:r>
         <w:t xml:space="preserve">Writing </w:t>
       </w:r>
@@ -8692,7 +10042,7 @@
       <w:r>
         <w:t>utputs</w:t>
       </w:r>
-      <w:bookmarkEnd w:id="61"/>
+      <w:bookmarkEnd w:id="152"/>
     </w:p>
     <w:p>
       <w:pPr>
@@ -8730,348 +10080,340 @@
       <w:pPr>
         <w:pStyle w:val="NRELHead02Numbered"/>
       </w:pPr>
-      <w:bookmarkStart w:id="62" w:name="_Toc179465222"/>
+      <w:bookmarkStart w:id="153" w:name="_Toc179465222"/>
       <w:r>
         <w:t>Inputs</w:t>
       </w:r>
-      <w:bookmarkEnd w:id="62"/>
+      <w:bookmarkEnd w:id="153"/>
     </w:p>
     <w:p>
       <w:pPr>
         <w:pStyle w:val="NRELBodyText"/>
       </w:pPr>
       <w:r>
-        <w:t xml:space="preserve">HYPSTAT inputs are contained in a YAML file with scenario information and a set of files containing detailed inputs for costs, demand and supply profiles, and network design. We </w:t>
-      </w:r>
+        <w:t xml:space="preserve">HYPSTAT inputs are contained in a YAML file with scenario information and a set of files containing detailed inputs for costs, demand and supply profiles, and network design. We recommend organizing the input files as shown in the Sample Case Study or similar, but </w:t>
+      </w:r>
+      <w:proofErr w:type="gramStart"/>
+      <w:r>
+        <w:t>ultimately</w:t>
+      </w:r>
+      <w:proofErr w:type="gramEnd"/>
+      <w:r>
+        <w:t xml:space="preserve"> they can be organized in any way as long as the file paths are correctly specified in the YAML file.</w:t>
+      </w:r>
+    </w:p>
+    <w:p>
+      <w:pPr>
+        <w:pStyle w:val="NRELHead03Numbered"/>
+      </w:pPr>
+      <w:bookmarkStart w:id="154" w:name="_Toc179465223"/>
+      <w:r>
+        <w:t>YAML File</w:t>
+      </w:r>
+      <w:bookmarkEnd w:id="154"/>
+    </w:p>
+    <w:p>
+      <w:pPr>
+        <w:pStyle w:val="NRELBodyText"/>
+      </w:pPr>
+      <w:r>
+        <w:t>A HYPSTAT scenario is ultimately defined by a YAML file that is provided to the HYPSTAT model class to load the scenario. The YAML file specifies high level scenario parameters and contains file paths to other individual files that make up scenario inputs.</w:t>
+      </w:r>
+    </w:p>
+    <w:p>
+      <w:pPr>
+        <w:pStyle w:val="NRELBodyText"/>
+      </w:pPr>
       <w:r>
         <w:lastRenderedPageBreak/>
-        <w:t xml:space="preserve">recommend organizing the input files as shown in the Sample Case Study or similar, but </w:t>
+        <w:t>The YAML file should contain the following parameters:</w:t>
+      </w:r>
+    </w:p>
+    <w:p>
+      <w:pPr>
+        <w:pStyle w:val="NRELBullet01"/>
+      </w:pPr>
+      <w:proofErr w:type="spellStart"/>
+      <w:r>
+        <w:t>analysis_year</w:t>
+      </w:r>
+      <w:proofErr w:type="spellEnd"/>
+      <w:r>
+        <w:t xml:space="preserve"> (int): the year to be modeled. Used for ease of setting up analyses with multiple years (inputs can be formatted</w:t>
+      </w:r>
+      <w:r>
+        <w:t xml:space="preserve"> to capture multiple years instead of needing entire sets of inputs for each year).</w:t>
+      </w:r>
+    </w:p>
+    <w:p>
+      <w:pPr>
+        <w:pStyle w:val="NRELBullet01"/>
+      </w:pPr>
+      <w:r>
+        <w:t>nodes (list): the list of nodes to be considered.</w:t>
+      </w:r>
+    </w:p>
+    <w:p>
+      <w:pPr>
+        <w:pStyle w:val="NRELBullet01"/>
+      </w:pPr>
+      <w:proofErr w:type="spellStart"/>
+      <w:r>
+        <w:t>max_imports_ratio</w:t>
+      </w:r>
+      <w:proofErr w:type="spellEnd"/>
+      <w:r>
+        <w:t xml:space="preserve"> (float): the fraction of the total hydrogen demand which can be met with imports</w:t>
+      </w:r>
+    </w:p>
+    <w:p>
+      <w:pPr>
+        <w:pStyle w:val="NRELBullet01"/>
+      </w:pPr>
+      <w:proofErr w:type="spellStart"/>
+      <w:r>
+        <w:t>import_nodes</w:t>
+      </w:r>
+      <w:proofErr w:type="spellEnd"/>
+      <w:r>
+        <w:t xml:space="preserve"> (list): the</w:t>
+      </w:r>
+      <w:r>
+        <w:t xml:space="preserve"> list of nodes which are allowed to import hydrogen</w:t>
+      </w:r>
+    </w:p>
+    <w:p>
+      <w:pPr>
+        <w:pStyle w:val="NRELBullet01"/>
+      </w:pPr>
+      <w:proofErr w:type="spellStart"/>
+      <w:r>
+        <w:t>min_exports_ratio</w:t>
+      </w:r>
+      <w:proofErr w:type="spellEnd"/>
+      <w:r>
+        <w:t xml:space="preserve"> (float): the minimum amount of hydrogen that must be exported, as a fraction of total demand (exports are additive to demand and not considered part of demand, i.e., they can be met flexibly at any time)</w:t>
+      </w:r>
+    </w:p>
+    <w:p>
+      <w:pPr>
+        <w:pStyle w:val="NRELBullet01"/>
+      </w:pPr>
+      <w:proofErr w:type="spellStart"/>
+      <w:r>
+        <w:t>export_nodes</w:t>
+      </w:r>
+      <w:proofErr w:type="spellEnd"/>
+      <w:r>
+        <w:t xml:space="preserve"> (list): the list of nodes which are allowed to export hydrogen</w:t>
+      </w:r>
+    </w:p>
+    <w:p>
+      <w:pPr>
+        <w:pStyle w:val="NRELBullet01"/>
+      </w:pPr>
+      <w:proofErr w:type="spellStart"/>
+      <w:r>
+        <w:t>overserved_cost</w:t>
+      </w:r>
+      <w:proofErr w:type="spellEnd"/>
+      <w:r>
+        <w:t xml:space="preserve"> (int or float): the cost per kg of overserved hydrogen</w:t>
+      </w:r>
+    </w:p>
+    <w:p>
+      <w:pPr>
+        <w:pStyle w:val="NRELBullet01"/>
+      </w:pPr>
+      <w:proofErr w:type="spellStart"/>
+      <w:r>
+        <w:t>unserved_cost</w:t>
+      </w:r>
+      <w:proofErr w:type="spellEnd"/>
+      <w:r>
+        <w:t xml:space="preserve"> (int or float): the cost per kg of unserved hydrogen</w:t>
+      </w:r>
+    </w:p>
+    <w:p>
+      <w:pPr>
+        <w:pStyle w:val="NRELBullet01"/>
+      </w:pPr>
+      <w:r>
+        <w:t>start (str in the format ‘D MMM’): the start date for the analysis window</w:t>
+      </w:r>
+    </w:p>
+    <w:p>
+      <w:pPr>
+        <w:pStyle w:val="NRELBullet01"/>
+      </w:pPr>
+      <w:r>
+        <w:t>end (str in the format 'D MMM’): the end date for the analysis window</w:t>
+      </w:r>
+    </w:p>
+    <w:p>
+      <w:pPr>
+        <w:pStyle w:val="NRELBullet01"/>
+      </w:pPr>
+      <w:proofErr w:type="spellStart"/>
+      <w:r>
+        <w:t>coarse_resolution</w:t>
+      </w:r>
+      <w:proofErr w:type="spellEnd"/>
+      <w:r>
+        <w:t xml:space="preserve"> (int): the time resolution in hours for a run in which pipelines are optimized with binary variables</w:t>
+      </w:r>
+    </w:p>
+    <w:p>
+      <w:pPr>
+        <w:pStyle w:val="NRELBullet01"/>
+      </w:pPr>
+      <w:proofErr w:type="spellStart"/>
+      <w:r>
+        <w:t>fine_resolution</w:t>
+      </w:r>
+      <w:proofErr w:type="spellEnd"/>
+      <w:r>
+        <w:t xml:space="preserve"> (int): the time resolution in hours for a </w:t>
       </w:r>
       <w:proofErr w:type="gramStart"/>
       <w:r>
-        <w:t>ultimately</w:t>
+        <w:t>run in</w:t>
       </w:r>
       <w:proofErr w:type="gramEnd"/>
       <w:r>
-        <w:t xml:space="preserve"> they can be organized in any way as long as the file paths are correctly specified in the YAML file.</w:t>
+        <w:t xml:space="preserve"> which pipeline locations are not optimized and the model is fully linear</w:t>
+      </w:r>
+    </w:p>
+    <w:p>
+      <w:pPr>
+        <w:pStyle w:val="NRELBodyText"/>
+      </w:pPr>
+      <w:r>
+        <w:t xml:space="preserve">Two </w:t>
+      </w:r>
+      <w:proofErr w:type="gramStart"/>
+      <w:r>
+        <w:t>particular parameters</w:t>
+      </w:r>
+      <w:proofErr w:type="gramEnd"/>
+      <w:r>
+        <w:t xml:space="preserve"> of note are </w:t>
+      </w:r>
+      <w:proofErr w:type="spellStart"/>
+      <w:r>
+        <w:t>unserved_cost</w:t>
+      </w:r>
+      <w:proofErr w:type="spellEnd"/>
+      <w:r>
+        <w:t xml:space="preserve"> and </w:t>
+      </w:r>
+      <w:proofErr w:type="spellStart"/>
+      <w:r>
+        <w:t>overserved_cost</w:t>
+      </w:r>
+      <w:proofErr w:type="spellEnd"/>
+      <w:r>
+        <w:t xml:space="preserve">. </w:t>
+      </w:r>
+      <w:r>
+        <w:t>We recommend giving unserved hydrogen a very high cost (e.g., $1,000/kg). This is essentially a modeling tool to prevent infeasibility in the model, but at such a cost unserved hydrogen should never be used by the model to close the mass balance unless it is impossible otherwise. Overserved hydrogen is also given a cost—for example, an approximation of the cost of storing excess hydrogen—which should in almost all cases prevent the model from using it, since it should have the option to simply curtail electricity for free. For advanced use of the model, the costs for unserved and overserved hydrogen could be adjusted (or even made negative to give a value to overserved hydrogen) to test system dynamics such as how much excess capacity might be worth building, or how expensive it is to meet certain hydrogen demands.</w:t>
+      </w:r>
+    </w:p>
+    <w:p>
+      <w:pPr>
+        <w:pStyle w:val="NRELBodyText"/>
+      </w:pPr>
+      <w:r>
+        <w:t>The YAML file may also contain:</w:t>
+      </w:r>
+    </w:p>
+    <w:p>
+      <w:pPr>
+        <w:pStyle w:val="NRELBullet01"/>
+      </w:pPr>
+      <w:proofErr w:type="spellStart"/>
+      <w:r>
+        <w:t>gen_techs</w:t>
+      </w:r>
+      <w:proofErr w:type="spellEnd"/>
+      <w:r>
+        <w:t xml:space="preserve"> (list): the list of electricity generation technologies to be considered</w:t>
+      </w:r>
+    </w:p>
+    <w:p>
+      <w:pPr>
+        <w:pStyle w:val="NRELBullet01"/>
+      </w:pPr>
+      <w:proofErr w:type="spellStart"/>
+      <w:r>
+        <w:t>stor_</w:t>
+      </w:r>
+      <w:proofErr w:type="gramStart"/>
+      <w:r>
+        <w:t>techs</w:t>
+      </w:r>
+      <w:proofErr w:type="spellEnd"/>
+      <w:r>
+        <w:t>( list</w:t>
+      </w:r>
+      <w:proofErr w:type="gramEnd"/>
+      <w:r>
+        <w:t>): the list of hydrogen storage technologies to be considered</w:t>
+      </w:r>
+    </w:p>
+    <w:p>
+      <w:pPr>
+        <w:pStyle w:val="NRELBodyText"/>
+      </w:pPr>
+      <w:r>
+        <w:t>If these are not included in the YAML file, they will be inferred from cost input files.</w:t>
+      </w:r>
+    </w:p>
+    <w:p>
+      <w:pPr>
+        <w:pStyle w:val="NRELBodyText"/>
+      </w:pPr>
+      <w:r>
+        <w:t>Lastly, the YAML contains the file or folder paths for the other necessary inputs, specified in the next section.</w:t>
       </w:r>
     </w:p>
     <w:p>
       <w:pPr>
         <w:pStyle w:val="NRELHead03Numbered"/>
       </w:pPr>
-      <w:bookmarkStart w:id="63" w:name="_Toc179465223"/>
-      <w:r>
-        <w:t>YAML File</w:t>
-      </w:r>
-      <w:bookmarkEnd w:id="63"/>
+      <w:bookmarkStart w:id="155" w:name="_Toc179465224"/>
+      <w:r>
+        <w:t xml:space="preserve">Individual </w:t>
+      </w:r>
+      <w:r>
+        <w:t>I</w:t>
+      </w:r>
+      <w:r>
+        <w:t xml:space="preserve">nput </w:t>
+      </w:r>
+      <w:r>
+        <w:t>F</w:t>
+      </w:r>
+      <w:r>
+        <w:t>iles</w:t>
+      </w:r>
+      <w:bookmarkEnd w:id="155"/>
     </w:p>
     <w:p>
       <w:pPr>
         <w:pStyle w:val="NRELBodyText"/>
       </w:pPr>
-      <w:r>
-        <w:t>A HYPSTAT scenario is ultimately defined by a YAML file that is provided to the HYPSTAT model class to load the scenario. The YAML file specifies high level scenario parameters and contains file paths to other individual files that make up scenario inputs.</w:t>
-      </w:r>
-    </w:p>
-    <w:p>
-      <w:pPr>
-        <w:pStyle w:val="NRELBodyText"/>
-      </w:pPr>
-      <w:r>
-        <w:t>The YAML file should contain the following parameters:</w:t>
-      </w:r>
-    </w:p>
-    <w:p>
-      <w:pPr>
-        <w:pStyle w:val="NRELBullet01"/>
-      </w:pPr>
-      <w:proofErr w:type="spellStart"/>
-      <w:r>
-        <w:t>analysis_year</w:t>
-      </w:r>
-      <w:proofErr w:type="spellEnd"/>
-      <w:r>
-        <w:t xml:space="preserve"> (int): the year to be modeled. Used for ease of setting up analyses with multiple years (inputs can be formatted</w:t>
-      </w:r>
-      <w:r>
-        <w:t xml:space="preserve"> to capture multiple years instead of needing entire sets of inputs for each year).</w:t>
-      </w:r>
-    </w:p>
-    <w:p>
-      <w:pPr>
-        <w:pStyle w:val="NRELBullet01"/>
-      </w:pPr>
-      <w:r>
-        <w:t>nodes (list): the list of nodes to be considered.</w:t>
-      </w:r>
-    </w:p>
-    <w:p>
-      <w:pPr>
-        <w:pStyle w:val="NRELBullet01"/>
-      </w:pPr>
-      <w:proofErr w:type="spellStart"/>
-      <w:r>
-        <w:t>max_imports_ratio</w:t>
-      </w:r>
-      <w:proofErr w:type="spellEnd"/>
-      <w:r>
-        <w:t xml:space="preserve"> (float): the fraction of the total hydrogen demand which can be met with imports</w:t>
-      </w:r>
-    </w:p>
-    <w:p>
-      <w:pPr>
-        <w:pStyle w:val="NRELBullet01"/>
-      </w:pPr>
-      <w:proofErr w:type="spellStart"/>
-      <w:r>
-        <w:t>import_nodes</w:t>
-      </w:r>
-      <w:proofErr w:type="spellEnd"/>
-      <w:r>
-        <w:t xml:space="preserve"> (list): the</w:t>
-      </w:r>
-      <w:r>
-        <w:t xml:space="preserve"> list of nodes which are allowed to import hydrogen</w:t>
-      </w:r>
-    </w:p>
-    <w:p>
-      <w:pPr>
-        <w:pStyle w:val="NRELBullet01"/>
-      </w:pPr>
-      <w:proofErr w:type="spellStart"/>
-      <w:r>
-        <w:t>min_exports_ratio</w:t>
-      </w:r>
-      <w:proofErr w:type="spellEnd"/>
-      <w:r>
-        <w:t xml:space="preserve"> (float): the minimum amount of hydrogen that must be exported, as a fraction of total demand (exports are additive to demand and not considered part of demand, i.e., they can be met flexibly at any time)</w:t>
-      </w:r>
-    </w:p>
-    <w:p>
-      <w:pPr>
-        <w:pStyle w:val="NRELBullet01"/>
-      </w:pPr>
-      <w:proofErr w:type="spellStart"/>
-      <w:r>
-        <w:t>export_nodes</w:t>
-      </w:r>
-      <w:proofErr w:type="spellEnd"/>
-      <w:r>
-        <w:t xml:space="preserve"> (list): the list of nodes which are allowed to export hydrogen</w:t>
-      </w:r>
-    </w:p>
-    <w:p>
-      <w:pPr>
-        <w:pStyle w:val="NRELBullet01"/>
-      </w:pPr>
-      <w:proofErr w:type="spellStart"/>
-      <w:r>
-        <w:t>overserved_cost</w:t>
-      </w:r>
-      <w:proofErr w:type="spellEnd"/>
-      <w:r>
-        <w:t xml:space="preserve"> (int or float): the cost per kg of overserved hydrogen</w:t>
-      </w:r>
-    </w:p>
-    <w:p>
-      <w:pPr>
-        <w:pStyle w:val="NRELBullet01"/>
-      </w:pPr>
-      <w:proofErr w:type="spellStart"/>
-      <w:r>
-        <w:t>unserved_cost</w:t>
-      </w:r>
-      <w:proofErr w:type="spellEnd"/>
-      <w:r>
-        <w:t xml:space="preserve"> (int or float): the cost per kg of unserved hydrogen</w:t>
-      </w:r>
-    </w:p>
-    <w:p>
-      <w:pPr>
-        <w:pStyle w:val="NRELBullet01"/>
-      </w:pPr>
-      <w:r>
-        <w:t>start (str in the format ‘D MMM’): the start date for the analysis window</w:t>
-      </w:r>
-    </w:p>
-    <w:p>
-      <w:pPr>
-        <w:pStyle w:val="NRELBullet01"/>
-      </w:pPr>
-      <w:r>
-        <w:t>end (str in the format 'D MMM’): the end date for the analysis window</w:t>
-      </w:r>
-    </w:p>
-    <w:p>
-      <w:pPr>
-        <w:pStyle w:val="NRELBullet01"/>
-      </w:pPr>
-      <w:proofErr w:type="spellStart"/>
-      <w:r>
-        <w:t>coarse_resolution</w:t>
-      </w:r>
-      <w:proofErr w:type="spellEnd"/>
-      <w:r>
-        <w:t xml:space="preserve"> (int): the time resolution in hours for a </w:t>
-      </w:r>
       <w:proofErr w:type="gramStart"/>
       <w:r>
-        <w:t>run in</w:t>
+        <w:t>The majority of</w:t>
       </w:r>
       <w:proofErr w:type="gramEnd"/>
       <w:r>
-        <w:t xml:space="preserve"> which pipelines are optimized with binary variables</w:t>
-      </w:r>
-    </w:p>
-    <w:p>
-      <w:pPr>
-        <w:pStyle w:val="NRELBullet01"/>
-      </w:pPr>
-      <w:proofErr w:type="spellStart"/>
-      <w:r>
-        <w:t>fine_resolution</w:t>
-      </w:r>
-      <w:proofErr w:type="spellEnd"/>
-      <w:r>
-        <w:t xml:space="preserve"> (int): the time resolution in hours for a </w:t>
-      </w:r>
-      <w:proofErr w:type="gramStart"/>
-      <w:r>
-        <w:t>run in</w:t>
-      </w:r>
-      <w:proofErr w:type="gramEnd"/>
-      <w:r>
-        <w:t xml:space="preserve"> which pipeline locations are not optimized and the model is fully linear</w:t>
-      </w:r>
-    </w:p>
-    <w:p>
-      <w:pPr>
-        <w:pStyle w:val="NRELBodyText"/>
-      </w:pPr>
-      <w:r>
-        <w:t xml:space="preserve">Two </w:t>
-      </w:r>
-      <w:proofErr w:type="gramStart"/>
-      <w:r>
-        <w:t>particular parameters</w:t>
-      </w:r>
-      <w:proofErr w:type="gramEnd"/>
-      <w:r>
-        <w:t xml:space="preserve"> of note are </w:t>
-      </w:r>
-      <w:proofErr w:type="spellStart"/>
-      <w:r>
-        <w:t>unserved_cost</w:t>
-      </w:r>
-      <w:proofErr w:type="spellEnd"/>
-      <w:r>
-        <w:t xml:space="preserve"> and </w:t>
-      </w:r>
-      <w:proofErr w:type="spellStart"/>
-      <w:r>
-        <w:t>overserved_cost</w:t>
-      </w:r>
-      <w:proofErr w:type="spellEnd"/>
-      <w:r>
-        <w:t xml:space="preserve">. </w:t>
-      </w:r>
-      <w:r>
-        <w:t>We recommend giving unserved hydrogen a very high cost (e.g., $1,000/kg). This is essentially a modeling tool to prevent infeasibility in the model, but at such a cost unserved hydrogen should never be used by the model to close the mass balance unless it is impossible otherwise. Overserved hydrogen is also given a cost—for example, an approximation of the cost of storing excess hydrogen—which should in almost all cases prevent the model from using it, since it should have the option to simply curtail electricity for free. For advanced use of the model, the costs for unserved and overserved hydrogen could be adjusted (or even made negative to give a value to overserved hydrogen) to test system dynamics such as how much excess capacity might be worth building, or how expensive it is to meet certain hydrogen demands.</w:t>
-      </w:r>
-    </w:p>
-    <w:p>
-      <w:pPr>
-        <w:pStyle w:val="NRELBodyText"/>
-      </w:pPr>
-      <w:r>
-        <w:t>The YAML file may also contain:</w:t>
-      </w:r>
-    </w:p>
-    <w:p>
-      <w:pPr>
-        <w:pStyle w:val="NRELBullet01"/>
-      </w:pPr>
-      <w:proofErr w:type="spellStart"/>
-      <w:r>
-        <w:t>gen_techs</w:t>
-      </w:r>
-      <w:proofErr w:type="spellEnd"/>
-      <w:r>
-        <w:t xml:space="preserve"> (list): the list of electricity generation technologies to be considered</w:t>
-      </w:r>
-    </w:p>
-    <w:p>
-      <w:pPr>
-        <w:pStyle w:val="NRELBullet01"/>
-      </w:pPr>
-      <w:proofErr w:type="spellStart"/>
-      <w:r>
-        <w:t>stor_</w:t>
-      </w:r>
-      <w:proofErr w:type="gramStart"/>
-      <w:r>
-        <w:t>techs</w:t>
-      </w:r>
-      <w:proofErr w:type="spellEnd"/>
-      <w:r>
-        <w:t>( list</w:t>
-      </w:r>
-      <w:proofErr w:type="gramEnd"/>
-      <w:r>
-        <w:t>): the list of hydrogen storage technologies to be considered</w:t>
-      </w:r>
-    </w:p>
-    <w:p>
-      <w:pPr>
-        <w:pStyle w:val="NRELBodyText"/>
-      </w:pPr>
+        <w:t xml:space="preserve"> inputs are noted in a set of files, described below, which the YAML file references. Note that many files (e.g., for cost inputs) contain a column for year. HYPSTAT can </w:t>
+      </w:r>
       <w:r>
         <w:lastRenderedPageBreak/>
-        <w:t>If these are not included in the YAML file, they will be inferred from cost input files.</w:t>
-      </w:r>
-    </w:p>
-    <w:p>
-      <w:pPr>
-        <w:pStyle w:val="NRELBodyText"/>
-      </w:pPr>
-      <w:r>
-        <w:t>Lastly, the YAML contains the file or folder paths for the other necessary inputs, specified in the next section.</w:t>
-      </w:r>
-    </w:p>
-    <w:p>
-      <w:pPr>
-        <w:pStyle w:val="NRELHead03Numbered"/>
-      </w:pPr>
-      <w:bookmarkStart w:id="64" w:name="_Toc179465224"/>
-      <w:r>
-        <w:t xml:space="preserve">Individual </w:t>
-      </w:r>
-      <w:r>
-        <w:t>I</w:t>
-      </w:r>
-      <w:r>
-        <w:t xml:space="preserve">nput </w:t>
-      </w:r>
-      <w:r>
-        <w:t>F</w:t>
-      </w:r>
-      <w:r>
-        <w:t>iles</w:t>
-      </w:r>
-      <w:bookmarkEnd w:id="64"/>
-    </w:p>
-    <w:p>
-      <w:pPr>
-        <w:pStyle w:val="NRELBodyText"/>
-      </w:pPr>
-      <w:proofErr w:type="gramStart"/>
-      <w:r>
-        <w:t>The majority of</w:t>
-      </w:r>
-      <w:proofErr w:type="gramEnd"/>
-      <w:r>
-        <w:t xml:space="preserve"> inputs are noted in a set of files, described below, which the YAML file references. Note that many files (e.g., for cost inputs) contain a column for year. HYPSTAT can only solve for one year at a time, but the year column is included so that scenario analyses can be designed and run for several years with only one set of input files.</w:t>
+        <w:t>only solve for one year at a time, but the year column is included so that scenario analyses can be designed and run for several years with only one set of input files.</w:t>
       </w:r>
     </w:p>
     <w:p>
@@ -10244,27 +11586,30 @@
         <w:pStyle w:val="NRELHead05"/>
       </w:pPr>
       <w:r>
+        <w:t>Network file</w:t>
+      </w:r>
+    </w:p>
+    <w:p>
+      <w:pPr>
+        <w:pStyle w:val="NRELBodyText"/>
+      </w:pPr>
+      <w:r>
+        <w:t>T</w:t>
+      </w:r>
+      <w:r>
+        <w:t>he network file is one of the more complex input files, specified with the ‘</w:t>
+      </w:r>
+      <w:proofErr w:type="spellStart"/>
+      <w:r>
+        <w:t>NetworkFile</w:t>
+      </w:r>
+      <w:proofErr w:type="spellEnd"/>
+      <w:r>
+        <w:t xml:space="preserve">’ field. It specifies potential links between nodes, which transmission technologies are allowed, maximum capacities for each link and technology, and distances between links for each transmission technology. It should be formatted as shown below. Note that the link distances here are only used to calculate costs based on per-km cost inputs for truck and pipeline transmission. This is to facilitate easy set-up with actual network distances. However, distances can also be used to scale transmission costs for different links (e.g., if a particular pipeline link is more expensive due to difficult terrain, the user could artificially increase its pipeline distance). A note about link </w:t>
+      </w:r>
+      <w:r>
         <w:lastRenderedPageBreak/>
-        <w:t>Network file</w:t>
-      </w:r>
-    </w:p>
-    <w:p>
-      <w:pPr>
-        <w:pStyle w:val="NRELBodyText"/>
-      </w:pPr>
-      <w:r>
-        <w:t>T</w:t>
-      </w:r>
-      <w:r>
-        <w:t>he network file is one of the more complex input files, specified with the ‘</w:t>
-      </w:r>
-      <w:proofErr w:type="spellStart"/>
-      <w:r>
-        <w:t>NetworkFile</w:t>
-      </w:r>
-      <w:proofErr w:type="spellEnd"/>
-      <w:r>
-        <w:t xml:space="preserve">’ field. It specifies potential links between nodes, which transmission technologies are allowed, maximum capacities for each link and technology, and distances between links for each transmission technology. It should be formatted as shown below. Note that the link distances here are only used to calculate costs based on per-km cost inputs for truck and pipeline transmission. This is to facilitate easy set-up with actual network distances. However, distances can also be used to scale transmission costs for different links (e.g., if a particular pipeline link is more expensive due to difficult terrain, the user could artificially increase its pipeline distance). A note about link names: links are referred to by strings denoting which nodes they connect, e.g., ‘A to B’. The model by default uses the separator </w:t>
+        <w:t xml:space="preserve">names: links are referred to by strings denoting which nodes they connect, e.g., ‘A to B’. The model by default uses the separator </w:t>
       </w:r>
       <w:proofErr w:type="gramStart"/>
       <w:r>
@@ -11777,7 +13122,6 @@
                 <w:sz w:val="20"/>
                 <w:szCs w:val="20"/>
               </w:rPr>
-              <w:lastRenderedPageBreak/>
               <w:t>…</w:t>
             </w:r>
           </w:p>
@@ -11906,7 +13250,11 @@
       </w:r>
       <w:proofErr w:type="spellEnd"/>
       <w:r>
-        <w:t>’ fields. They should be formatted as shown below. HYPSTAT supports different cost inputs for different nodes, or the node column can simply read ‘All’ to be applied to all nodes. If a cost is specified for ‘All’ nodes and then also for any number of specific nodes, the cost for ‘All’ will be applied to any non-specified nodes and the specific nodal costs in the file will be used for those nodes only.</w:t>
+        <w:t xml:space="preserve">’ fields. They should be formatted as shown below. HYPSTAT supports different cost inputs for different nodes, or the node column can simply read ‘All’ to be applied to all nodes. If a cost is specified for ‘All’ nodes and then also for any number of specific </w:t>
+      </w:r>
+      <w:r>
+        <w:lastRenderedPageBreak/>
+        <w:t>nodes, the cost for ‘All’ will be applied to any non-specified nodes and the specific nodal costs in the file will be used for those nodes only.</w:t>
       </w:r>
     </w:p>
     <w:p>
@@ -13107,7 +14455,6 @@
                 <w:sz w:val="20"/>
                 <w:szCs w:val="20"/>
               </w:rPr>
-              <w:lastRenderedPageBreak/>
               <w:t>0</w:t>
             </w:r>
           </w:p>
@@ -13357,7 +14704,11 @@
       </w:r>
       <w:proofErr w:type="spellEnd"/>
       <w:r>
-        <w:t>’ field. For now, the inputs must be referred to as ‘Pipeline’ and ‘Truck’ and do not support alternative costs for different links. (We recommend using scaled link distances to represent different costs for different links.) The costs are treated differently for pipelines and trucks but are considered in the same file, so they should be formatted as shown below. Most of the fields are irrelevant for trucks and should read ‘N/A’; the LCOT field is irrelevant for pipelines and should read ‘N/A’.</w:t>
+        <w:t xml:space="preserve">’ field. For now, the inputs must be referred to as ‘Pipeline’ and ‘Truck’ and do not support alternative </w:t>
+      </w:r>
+      <w:r>
+        <w:lastRenderedPageBreak/>
+        <w:t>costs for different links. (We recommend using scaled link distances to represent different costs for different links.) The costs are treated differently for pipelines and trucks but are considered in the same file, so they should be formatted as shown below. Most of the fields are irrelevant for trucks and should read ‘N/A’; the LCOT field is irrelevant for pipelines and should read ‘N/A’.</w:t>
       </w:r>
     </w:p>
     <w:tbl>
@@ -15079,7 +16430,6 @@
         <w:pStyle w:val="NRELHead05"/>
       </w:pPr>
       <w:r>
-        <w:lastRenderedPageBreak/>
         <w:t>Incentives</w:t>
       </w:r>
     </w:p>
@@ -15143,6 +16493,7 @@
                 <w:sz w:val="20"/>
                 <w:szCs w:val="20"/>
               </w:rPr>
+              <w:lastRenderedPageBreak/>
               <w:t>Year</w:t>
             </w:r>
           </w:p>
@@ -15648,11 +16999,11 @@
       <w:pPr>
         <w:pStyle w:val="NRELHead02Numbered"/>
       </w:pPr>
-      <w:bookmarkStart w:id="65" w:name="_Toc179465225"/>
+      <w:bookmarkStart w:id="156" w:name="_Toc179465225"/>
       <w:r>
         <w:t>Outputs</w:t>
       </w:r>
-      <w:bookmarkEnd w:id="65"/>
+      <w:bookmarkEnd w:id="156"/>
     </w:p>
     <w:p>
       <w:pPr>
@@ -15669,11 +17020,11 @@
       <w:pPr>
         <w:pStyle w:val="NRELHead03Numbered"/>
       </w:pPr>
-      <w:bookmarkStart w:id="66" w:name="_Toc179465226"/>
+      <w:bookmarkStart w:id="157" w:name="_Toc179465226"/>
       <w:r>
         <w:t>Output Files</w:t>
       </w:r>
-      <w:bookmarkEnd w:id="66"/>
+      <w:bookmarkEnd w:id="157"/>
     </w:p>
     <w:p>
       <w:pPr>
@@ -16062,16 +17413,7 @@
                 <w:sz w:val="20"/>
                 <w:szCs w:val="20"/>
               </w:rPr>
-              <w:t xml:space="preserve">obj: The resulting value of the objective function. It is not recommended to use the value of the objective function as representative of costs; rather, the objective value can be useful when debugging or comparing </w:t>
-            </w:r>
-            <w:r>
-              <w:rPr>
-                <w:rFonts w:ascii="Arial" w:hAnsi="Arial" w:cs="Arial"/>
-                <w:sz w:val="20"/>
-                <w:szCs w:val="20"/>
-              </w:rPr>
-              <w:lastRenderedPageBreak/>
-              <w:t>scenarios, especially different model runs which should yield the same or similar results.</w:t>
+              <w:t>obj: The resulting value of the objective function. It is not recommended to use the value of the objective function as representative of costs; rather, the objective value can be useful when debugging or comparing scenarios, especially different model runs which should yield the same or similar results.</w:t>
             </w:r>
           </w:p>
         </w:tc>
@@ -16261,6 +17603,7 @@
                 <w:sz w:val="20"/>
                 <w:szCs w:val="20"/>
               </w:rPr>
+              <w:lastRenderedPageBreak/>
               <w:t>Renewable_Capacity.csv</w:t>
             </w:r>
           </w:p>
@@ -17111,7 +18454,6 @@
                 <w:sz w:val="20"/>
                 <w:szCs w:val="20"/>
               </w:rPr>
-              <w:lastRenderedPageBreak/>
               <w:t>Renewable_Production_raw.csv</w:t>
             </w:r>
           </w:p>
@@ -17304,6 +18646,7 @@
                 <w:sz w:val="20"/>
                 <w:szCs w:val="20"/>
               </w:rPr>
+              <w:lastRenderedPageBreak/>
               <w:t>Storage_Level.csv</w:t>
             </w:r>
           </w:p>
@@ -17441,11 +18784,11 @@
       <w:pPr>
         <w:pStyle w:val="NRELHead03Numbered"/>
       </w:pPr>
-      <w:bookmarkStart w:id="67" w:name="_Toc179465227"/>
+      <w:bookmarkStart w:id="158" w:name="_Toc179465227"/>
       <w:r>
         <w:t>Suggested use of outputs</w:t>
       </w:r>
-      <w:bookmarkEnd w:id="67"/>
+      <w:bookmarkEnd w:id="158"/>
     </w:p>
     <w:p>
       <w:pPr>
@@ -17564,7 +18907,6 @@
         <w:contextualSpacing w:val="0"/>
       </w:pPr>
       <w:r>
-        <w:lastRenderedPageBreak/>
         <w:t>Consider the profiles for hydrogen storage charging and hydrogen storage levels. Is storage used significantly, and on what time scales are each storage technologies primarily used (e.g., hourly, daily, weekly, seasonal)?</w:t>
       </w:r>
     </w:p>
@@ -17586,7 +18928,11 @@
         <w:pStyle w:val="NRELBodyText"/>
       </w:pPr>
       <w:r>
-        <w:t>It can also be useful to use outputs from HYPSTAT to estimate system costs. We recommend using capacity outputs to calculate capital and fixed operating costs. Relevant operating outputs can be used to calculate variable operating costs. We recommend dividing these costs over amounts of hydrogen produced to estimate levelized costs for the whole system or at a nodal level. It can be insightful to look at how different technologies or value-chain steps (production, transmission, storage) contribute to levelized hydrogen costs.</w:t>
+        <w:t xml:space="preserve">It can also be useful to use outputs from HYPSTAT to estimate system costs. We recommend using capacity outputs to calculate capital and fixed operating costs. Relevant operating outputs can be used to calculate variable operating costs. We recommend dividing these costs over </w:t>
+      </w:r>
+      <w:r>
+        <w:lastRenderedPageBreak/>
+        <w:t>amounts of hydrogen produced to estimate levelized costs for the whole system or at a nodal level. It can be insightful to look at how different technologies or value-chain steps (production, transmission, storage) contribute to levelized hydrogen costs.</w:t>
       </w:r>
     </w:p>
     <w:p>
@@ -17625,16 +18971,16 @@
       <w:pPr>
         <w:pStyle w:val="NRELHead01Numbered"/>
       </w:pPr>
-      <w:bookmarkStart w:id="68" w:name="_Toc100058849"/>
-      <w:bookmarkStart w:id="69" w:name="_Toc100827778"/>
-      <w:bookmarkStart w:id="70" w:name="_Toc179465228"/>
-      <w:bookmarkEnd w:id="68"/>
-      <w:bookmarkEnd w:id="69"/>
+      <w:bookmarkStart w:id="159" w:name="_Toc100058849"/>
+      <w:bookmarkStart w:id="160" w:name="_Toc100827778"/>
+      <w:bookmarkStart w:id="161" w:name="_Toc179465228"/>
+      <w:bookmarkEnd w:id="159"/>
+      <w:bookmarkEnd w:id="160"/>
       <w:r>
         <w:lastRenderedPageBreak/>
         <w:t>A Simple Case Study</w:t>
       </w:r>
-      <w:bookmarkEnd w:id="70"/>
+      <w:bookmarkEnd w:id="161"/>
     </w:p>
     <w:p>
       <w:pPr>
@@ -17697,21 +19043,21 @@
       <w:pPr>
         <w:pStyle w:val="NRELHead02Numbered"/>
       </w:pPr>
-      <w:bookmarkStart w:id="71" w:name="_Toc179465229"/>
+      <w:bookmarkStart w:id="162" w:name="_Toc179465229"/>
       <w:r>
         <w:t>Case Design</w:t>
       </w:r>
-      <w:bookmarkEnd w:id="71"/>
+      <w:bookmarkEnd w:id="162"/>
     </w:p>
     <w:p>
       <w:pPr>
         <w:pStyle w:val="NRELHead03Numbered"/>
       </w:pPr>
-      <w:bookmarkStart w:id="72" w:name="_Toc179465230"/>
+      <w:bookmarkStart w:id="163" w:name="_Toc179465230"/>
       <w:r>
         <w:t>Nodes and Network</w:t>
       </w:r>
-      <w:bookmarkEnd w:id="72"/>
+      <w:bookmarkEnd w:id="163"/>
     </w:p>
     <w:p>
       <w:pPr>
@@ -19955,7 +21301,7 @@
                     <pic:cNvPicPr/>
                   </pic:nvPicPr>
                   <pic:blipFill rotWithShape="1">
-                    <a:blip r:embed="rId19"/>
+                    <a:blip r:embed="rId23"/>
                     <a:srcRect l="4800" t="2783" r="5867" b="1739"/>
                     <a:stretch/>
                   </pic:blipFill>
@@ -20110,7 +21456,7 @@
       <w:pPr>
         <w:pStyle w:val="NRELHead03Numbered"/>
       </w:pPr>
-      <w:bookmarkStart w:id="73" w:name="_Toc179465231"/>
+      <w:bookmarkStart w:id="164" w:name="_Toc179465231"/>
       <w:r>
         <w:lastRenderedPageBreak/>
         <w:t>Technologies and Cost Reference</w:t>
@@ -20118,7 +21464,7 @@
       <w:r>
         <w:t>s</w:t>
       </w:r>
-      <w:bookmarkEnd w:id="73"/>
+      <w:bookmarkEnd w:id="164"/>
     </w:p>
     <w:p>
       <w:pPr>
@@ -20350,16 +21696,16 @@
             <w:hideMark/>
           </w:tcPr>
           <w:p>
-            <w:commentRangeStart w:id="74"/>
+            <w:commentRangeStart w:id="165"/>
             <w:r>
               <w:t>LCOE from H2@Scale</w:t>
             </w:r>
-            <w:commentRangeEnd w:id="74"/>
+            <w:commentRangeEnd w:id="165"/>
             <w:r>
               <w:rPr>
                 <w:rStyle w:val="CommentReference"/>
               </w:rPr>
-              <w:commentReference w:id="74"/>
+              <w:commentReference w:id="165"/>
             </w:r>
           </w:p>
         </w:tc>
@@ -20662,7 +22008,7 @@
       <w:pPr>
         <w:pStyle w:val="NRELHead02Numbered"/>
       </w:pPr>
-      <w:bookmarkStart w:id="75" w:name="_Toc179465232"/>
+      <w:bookmarkStart w:id="166" w:name="_Toc179465232"/>
       <w:r>
         <w:t xml:space="preserve">Potential Considerations for </w:t>
       </w:r>
@@ -20672,13 +22018,13 @@
       <w:r>
         <w:t xml:space="preserve"> Processing</w:t>
       </w:r>
-      <w:bookmarkEnd w:id="75"/>
+      <w:bookmarkEnd w:id="166"/>
     </w:p>
     <w:p>
       <w:pPr>
         <w:pStyle w:val="NRELHead03Numbered"/>
       </w:pPr>
-      <w:bookmarkStart w:id="76" w:name="_Toc179465233"/>
+      <w:bookmarkStart w:id="167" w:name="_Toc179465233"/>
       <w:r>
         <w:t>Hydrogen Cost Calculation</w:t>
       </w:r>
@@ -20688,7 +22034,7 @@
       <w:r>
         <w:t>: Total CAPEX, OPEX, and Levelized Costs</w:t>
       </w:r>
-      <w:bookmarkEnd w:id="76"/>
+      <w:bookmarkEnd w:id="167"/>
     </w:p>
     <w:p>
       <w:pPr>
@@ -21529,11 +22875,11 @@
       <w:pPr>
         <w:pStyle w:val="NRELHead03Numbered"/>
       </w:pPr>
-      <w:bookmarkStart w:id="77" w:name="_Toc179465234"/>
+      <w:bookmarkStart w:id="168" w:name="_Toc179465234"/>
       <w:r>
         <w:t>System Design</w:t>
       </w:r>
-      <w:bookmarkEnd w:id="77"/>
+      <w:bookmarkEnd w:id="168"/>
     </w:p>
     <w:p>
       <w:pPr>
@@ -21659,11 +23005,11 @@
       <w:pPr>
         <w:pStyle w:val="NRELHead03Numbered"/>
       </w:pPr>
-      <w:bookmarkStart w:id="78" w:name="_Toc179465235"/>
+      <w:bookmarkStart w:id="169" w:name="_Toc179465235"/>
       <w:r>
         <w:t>Operating Dynamics for RE, Electrolyzers, Transmission, and Storage</w:t>
       </w:r>
-      <w:bookmarkEnd w:id="78"/>
+      <w:bookmarkEnd w:id="169"/>
     </w:p>
     <w:p>
       <w:pPr>
@@ -21726,11 +23072,11 @@
       <w:pPr>
         <w:pStyle w:val="NRELHead03Numbered"/>
       </w:pPr>
-      <w:bookmarkStart w:id="79" w:name="_Toc179465236"/>
+      <w:bookmarkStart w:id="170" w:name="_Toc179465236"/>
       <w:r>
         <w:t>Levelized Cost of Electricity (LCOE) and Capacity Factors</w:t>
       </w:r>
-      <w:bookmarkEnd w:id="79"/>
+      <w:bookmarkEnd w:id="170"/>
     </w:p>
     <w:p>
       <w:pPr>
@@ -21989,16 +23335,16 @@
       <w:r>
         <w:br w:type="page"/>
       </w:r>
-      <w:bookmarkStart w:id="80" w:name="_Toc314823692"/>
-      <w:bookmarkStart w:id="81" w:name="_Toc352071762"/>
-      <w:bookmarkStart w:id="82" w:name="_Toc179465237"/>
+      <w:bookmarkStart w:id="171" w:name="_Toc314823692"/>
+      <w:bookmarkStart w:id="172" w:name="_Toc352071762"/>
+      <w:bookmarkStart w:id="173" w:name="_Toc179465237"/>
       <w:r>
         <w:lastRenderedPageBreak/>
         <w:t>Glossary</w:t>
       </w:r>
-      <w:bookmarkEnd w:id="80"/>
-      <w:bookmarkEnd w:id="81"/>
-      <w:bookmarkEnd w:id="82"/>
+      <w:bookmarkEnd w:id="171"/>
+      <w:bookmarkEnd w:id="172"/>
+      <w:bookmarkEnd w:id="173"/>
     </w:p>
     <w:tbl>
       <w:tblPr>
@@ -22287,16 +23633,16 @@
       <w:r>
         <w:br w:type="page"/>
       </w:r>
-      <w:bookmarkStart w:id="83" w:name="_Toc314823693"/>
-      <w:bookmarkStart w:id="84" w:name="_Toc352071763"/>
-      <w:bookmarkStart w:id="85" w:name="_Toc179465238"/>
+      <w:bookmarkStart w:id="174" w:name="_Toc314823693"/>
+      <w:bookmarkStart w:id="175" w:name="_Toc352071763"/>
+      <w:bookmarkStart w:id="176" w:name="_Toc179465238"/>
       <w:r>
         <w:lastRenderedPageBreak/>
         <w:t>References</w:t>
       </w:r>
-      <w:bookmarkEnd w:id="83"/>
-      <w:bookmarkEnd w:id="84"/>
-      <w:bookmarkEnd w:id="85"/>
+      <w:bookmarkEnd w:id="174"/>
+      <w:bookmarkEnd w:id="175"/>
+      <w:bookmarkEnd w:id="176"/>
       <w:r>
         <w:t xml:space="preserve"> </w:t>
       </w:r>
@@ -22311,7 +23657,15 @@
       </w:r>
       <w:proofErr w:type="spellEnd"/>
       <w:r>
-        <w:t>, Nicola, Dino Zardi, and Julie K. Lundquist. 2017. “</w:t>
+        <w:t xml:space="preserve">, Nicola, Dino </w:t>
+      </w:r>
+      <w:proofErr w:type="spellStart"/>
+      <w:r>
+        <w:t>Zardi</w:t>
+      </w:r>
+      <w:proofErr w:type="spellEnd"/>
+      <w:r>
+        <w:t>, and Julie K. Lundquist. 2017. “</w:t>
       </w:r>
       <w:r>
         <w:t>Three-</w:t>
@@ -22538,7 +23892,7 @@
       <w:pPr>
         <w:pStyle w:val="NRELHead01"/>
       </w:pPr>
-      <w:bookmarkStart w:id="86" w:name="_Toc179465239"/>
+      <w:bookmarkStart w:id="177" w:name="_Toc179465239"/>
       <w:r>
         <w:lastRenderedPageBreak/>
         <w:t xml:space="preserve">Appendix </w:t>
@@ -22546,7 +23900,7 @@
       <w:r>
         <w:t>A: HYPSTAT Optimization Formulation</w:t>
       </w:r>
-      <w:bookmarkEnd w:id="86"/>
+      <w:bookmarkEnd w:id="177"/>
     </w:p>
     <w:bookmarkEnd w:id="0"/>
     <w:bookmarkEnd w:id="1"/>
@@ -23812,15 +25166,7 @@
           </w:tcPr>
           <w:p>
             <w:r>
-              <w:t xml:space="preserve">Whether or not a pipeline is built at all at each link. Only used in runs which </w:t>
-            </w:r>
-            <w:proofErr w:type="gramStart"/>
-            <w:r>
-              <w:t>pipelines</w:t>
-            </w:r>
-            <w:proofErr w:type="gramEnd"/>
-            <w:r>
-              <w:t xml:space="preserve"> locations are explicitly optimized.</w:t>
+              <w:t>Whether or not a pipeline is built at all at each link. Only used in runs which pipelines locations are explicitly optimized.</w:t>
             </w:r>
           </w:p>
         </w:tc>
@@ -26506,7 +27852,7 @@
       <w:pPr>
         <w:pStyle w:val="NRELHead03"/>
       </w:pPr>
-      <w:bookmarkStart w:id="87" w:name="_Toc179465240"/>
+      <w:bookmarkStart w:id="178" w:name="_Toc179465240"/>
       <w:r>
         <w:t xml:space="preserve">Demand </w:t>
       </w:r>
@@ -26516,7 +27862,7 @@
       <w:r>
         <w:t>onstraints</w:t>
       </w:r>
-      <w:bookmarkEnd w:id="87"/>
+      <w:bookmarkEnd w:id="178"/>
     </w:p>
     <w:p>
       <w:pPr>
@@ -26977,7 +28323,7 @@
       <w:pPr>
         <w:pStyle w:val="NRELHead03"/>
       </w:pPr>
-      <w:bookmarkStart w:id="88" w:name="_Toc179465241"/>
+      <w:bookmarkStart w:id="179" w:name="_Toc179465241"/>
       <w:r>
         <w:t xml:space="preserve">Import and </w:t>
       </w:r>
@@ -26993,7 +28339,7 @@
       <w:r>
         <w:t>onstraints</w:t>
       </w:r>
-      <w:bookmarkEnd w:id="88"/>
+      <w:bookmarkEnd w:id="179"/>
     </w:p>
     <w:p>
       <w:pPr>
@@ -27556,14 +28902,14 @@
       <w:pPr>
         <w:pStyle w:val="NRELHead03"/>
       </w:pPr>
-      <w:bookmarkStart w:id="89" w:name="_Toc179465242"/>
+      <w:bookmarkStart w:id="180" w:name="_Toc179465242"/>
       <w:r>
         <w:t xml:space="preserve">Storage </w:t>
       </w:r>
       <w:r>
         <w:t>Constraints</w:t>
       </w:r>
-      <w:bookmarkEnd w:id="89"/>
+      <w:bookmarkEnd w:id="180"/>
     </w:p>
     <w:p>
       <w:pPr>
@@ -27894,6 +29240,7 @@
                 <w:iCs/>
               </w:rPr>
             </w:pPr>
+            <w:proofErr w:type="spellStart"/>
             <w:r>
               <w:rPr>
                 <w:rFonts w:ascii="Consolas" w:eastAsiaTheme="minorEastAsia" w:hAnsi="Consolas" w:cs="Courier New"/>
@@ -27907,7 +29254,15 @@
                 <w:rFonts w:ascii="Consolas" w:eastAsiaTheme="minorEastAsia" w:hAnsi="Consolas" w:cs="Courier New"/>
                 <w:iCs/>
               </w:rPr>
-              <w:t>rule(</w:t>
+              <w:t>rule</w:t>
+            </w:r>
+            <w:proofErr w:type="spellEnd"/>
+            <w:r>
+              <w:rPr>
+                <w:rFonts w:ascii="Consolas" w:eastAsiaTheme="minorEastAsia" w:hAnsi="Consolas" w:cs="Courier New"/>
+                <w:iCs/>
+              </w:rPr>
+              <w:t>(</w:t>
             </w:r>
             <w:proofErr w:type="gramEnd"/>
             <w:r>
@@ -28738,14 +30093,14 @@
       <w:pPr>
         <w:pStyle w:val="NRELHead03"/>
       </w:pPr>
-      <w:bookmarkStart w:id="90" w:name="_Toc179465243"/>
+      <w:bookmarkStart w:id="181" w:name="_Toc179465243"/>
       <w:r>
         <w:t xml:space="preserve">Link </w:t>
       </w:r>
       <w:r>
         <w:t>Flow Constraints</w:t>
       </w:r>
-      <w:bookmarkEnd w:id="90"/>
+      <w:bookmarkEnd w:id="181"/>
     </w:p>
     <w:p>
       <w:pPr>
@@ -30179,14 +31534,14 @@
       <w:pPr>
         <w:pStyle w:val="NRELHead03"/>
       </w:pPr>
-      <w:bookmarkStart w:id="91" w:name="_Toc179465244"/>
+      <w:bookmarkStart w:id="182" w:name="_Toc179465244"/>
       <w:r>
         <w:t>Production</w:t>
       </w:r>
       <w:r>
         <w:t xml:space="preserve"> Constraints</w:t>
       </w:r>
-      <w:bookmarkEnd w:id="91"/>
+      <w:bookmarkEnd w:id="182"/>
     </w:p>
     <w:p>
       <w:pPr>
@@ -30700,31 +32055,15 @@
           <w:rFonts w:ascii="Consolas" w:hAnsi="Consolas" w:cs="Courier New"/>
           <w:iCs/>
         </w:rPr>
-        <w:t>Electricity_Potential_</w:t>
-      </w:r>
-      <w:proofErr w:type="gramStart"/>
+        <w:t>Electricity_Potential_rule</w:t>
+      </w:r>
+      <w:proofErr w:type="spellEnd"/>
       <w:r>
         <w:rPr>
           <w:rFonts w:ascii="Consolas" w:hAnsi="Consolas" w:cs="Courier New"/>
           <w:iCs/>
         </w:rPr>
-        <w:t>rule</w:t>
-      </w:r>
-      <w:proofErr w:type="spellEnd"/>
-      <w:r>
-        <w:rPr>
-          <w:rFonts w:ascii="Consolas" w:hAnsi="Consolas" w:cs="Courier New"/>
-          <w:iCs/>
-        </w:rPr>
-        <w:t>(</w:t>
-      </w:r>
-      <w:proofErr w:type="gramEnd"/>
-      <w:r>
-        <w:rPr>
-          <w:rFonts w:ascii="Consolas" w:hAnsi="Consolas" w:cs="Courier New"/>
-          <w:iCs/>
-        </w:rPr>
-        <w:t>m, tech, t, zone</w:t>
+        <w:t>(m, tech, t, zone</w:t>
       </w:r>
       <w:r>
         <w:rPr>
@@ -31313,14 +32652,14 @@
       <w:pPr>
         <w:pStyle w:val="NRELHead03"/>
       </w:pPr>
-      <w:bookmarkStart w:id="92" w:name="_Toc179465245"/>
+      <w:bookmarkStart w:id="183" w:name="_Toc179465245"/>
       <w:r>
         <w:t xml:space="preserve">Power </w:t>
       </w:r>
       <w:r>
         <w:t>Balance Constraint</w:t>
       </w:r>
-      <w:bookmarkEnd w:id="92"/>
+      <w:bookmarkEnd w:id="183"/>
     </w:p>
     <w:p>
       <w:pPr>
@@ -31777,7 +33116,7 @@
           <w:iCs/>
         </w:rPr>
       </w:pPr>
-      <w:bookmarkStart w:id="93" w:name="_Toc179465246"/>
+      <w:bookmarkStart w:id="184" w:name="_Toc179465246"/>
       <w:r>
         <w:lastRenderedPageBreak/>
         <w:t xml:space="preserve">Transmission and </w:t>
@@ -31800,7 +33139,7 @@
       <w:r>
         <w:t>onstraints</w:t>
       </w:r>
-      <w:bookmarkEnd w:id="93"/>
+      <w:bookmarkEnd w:id="184"/>
     </w:p>
     <w:p>
       <w:pPr>
@@ -32684,7 +34023,7 @@
       <w:pPr>
         <w:pStyle w:val="NRELHead02Numbered"/>
       </w:pPr>
-      <w:bookmarkStart w:id="94" w:name="_Toc179465247"/>
+      <w:bookmarkStart w:id="185" w:name="_Toc179465247"/>
       <w:r>
         <w:lastRenderedPageBreak/>
         <w:t>O</w:t>
@@ -32698,7 +34037,7 @@
       <w:r>
         <w:t>unction</w:t>
       </w:r>
-      <w:bookmarkEnd w:id="94"/>
+      <w:bookmarkEnd w:id="185"/>
     </w:p>
     <w:p>
       <w:pPr>
@@ -34319,7 +35658,32 @@
 
 <file path=word/comments.xml><?xml version="1.0" encoding="utf-8"?>
 <w:comments xmlns:wpc="http://schemas.microsoft.com/office/word/2010/wordprocessingCanvas" xmlns:cx="http://schemas.microsoft.com/office/drawing/2014/chartex" xmlns:cx1="http://schemas.microsoft.com/office/drawing/2015/9/8/chartex" xmlns:cx2="http://schemas.microsoft.com/office/drawing/2015/10/21/chartex" xmlns:cx3="http://schemas.microsoft.com/office/drawing/2016/5/9/chartex" xmlns:cx4="http://schemas.microsoft.com/office/drawing/2016/5/10/chartex" xmlns:cx5="http://schemas.microsoft.com/office/drawing/2016/5/11/chartex" xmlns:cx6="http://schemas.microsoft.com/office/drawing/2016/5/12/chartex" xmlns:cx7="http://schemas.microsoft.com/office/drawing/2016/5/13/chartex" xmlns:cx8="http://schemas.microsoft.com/office/drawing/2016/5/14/chartex" xmlns:mc="http://schemas.openxmlformats.org/markup-compatibility/2006" xmlns:aink="http://schemas.microsoft.com/office/drawing/2016/ink" xmlns:am3d="http://schemas.microsoft.com/office/drawing/2017/model3d" xmlns:o="urn:schemas-microsoft-com:office:office" xmlns:oel="http://schemas.microsoft.com/office/2019/extlst" xmlns:r="http://schemas.openxmlformats.org/officeDocument/2006/relationships" xmlns:m="http://schemas.openxmlformats.org/officeDocument/2006/math" xmlns:v="urn:schemas-microsoft-com:vml" xmlns:wp14="http://schemas.microsoft.com/office/word/2010/wordprocessingDrawing" xmlns:wp="http://schemas.openxmlformats.org/drawingml/2006/wordprocessingDrawing" xmlns:w10="urn:schemas-microsoft-com:office:word" xmlns:w="http://schemas.openxmlformats.org/wordprocessingml/2006/main" xmlns:w14="http://schemas.microsoft.com/office/word/2010/wordml" xmlns:w15="http://schemas.microsoft.com/office/word/2012/wordml" xmlns:w16cex="http://schemas.microsoft.com/office/word/2018/wordml/cex" xmlns:w16cid="http://schemas.microsoft.com/office/word/2016/wordml/cid" xmlns:w16="http://schemas.microsoft.com/office/word/2018/wordml" xmlns:w16du="http://schemas.microsoft.com/office/word/2023/wordml/word16du" xmlns:w16sdtdh="http://schemas.microsoft.com/office/word/2020/wordml/sdtdatahash" xmlns:w16se="http://schemas.microsoft.com/office/word/2015/wordml/symex" xmlns:wpg="http://schemas.microsoft.com/office/word/2010/wordprocessingGroup" xmlns:wpi="http://schemas.microsoft.com/office/word/2010/wordprocessingInk" xmlns:wne="http://schemas.microsoft.com/office/word/2006/wordml" xmlns:wps="http://schemas.microsoft.com/office/word/2010/wordprocessingShape" mc:Ignorable="w14 w15 w16se w16cid w16 w16cex w16sdtdh w16du wp14">
-  <w:comment w:id="74" w:author="Li, Yijin" w:date="2024-09-10T20:58:00Z" w:initials="LY">
+  <w:comment w:id="135" w:author="Li, Yijin" w:date="2024-12-11T12:40:00Z" w:initials="YL">
+    <w:p>
+      <w:r>
+        <w:rPr>
+          <w:rStyle w:val="CommentReference"/>
+        </w:rPr>
+        <w:annotationRef/>
+      </w:r>
+      <w:r>
+        <w:rPr>
+          <w:sz w:val="20"/>
+          <w:szCs w:val="20"/>
+        </w:rPr>
+        <w:t>Unless variable OPEX is RE technology specific due to emission/compliance differences.</w:t>
+      </w:r>
+      <w:r>
+        <w:rPr>
+          <w:sz w:val="20"/>
+          <w:szCs w:val="20"/>
+        </w:rPr>
+        <w:cr/>
+        <w:t xml:space="preserve"> </w:t>
+      </w:r>
+    </w:p>
+  </w:comment>
+  <w:comment w:id="165" w:author="Li, Yijin" w:date="2024-09-10T20:58:00Z" w:initials="LY">
     <w:p>
       <w:r>
         <w:rPr>
@@ -34342,18 +35706,21 @@
 
 <file path=word/commentsExtended.xml><?xml version="1.0" encoding="utf-8"?>
 <w15:commentsEx xmlns:wpc="http://schemas.microsoft.com/office/word/2010/wordprocessingCanvas" xmlns:cx="http://schemas.microsoft.com/office/drawing/2014/chartex" xmlns:cx1="http://schemas.microsoft.com/office/drawing/2015/9/8/chartex" xmlns:cx2="http://schemas.microsoft.com/office/drawing/2015/10/21/chartex" xmlns:cx3="http://schemas.microsoft.com/office/drawing/2016/5/9/chartex" xmlns:cx4="http://schemas.microsoft.com/office/drawing/2016/5/10/chartex" xmlns:cx5="http://schemas.microsoft.com/office/drawing/2016/5/11/chartex" xmlns:cx6="http://schemas.microsoft.com/office/drawing/2016/5/12/chartex" xmlns:cx7="http://schemas.microsoft.com/office/drawing/2016/5/13/chartex" xmlns:cx8="http://schemas.microsoft.com/office/drawing/2016/5/14/chartex" xmlns:mc="http://schemas.openxmlformats.org/markup-compatibility/2006" xmlns:aink="http://schemas.microsoft.com/office/drawing/2016/ink" xmlns:am3d="http://schemas.microsoft.com/office/drawing/2017/model3d" xmlns:o="urn:schemas-microsoft-com:office:office" xmlns:oel="http://schemas.microsoft.com/office/2019/extlst" xmlns:r="http://schemas.openxmlformats.org/officeDocument/2006/relationships" xmlns:m="http://schemas.openxmlformats.org/officeDocument/2006/math" xmlns:v="urn:schemas-microsoft-com:vml" xmlns:wp14="http://schemas.microsoft.com/office/word/2010/wordprocessingDrawing" xmlns:wp="http://schemas.openxmlformats.org/drawingml/2006/wordprocessingDrawing" xmlns:w10="urn:schemas-microsoft-com:office:word" xmlns:w="http://schemas.openxmlformats.org/wordprocessingml/2006/main" xmlns:w14="http://schemas.microsoft.com/office/word/2010/wordml" xmlns:w15="http://schemas.microsoft.com/office/word/2012/wordml" xmlns:w16cex="http://schemas.microsoft.com/office/word/2018/wordml/cex" xmlns:w16cid="http://schemas.microsoft.com/office/word/2016/wordml/cid" xmlns:w16="http://schemas.microsoft.com/office/word/2018/wordml" xmlns:w16du="http://schemas.microsoft.com/office/word/2023/wordml/word16du" xmlns:w16sdtdh="http://schemas.microsoft.com/office/word/2020/wordml/sdtdatahash" xmlns:w16se="http://schemas.microsoft.com/office/word/2015/wordml/symex" xmlns:wpg="http://schemas.microsoft.com/office/word/2010/wordprocessingGroup" xmlns:wpi="http://schemas.microsoft.com/office/word/2010/wordprocessingInk" xmlns:wne="http://schemas.microsoft.com/office/word/2006/wordml" xmlns:wps="http://schemas.microsoft.com/office/word/2010/wordprocessingShape" mc:Ignorable="w14 w15 w16se w16cid w16 w16cex w16sdtdh w16du wp14">
+  <w15:commentEx w15:paraId="180F6F44" w15:done="0"/>
   <w15:commentEx w15:paraId="6053F407" w15:done="0"/>
 </w15:commentsEx>
 </file>
 
 <file path=word/commentsExtensible.xml><?xml version="1.0" encoding="utf-8"?>
 <w16cex:commentsExtensible xmlns:wpc="http://schemas.microsoft.com/office/word/2010/wordprocessingCanvas" xmlns:cx="http://schemas.microsoft.com/office/drawing/2014/chartex" xmlns:cx1="http://schemas.microsoft.com/office/drawing/2015/9/8/chartex" xmlns:cx2="http://schemas.microsoft.com/office/drawing/2015/10/21/chartex" xmlns:cx3="http://schemas.microsoft.com/office/drawing/2016/5/9/chartex" xmlns:cx4="http://schemas.microsoft.com/office/drawing/2016/5/10/chartex" xmlns:cx5="http://schemas.microsoft.com/office/drawing/2016/5/11/chartex" xmlns:cx6="http://schemas.microsoft.com/office/drawing/2016/5/12/chartex" xmlns:cx7="http://schemas.microsoft.com/office/drawing/2016/5/13/chartex" xmlns:cx8="http://schemas.microsoft.com/office/drawing/2016/5/14/chartex" xmlns:cr="http://schemas.microsoft.com/office/comments/2020/reactions" xmlns:mc="http://schemas.openxmlformats.org/markup-compatibility/2006" xmlns:aink="http://schemas.microsoft.com/office/drawing/2016/ink" xmlns:am3d="http://schemas.microsoft.com/office/drawing/2017/model3d" xmlns:o="urn:schemas-microsoft-com:office:office" xmlns:oel="http://schemas.microsoft.com/office/2019/extlst" xmlns:r="http://schemas.openxmlformats.org/officeDocument/2006/relationships" xmlns:m="http://schemas.openxmlformats.org/officeDocument/2006/math" xmlns:v="urn:schemas-microsoft-com:vml" xmlns:wp14="http://schemas.microsoft.com/office/word/2010/wordprocessingDrawing" xmlns:wp="http://schemas.openxmlformats.org/drawingml/2006/wordprocessingDrawing" xmlns:w10="urn:schemas-microsoft-com:office:word" xmlns:w="http://schemas.openxmlformats.org/wordprocessingml/2006/main" xmlns:w14="http://schemas.microsoft.com/office/word/2010/wordml" xmlns:w15="http://schemas.microsoft.com/office/word/2012/wordml" xmlns:w16cex="http://schemas.microsoft.com/office/word/2018/wordml/cex" xmlns:w16cid="http://schemas.microsoft.com/office/word/2016/wordml/cid" xmlns:w16="http://schemas.microsoft.com/office/word/2018/wordml" xmlns:w16du="http://schemas.microsoft.com/office/word/2023/wordml/word16du" xmlns:w16sdtdh="http://schemas.microsoft.com/office/word/2020/wordml/sdtdatahash" xmlns:w16se="http://schemas.microsoft.com/office/word/2015/wordml/symex" xmlns:wpg="http://schemas.microsoft.com/office/word/2010/wordprocessingGroup" xmlns:wpi="http://schemas.microsoft.com/office/word/2010/wordprocessingInk" xmlns:wne="http://schemas.microsoft.com/office/word/2006/wordml" xmlns:wps="http://schemas.microsoft.com/office/word/2010/wordprocessingShape" mc:Ignorable="w14 w15 w16se w16cid w16 w16cex w16sdtdh cr w16du wp14">
+  <w16cex:commentExtensible w16cex:durableId="6180817C" w16cex:dateUtc="2024-12-11T20:40:00Z"/>
   <w16cex:commentExtensible w16cex:durableId="6A778143" w16cex:dateUtc="2024-09-11T02:58:00Z"/>
 </w16cex:commentsExtensible>
 </file>
 
 <file path=word/commentsIds.xml><?xml version="1.0" encoding="utf-8"?>
 <w16cid:commentsIds xmlns:wpc="http://schemas.microsoft.com/office/word/2010/wordprocessingCanvas" xmlns:cx="http://schemas.microsoft.com/office/drawing/2014/chartex" xmlns:cx1="http://schemas.microsoft.com/office/drawing/2015/9/8/chartex" xmlns:cx2="http://schemas.microsoft.com/office/drawing/2015/10/21/chartex" xmlns:cx3="http://schemas.microsoft.com/office/drawing/2016/5/9/chartex" xmlns:cx4="http://schemas.microsoft.com/office/drawing/2016/5/10/chartex" xmlns:cx5="http://schemas.microsoft.com/office/drawing/2016/5/11/chartex" xmlns:cx6="http://schemas.microsoft.com/office/drawing/2016/5/12/chartex" xmlns:cx7="http://schemas.microsoft.com/office/drawing/2016/5/13/chartex" xmlns:cx8="http://schemas.microsoft.com/office/drawing/2016/5/14/chartex" xmlns:mc="http://schemas.openxmlformats.org/markup-compatibility/2006" xmlns:aink="http://schemas.microsoft.com/office/drawing/2016/ink" xmlns:am3d="http://schemas.microsoft.com/office/drawing/2017/model3d" xmlns:o="urn:schemas-microsoft-com:office:office" xmlns:oel="http://schemas.microsoft.com/office/2019/extlst" xmlns:r="http://schemas.openxmlformats.org/officeDocument/2006/relationships" xmlns:m="http://schemas.openxmlformats.org/officeDocument/2006/math" xmlns:v="urn:schemas-microsoft-com:vml" xmlns:wp14="http://schemas.microsoft.com/office/word/2010/wordprocessingDrawing" xmlns:wp="http://schemas.openxmlformats.org/drawingml/2006/wordprocessingDrawing" xmlns:w10="urn:schemas-microsoft-com:office:word" xmlns:w="http://schemas.openxmlformats.org/wordprocessingml/2006/main" xmlns:w14="http://schemas.microsoft.com/office/word/2010/wordml" xmlns:w15="http://schemas.microsoft.com/office/word/2012/wordml" xmlns:w16cex="http://schemas.microsoft.com/office/word/2018/wordml/cex" xmlns:w16cid="http://schemas.microsoft.com/office/word/2016/wordml/cid" xmlns:w16="http://schemas.microsoft.com/office/word/2018/wordml" xmlns:w16du="http://schemas.microsoft.com/office/word/2023/wordml/word16du" xmlns:w16sdtdh="http://schemas.microsoft.com/office/word/2020/wordml/sdtdatahash" xmlns:w16se="http://schemas.microsoft.com/office/word/2015/wordml/symex" xmlns:wpg="http://schemas.microsoft.com/office/word/2010/wordprocessingGroup" xmlns:wpi="http://schemas.microsoft.com/office/word/2010/wordprocessingInk" xmlns:wne="http://schemas.microsoft.com/office/word/2006/wordml" xmlns:wps="http://schemas.microsoft.com/office/word/2010/wordprocessingShape" mc:Ignorable="w14 w15 w16se w16cid w16 w16cex w16sdtdh w16du wp14">
+  <w16cid:commentId w16cid:paraId="180F6F44" w16cid:durableId="6180817C"/>
   <w16cid:commentId w16cid:paraId="6053F407" w16cid:durableId="6A778143"/>
 </w16cid:commentsIds>
 </file>
@@ -34505,7 +35872,7 @@
             <w:noProof/>
             <w:lang w:eastAsia="zh-TW"/>
           </w:rPr>
-          <w:pict w14:anchorId="19A856F4">
+          <w:pict w14:anchorId="4C341AE4">
             <v:shapetype id="_x0000_t136" coordsize="21600,21600" o:spt="136" adj="10800" path="m@7,l@8,m@5,21600l@6,21600e">
               <v:formulas>
                 <v:f eqn="sum #0 0 10800"/>
@@ -34530,7 +35897,7 @@
               </v:handles>
               <o:lock v:ext="edit" text="t" shapetype="t"/>
             </v:shapetype>
-            <v:shape id="PowerPlusWaterMarkObject357831064" o:spid="_x0000_s1025" type="#_x0000_t136" style="position:absolute;margin-left:0;margin-top:0;width:412.4pt;height:247.45pt;rotation:315;z-index:-251658752;mso-position-horizontal:center;mso-position-horizontal-relative:margin;mso-position-vertical:center;mso-position-vertical-relative:margin" o:allowincell="f" fillcolor="silver" stroked="f">
+            <v:shape id="PowerPlusWaterMarkObject357831064" o:spid="_x0000_s1025" type="#_x0000_t136" alt="" style="position:absolute;margin-left:0;margin-top:0;width:412.4pt;height:247.45pt;rotation:315;z-index:-251658752;mso-wrap-edited:f;mso-width-percent:0;mso-height-percent:0;mso-position-horizontal:center;mso-position-horizontal-relative:margin;mso-position-vertical:center;mso-position-vertical-relative:margin;mso-width-percent:0;mso-height-percent:0" o:allowincell="f" fillcolor="silver" stroked="f">
               <v:fill opacity=".5"/>
               <v:textpath style="font-family:&quot;Calibri&quot;;font-size:1pt" string="DRAFT"/>
               <w10:wrap anchorx="margin" anchory="margin"/>
@@ -34727,7 +36094,7 @@
     <w:lvl w:ilvl="0">
       <w:start w:val="1"/>
       <w:numFmt w:val="bullet"/>
-      <w:pStyle w:val="NRELBlockChar"/>
+      <w:pStyle w:val="ListBullet"/>
       <w:lvlText w:val=""/>
       <w:lvlJc w:val="left"/>
       <w:pPr>
@@ -34861,7 +36228,7 @@
     <w:lvl w:ilvl="0" w:tplc="3224014A">
       <w:start w:val="1"/>
       <w:numFmt w:val="decimal"/>
-      <w:pStyle w:val="NRELList03Char"/>
+      <w:pStyle w:val="NRELList01"/>
       <w:lvlText w:val="%1."/>
       <w:lvlJc w:val="left"/>
       <w:pPr>
@@ -35317,7 +36684,7 @@
     <w:lvl w:ilvl="0" w:tplc="1B2EFBF4">
       <w:start w:val="1"/>
       <w:numFmt w:val="bullet"/>
-      <w:pStyle w:val="NRELTOC03"/>
+      <w:pStyle w:val="NRELBullet02"/>
       <w:lvlText w:val="o"/>
       <w:lvlJc w:val="left"/>
       <w:pPr>
@@ -35946,7 +37313,7 @@
     <w:lvl w:ilvl="0" w:tplc="294A7720">
       <w:start w:val="1"/>
       <w:numFmt w:val="bullet"/>
-      <w:pStyle w:val="NRELBlock"/>
+      <w:pStyle w:val="NRELBullet01"/>
       <w:lvlText w:val=""/>
       <w:lvlJc w:val="left"/>
       <w:pPr>
@@ -36337,7 +37704,7 @@
     <w:lvl w:ilvl="3">
       <w:start w:val="1"/>
       <w:numFmt w:val="decimal"/>
-      <w:pStyle w:val="FollowedHyperlink"/>
+      <w:pStyle w:val="NRELHead04Numbered"/>
       <w:lvlText w:val="%1.%2.%3.%4"/>
       <w:lvlJc w:val="left"/>
       <w:pPr>
@@ -36353,7 +37720,7 @@
     <w:lvl w:ilvl="4">
       <w:start w:val="1"/>
       <w:numFmt w:val="decimal"/>
-      <w:pStyle w:val="NRELTableHeader"/>
+      <w:pStyle w:val="NRELHead05Numbered"/>
       <w:lvlText w:val="%1.%2.%3.%4.%5"/>
       <w:lvlJc w:val="left"/>
       <w:pPr>
@@ -36369,7 +37736,7 @@
     <w:lvl w:ilvl="5">
       <w:start w:val="1"/>
       <w:numFmt w:val="decimal"/>
-      <w:pStyle w:val="NRELTOCFiguresandTables"/>
+      <w:pStyle w:val="NRELHead06Numbered"/>
       <w:lvlText w:val="%1.%2.%3.%4.%5.%6"/>
       <w:lvlJc w:val="left"/>
       <w:pPr>
@@ -36385,7 +37752,7 @@
     <w:lvl w:ilvl="6">
       <w:start w:val="1"/>
       <w:numFmt w:val="decimal"/>
-      <w:pStyle w:val="Caption"/>
+      <w:pStyle w:val="NRELHead07Numbered"/>
       <w:lvlText w:val="%1.%2.%3.%4.%5.%6.%7"/>
       <w:lvlJc w:val="left"/>
       <w:pPr>
@@ -36438,7 +37805,7 @@
     <w:lvl w:ilvl="0" w:tplc="6706CAE8">
       <w:start w:val="1"/>
       <w:numFmt w:val="upperLetter"/>
-      <w:pStyle w:val="NRELIndex"/>
+      <w:pStyle w:val="NRELList02"/>
       <w:lvlText w:val="%1."/>
       <w:lvlJc w:val="left"/>
       <w:pPr>
@@ -36668,7 +38035,7 @@
     <w:lvl w:ilvl="0" w:tplc="95EE5BD6">
       <w:start w:val="1"/>
       <w:numFmt w:val="lowerRoman"/>
-      <w:pStyle w:val="NRELFootnoteEndnote"/>
+      <w:pStyle w:val="NRELList03"/>
       <w:lvlText w:val="%1."/>
       <w:lvlJc w:val="left"/>
       <w:pPr>
@@ -36789,7 +38156,7 @@
     <w:lvl w:ilvl="0" w:tplc="361E89E2">
       <w:start w:val="1"/>
       <w:numFmt w:val="bullet"/>
-      <w:pStyle w:val="NRELList01"/>
+      <w:pStyle w:val="NRELBullet03"/>
       <w:lvlText w:val="̶"/>
       <w:lvlJc w:val="left"/>
       <w:pPr>
@@ -36897,6 +38264,95 @@
     </w:lvl>
   </w:abstractNum>
   <w:abstractNum w:abstractNumId="28" w15:restartNumberingAfterBreak="0">
+    <w:nsid w:val="75CC6CE7"/>
+    <w:multiLevelType w:val="hybridMultilevel"/>
+    <w:tmpl w:val="C0B4657C"/>
+    <w:lvl w:ilvl="0" w:tplc="0409000F">
+      <w:start w:val="1"/>
+      <w:numFmt w:val="decimal"/>
+      <w:lvlText w:val="%1."/>
+      <w:lvlJc w:val="left"/>
+      <w:pPr>
+        <w:ind w:left="720" w:hanging="360"/>
+      </w:pPr>
+      <w:rPr>
+        <w:rFonts w:hint="default"/>
+      </w:rPr>
+    </w:lvl>
+    <w:lvl w:ilvl="1" w:tplc="04090019" w:tentative="1">
+      <w:start w:val="1"/>
+      <w:numFmt w:val="lowerLetter"/>
+      <w:lvlText w:val="%2."/>
+      <w:lvlJc w:val="left"/>
+      <w:pPr>
+        <w:ind w:left="1440" w:hanging="360"/>
+      </w:pPr>
+    </w:lvl>
+    <w:lvl w:ilvl="2" w:tplc="0409001B" w:tentative="1">
+      <w:start w:val="1"/>
+      <w:numFmt w:val="lowerRoman"/>
+      <w:lvlText w:val="%3."/>
+      <w:lvlJc w:val="right"/>
+      <w:pPr>
+        <w:ind w:left="2160" w:hanging="180"/>
+      </w:pPr>
+    </w:lvl>
+    <w:lvl w:ilvl="3" w:tplc="0409000F" w:tentative="1">
+      <w:start w:val="1"/>
+      <w:numFmt w:val="decimal"/>
+      <w:lvlText w:val="%4."/>
+      <w:lvlJc w:val="left"/>
+      <w:pPr>
+        <w:ind w:left="2880" w:hanging="360"/>
+      </w:pPr>
+    </w:lvl>
+    <w:lvl w:ilvl="4" w:tplc="04090019" w:tentative="1">
+      <w:start w:val="1"/>
+      <w:numFmt w:val="lowerLetter"/>
+      <w:lvlText w:val="%5."/>
+      <w:lvlJc w:val="left"/>
+      <w:pPr>
+        <w:ind w:left="3600" w:hanging="360"/>
+      </w:pPr>
+    </w:lvl>
+    <w:lvl w:ilvl="5" w:tplc="0409001B" w:tentative="1">
+      <w:start w:val="1"/>
+      <w:numFmt w:val="lowerRoman"/>
+      <w:lvlText w:val="%6."/>
+      <w:lvlJc w:val="right"/>
+      <w:pPr>
+        <w:ind w:left="4320" w:hanging="180"/>
+      </w:pPr>
+    </w:lvl>
+    <w:lvl w:ilvl="6" w:tplc="0409000F" w:tentative="1">
+      <w:start w:val="1"/>
+      <w:numFmt w:val="decimal"/>
+      <w:lvlText w:val="%7."/>
+      <w:lvlJc w:val="left"/>
+      <w:pPr>
+        <w:ind w:left="5040" w:hanging="360"/>
+      </w:pPr>
+    </w:lvl>
+    <w:lvl w:ilvl="7" w:tplc="04090019" w:tentative="1">
+      <w:start w:val="1"/>
+      <w:numFmt w:val="lowerLetter"/>
+      <w:lvlText w:val="%8."/>
+      <w:lvlJc w:val="left"/>
+      <w:pPr>
+        <w:ind w:left="5760" w:hanging="360"/>
+      </w:pPr>
+    </w:lvl>
+    <w:lvl w:ilvl="8" w:tplc="0409001B" w:tentative="1">
+      <w:start w:val="1"/>
+      <w:numFmt w:val="lowerRoman"/>
+      <w:lvlText w:val="%9."/>
+      <w:lvlJc w:val="right"/>
+      <w:pPr>
+        <w:ind w:left="6480" w:hanging="180"/>
+      </w:pPr>
+    </w:lvl>
+  </w:abstractNum>
+  <w:abstractNum w:abstractNumId="29" w15:restartNumberingAfterBreak="0">
     <w:nsid w:val="76515773"/>
     <w:multiLevelType w:val="hybridMultilevel"/>
     <w:tmpl w:val="4B8A73CC"/>
@@ -37009,7 +38465,7 @@
       </w:rPr>
     </w:lvl>
   </w:abstractNum>
-  <w:abstractNum w:abstractNumId="29" w15:restartNumberingAfterBreak="0">
+  <w:abstractNum w:abstractNumId="30" w15:restartNumberingAfterBreak="0">
     <w:nsid w:val="76531FE4"/>
     <w:multiLevelType w:val="multilevel"/>
     <w:tmpl w:val="0409001D"/>
@@ -37095,7 +38551,7 @@
       </w:pPr>
     </w:lvl>
   </w:abstractNum>
-  <w:abstractNum w:abstractNumId="30" w15:restartNumberingAfterBreak="0">
+  <w:abstractNum w:abstractNumId="31" w15:restartNumberingAfterBreak="0">
     <w:nsid w:val="78CC040F"/>
     <w:multiLevelType w:val="hybridMultilevel"/>
     <w:tmpl w:val="8EF24C2C"/>
@@ -37184,7 +38640,7 @@
       </w:pPr>
     </w:lvl>
   </w:abstractNum>
-  <w:abstractNum w:abstractNumId="31" w15:restartNumberingAfterBreak="0">
+  <w:abstractNum w:abstractNumId="32" w15:restartNumberingAfterBreak="0">
     <w:nsid w:val="7B320C5D"/>
     <w:multiLevelType w:val="multilevel"/>
     <w:tmpl w:val="5E100362"/>
@@ -37207,7 +38663,7 @@
     <w:lvl w:ilvl="1">
       <w:start w:val="1"/>
       <w:numFmt w:val="decimal"/>
-      <w:pStyle w:val="CommentReference"/>
+      <w:pStyle w:val="NRELHead02Appendix"/>
       <w:lvlText w:val="%1.%2"/>
       <w:lvlJc w:val="left"/>
       <w:pPr>
@@ -37305,7 +38761,7 @@
       </w:rPr>
     </w:lvl>
   </w:abstractNum>
-  <w:abstractNum w:abstractNumId="32" w15:restartNumberingAfterBreak="0">
+  <w:abstractNum w:abstractNumId="33" w15:restartNumberingAfterBreak="0">
     <w:nsid w:val="7C580FD7"/>
     <w:multiLevelType w:val="hybridMultilevel"/>
     <w:tmpl w:val="BB2C11EC"/>
@@ -37491,7 +38947,7 @@
     <w:abstractNumId w:val="0"/>
   </w:num>
   <w:num w:numId="25" w16cid:durableId="676033802">
-    <w:abstractNumId w:val="31"/>
+    <w:abstractNumId w:val="32"/>
   </w:num>
   <w:num w:numId="26" w16cid:durableId="510491613">
     <w:abstractNumId w:val="14"/>
@@ -37500,10 +38956,10 @@
     <w:abstractNumId w:val="18"/>
   </w:num>
   <w:num w:numId="28" w16cid:durableId="1707219542">
-    <w:abstractNumId w:val="32"/>
+    <w:abstractNumId w:val="33"/>
   </w:num>
   <w:num w:numId="29" w16cid:durableId="1939098414">
-    <w:abstractNumId w:val="28"/>
+    <w:abstractNumId w:val="29"/>
   </w:num>
   <w:num w:numId="30" w16cid:durableId="851535147">
     <w:abstractNumId w:val="22"/>
@@ -37521,10 +38977,10 @@
     <w:abstractNumId w:val="13"/>
   </w:num>
   <w:num w:numId="35" w16cid:durableId="387150463">
-    <w:abstractNumId w:val="30"/>
+    <w:abstractNumId w:val="31"/>
   </w:num>
   <w:num w:numId="36" w16cid:durableId="51930832">
-    <w:abstractNumId w:val="29"/>
+    <w:abstractNumId w:val="30"/>
   </w:num>
   <w:num w:numId="37" w16cid:durableId="1734545967">
     <w:abstractNumId w:val="16"/>
@@ -37567,6 +39023,9 @@
   </w:num>
   <w:num w:numId="41" w16cid:durableId="1092821843">
     <w:abstractNumId w:val="12"/>
+  </w:num>
+  <w:num w:numId="42" w16cid:durableId="807094455">
+    <w:abstractNumId w:val="28"/>
   </w:num>
   <w:numIdMacAtCleanup w:val="7"/>
 </w:numbering>
@@ -39060,9 +40519,10 @@
     <w:qFormat/>
     <w:rsid w:val="008C0E51"/>
     <w:pPr>
-      <w:numPr>
-        <w:numId w:val="7"/>
-      </w:numPr>
+      <w:tabs>
+        <w:tab w:val="num" w:pos="432"/>
+      </w:tabs>
+      <w:ind w:left="432" w:hanging="432"/>
       <w:outlineLvl w:val="0"/>
     </w:pPr>
     <w:rPr>
@@ -39080,10 +40540,10 @@
     <w:qFormat/>
     <w:rsid w:val="008C0E51"/>
     <w:pPr>
-      <w:numPr>
-        <w:ilvl w:val="1"/>
-        <w:numId w:val="7"/>
-      </w:numPr>
+      <w:tabs>
+        <w:tab w:val="num" w:pos="576"/>
+      </w:tabs>
+      <w:ind w:left="576" w:hanging="576"/>
       <w:outlineLvl w:val="1"/>
     </w:pPr>
     <w:rPr>
@@ -39099,10 +40559,10 @@
     <w:qFormat/>
     <w:rsid w:val="008C0E51"/>
     <w:pPr>
-      <w:numPr>
-        <w:ilvl w:val="2"/>
-        <w:numId w:val="7"/>
-      </w:numPr>
+      <w:tabs>
+        <w:tab w:val="num" w:pos="1170"/>
+      </w:tabs>
+      <w:ind w:left="1170" w:hanging="720"/>
       <w:outlineLvl w:val="2"/>
     </w:pPr>
     <w:rPr>
@@ -39340,12 +40800,10 @@
     <w:pPr>
       <w:keepNext/>
       <w:pageBreakBefore/>
-      <w:numPr>
-        <w:numId w:val="25"/>
-      </w:numPr>
       <w:tabs>
         <w:tab w:val="left" w:pos="720"/>
         <w:tab w:val="left" w:pos="2250"/>
+        <w:tab w:val="num" w:pos="2520"/>
       </w:tabs>
       <w:outlineLvl w:val="0"/>
     </w:pPr>

</xml_diff>

<commit_message>
Minor edits to documentation
</commit_message>
<xml_diff>
--- a/HYPSTAT Full Documentation.docx
+++ b/HYPSTAT Full Documentation.docx
@@ -5539,15 +5539,7 @@
         <w:pStyle w:val="NRELBodyText"/>
       </w:pPr>
       <w:r>
-        <w:t xml:space="preserve">Technology options: Select or define relevant hydrogen production (e.g., </w:t>
-      </w:r>
-      <w:proofErr w:type="spellStart"/>
-      <w:r>
-        <w:t>electrolyzers</w:t>
-      </w:r>
-      <w:proofErr w:type="spellEnd"/>
-      <w:r>
-        <w:t>), storage, and transmission technologies. HYPSTAT supports renewable-powered electrolytic production but does not currently support non-electrolytic production methods.</w:t>
+        <w:t>Technology options: Select or define relevant hydrogen production (e.g., electrolyzers), storage, and transmission technologies. HYPSTAT supports renewable-powered electrolytic production but does not currently support non-electrolytic production methods.</w:t>
       </w:r>
     </w:p>
     <w:p>
@@ -5964,11 +5956,7 @@
       </w:pPr>
       <w:r>
         <w:lastRenderedPageBreak/>
-        <w:t xml:space="preserve">YAML Configuration </w:t>
-      </w:r>
-      <w:proofErr w:type="spellStart"/>
-      <w:r>
-        <w:t>File:</w:t>
+        <w:t>YAML Configuration File:</w:t>
       </w:r>
     </w:p>
     <w:p>
@@ -5976,11 +5964,7 @@
         <w:pStyle w:val="NRELBodyText"/>
       </w:pPr>
       <w:r>
-        <w:t>Input</w:t>
-      </w:r>
-      <w:proofErr w:type="spellEnd"/>
-      <w:r>
-        <w:t xml:space="preserve"> your scenario configuration into a YAML file.</w:t>
+        <w:t>Input your scenario configuration into a YAML file.</w:t>
       </w:r>
     </w:p>
     <w:p>
@@ -6820,15 +6804,7 @@
           <w:t>, i</w:t>
         </w:r>
         <w:r>
-          <w:t xml:space="preserve">ncluding renewable energy systems, </w:t>
-        </w:r>
-        <w:proofErr w:type="spellStart"/>
-        <w:r>
-          <w:t>electrolyzers</w:t>
-        </w:r>
-        <w:proofErr w:type="spellEnd"/>
-        <w:r>
-          <w:t>, storage, and transmission technologies.</w:t>
+          <w:t>ncluding renewable energy systems, electrolyzers, storage, and transmission technologies.</w:t>
         </w:r>
       </w:ins>
       <w:del w:id="72" w:author="Li, Yijin" w:date="2024-12-11T10:04:00Z" w16du:dateUtc="2024-12-11T18:04:00Z">
@@ -7007,7 +6983,15 @@
       </w:r>
       <w:proofErr w:type="gramEnd"/>
       <w:r>
-        <w:t xml:space="preserve"> that the only conversion factor that is a user-specified input is a hydrogen production efficiency, designed to be a figure in kWh electricity/kg hydrogen.</w:t>
+        <w:t xml:space="preserve"> that the only conversion factor that is a user-specified input is </w:t>
+      </w:r>
+      <w:proofErr w:type="gramStart"/>
+      <w:r>
+        <w:t>a hydrogen</w:t>
+      </w:r>
+      <w:proofErr w:type="gramEnd"/>
+      <w:r>
+        <w:t xml:space="preserve"> production efficiency, designed to be a figure in kWh electricity/kg hydrogen.</w:t>
       </w:r>
     </w:p>
     <w:p>
@@ -7030,13 +7014,11 @@
           <w:t xml:space="preserve"> (</w:t>
         </w:r>
       </w:ins>
-      <w:proofErr w:type="spellStart"/>
       <w:ins w:id="79" w:author="Li, Yijin" w:date="2024-12-11T10:11:00Z" w16du:dateUtc="2024-12-11T18:11:00Z">
         <w:r>
           <w:t>electrolyzer</w:t>
         </w:r>
       </w:ins>
-      <w:proofErr w:type="spellEnd"/>
       <w:ins w:id="80" w:author="Li, Yijin" w:date="2024-12-11T10:12:00Z" w16du:dateUtc="2024-12-11T18:12:00Z">
         <w:r>
           <w:t>)</w:t>
@@ -7344,15 +7326,7 @@
         <w:pStyle w:val="NRELBodyText"/>
       </w:pPr>
       <w:r>
-        <w:t>Currently, HYPSTAT only allows for two transmission technologies: pipeline transmission and tank-based transmission via trucks. (Generalization of additional transmission technologies may be added in the future.) These are referred to as ‘Pipelines’ and ‘Trucks’ in the model inputs and code base. HYPSTAT also only allows one type of hydrogen production technology, electrolysis, which is referred to via the technology name ‘</w:t>
-      </w:r>
-      <w:proofErr w:type="spellStart"/>
-      <w:r>
-        <w:t>Electrolyzer</w:t>
-      </w:r>
-      <w:proofErr w:type="spellEnd"/>
-      <w:r>
-        <w:t>’ in model inputs.</w:t>
+        <w:t>Currently, HYPSTAT only allows for two transmission technologies: pipeline transmission and tank-based transmission via trucks. (Generalization of additional transmission technologies may be added in the future.) These are referred to as ‘Pipelines’ and ‘Trucks’ in the model inputs and code base. HYPSTAT also only allows one type of hydrogen production technology, electrolysis, which is referred to via the technology name ‘Electrolyzer’ in model inputs.</w:t>
       </w:r>
       <w:ins w:id="101" w:author="Li, Yijin" w:date="2024-12-11T10:31:00Z" w16du:dateUtc="2024-12-11T18:31:00Z">
         <w:r>
@@ -7787,7 +7761,23 @@
                 <w:sz w:val="18"/>
                 <w:szCs w:val="18"/>
               </w:rPr>
-              <w:t xml:space="preserve">eneration profiles which specify how much is electricity can be produced in each </w:t>
+              <w:t xml:space="preserve">eneration profiles which specify how </w:t>
+            </w:r>
+            <w:proofErr w:type="gramStart"/>
+            <w:r>
+              <w:rPr>
+                <w:sz w:val="18"/>
+                <w:szCs w:val="18"/>
+              </w:rPr>
+              <w:t>much is</w:t>
+            </w:r>
+            <w:proofErr w:type="gramEnd"/>
+            <w:r>
+              <w:rPr>
+                <w:sz w:val="18"/>
+                <w:szCs w:val="18"/>
+              </w:rPr>
+              <w:t xml:space="preserve"> electricity can be produced in each </w:t>
             </w:r>
             <w:proofErr w:type="gramStart"/>
             <w:r>
@@ -8697,7 +8687,15 @@
         <w:pStyle w:val="NRELBodyText"/>
       </w:pPr>
       <w:r>
-        <w:t>Hydrogen production technology can utilize all electricity generated at a given node and only that node. This allows for HYSPTAT to consider hybridization, e.g., a combined wind and solar to hydrogen plant, and optimize for the sizes of those technologies. HYPSTAT does not allow for specific electricity generation going to specific hydrogen production technologies (e.g., to represent nuclear electricity paired with solid oxide electrolysis), but this feature may be added in the future.</w:t>
+        <w:t>Hydrogen production technology can utilize all electricity generated at a given node and only that node</w:t>
+      </w:r>
+      <w:ins w:id="128" w:author="Brauch, Joe" w:date="2024-12-23T13:11:00Z" w16du:dateUtc="2024-12-23T18:11:00Z">
+        <w:r>
+          <w:t>, regardless of generation technology</w:t>
+        </w:r>
+      </w:ins>
+      <w:r>
+        <w:t>. This allows for HYSPTAT to consider hybridization, e.g., a combined wind and solar to hydrogen plant, and optimize for the sizes of those technologies. HYPSTAT does not allow for specific electricity generation going to specific hydrogen production technologies (e.g., to represent nuclear electricity paired with solid oxide electrolysis), but this feature may be added in the future.</w:t>
       </w:r>
     </w:p>
     <w:p>
@@ -8715,11 +8713,11 @@
       <w:pPr>
         <w:pStyle w:val="NRELHead03Numbered"/>
       </w:pPr>
-      <w:bookmarkStart w:id="128" w:name="_Toc179465212"/>
+      <w:bookmarkStart w:id="129" w:name="_Toc179465212"/>
       <w:r>
         <w:t>Technology Costs</w:t>
       </w:r>
-      <w:bookmarkEnd w:id="128"/>
+      <w:bookmarkEnd w:id="129"/>
     </w:p>
     <w:p>
       <w:pPr>
@@ -8797,12 +8795,12 @@
       <w:pPr>
         <w:pStyle w:val="NRELFigureCaption"/>
       </w:pPr>
-      <w:bookmarkStart w:id="129" w:name="_Toc263697387"/>
-      <w:bookmarkStart w:id="130" w:name="_Toc291052379"/>
-      <w:bookmarkStart w:id="131" w:name="_Toc346798624"/>
-      <w:bookmarkStart w:id="132" w:name="_Toc352071641"/>
-      <w:bookmarkStart w:id="133" w:name="_Toc352748106"/>
-      <w:bookmarkStart w:id="134" w:name="_Toc97540172"/>
+      <w:bookmarkStart w:id="130" w:name="_Toc263697387"/>
+      <w:bookmarkStart w:id="131" w:name="_Toc291052379"/>
+      <w:bookmarkStart w:id="132" w:name="_Toc346798624"/>
+      <w:bookmarkStart w:id="133" w:name="_Toc352071641"/>
+      <w:bookmarkStart w:id="134" w:name="_Toc352748106"/>
+      <w:bookmarkStart w:id="135" w:name="_Toc97540172"/>
       <w:r>
         <w:t xml:space="preserve">Figure </w:t>
       </w:r>
@@ -8839,12 +8837,12 @@
       <w:r>
         <w:t xml:space="preserve">. </w:t>
       </w:r>
-      <w:bookmarkEnd w:id="129"/>
       <w:bookmarkEnd w:id="130"/>
       <w:bookmarkEnd w:id="131"/>
       <w:bookmarkEnd w:id="132"/>
       <w:bookmarkEnd w:id="133"/>
       <w:bookmarkEnd w:id="134"/>
+      <w:bookmarkEnd w:id="135"/>
       <w:r>
         <w:t>Approximation of pipeline costs used in HYPSTAT</w:t>
       </w:r>
@@ -8864,18 +8862,18 @@
       <w:r>
         <w:t xml:space="preserve">HYPSTAT does not currently support variable OPEX for hydrogen production, since variable OPEX on a per kg basis is inevitable given fixed production to meet the given hydrogen demand </w:t>
       </w:r>
-      <w:commentRangeStart w:id="135"/>
+      <w:commentRangeStart w:id="136"/>
       <w:r>
         <w:t>(i.e., this variable OPEX would not affect the optimization results</w:t>
       </w:r>
-      <w:commentRangeEnd w:id="135"/>
+      <w:commentRangeEnd w:id="136"/>
       <w:r>
         <w:rPr>
           <w:rStyle w:val="CommentReference"/>
           <w:rFonts w:eastAsia="Times New Roman"/>
           <w:color w:val="auto"/>
         </w:rPr>
-        <w:commentReference w:id="135"/>
+        <w:commentReference w:id="136"/>
       </w:r>
       <w:r>
         <w:t>). We recommend that the user adds in or considers variable OPEX for hydrogen production in output processing steps for analyzing results.</w:t>
@@ -8885,21 +8883,29 @@
       <w:pPr>
         <w:pStyle w:val="NRELHead03Numbered"/>
       </w:pPr>
-      <w:bookmarkStart w:id="136" w:name="_Toc179465213"/>
+      <w:bookmarkStart w:id="137" w:name="_Toc179465213"/>
       <w:r>
         <w:t>Imports and Exports</w:t>
       </w:r>
-      <w:bookmarkEnd w:id="136"/>
+      <w:bookmarkEnd w:id="137"/>
     </w:p>
     <w:p>
       <w:pPr>
         <w:pStyle w:val="NRELBodyText"/>
       </w:pPr>
       <w:r>
-        <w:t xml:space="preserve">HYPSTAT also allows for imports and exports in limited capacities, to allow for flexibility in a hydrogen system. Imports and exports are specified by volume limits: i.e., a maximum amount of allowed imports or minimum </w:t>
+        <w:t xml:space="preserve">HYPSTAT also allows for imports and exports in limited capacities, to allow for flexibility in a hydrogen system. Imports and exports are specified by volume limits: i.e., </w:t>
       </w:r>
       <w:proofErr w:type="gramStart"/>
       <w:r>
+        <w:t>a maximum amount</w:t>
+      </w:r>
+      <w:proofErr w:type="gramEnd"/>
+      <w:r>
+        <w:t xml:space="preserve"> of allowed imports or minimum </w:t>
+      </w:r>
+      <w:proofErr w:type="gramStart"/>
+      <w:r>
         <w:t>amount</w:t>
       </w:r>
       <w:proofErr w:type="gramEnd"/>
@@ -8911,11 +8917,11 @@
       <w:pPr>
         <w:pStyle w:val="NRELHead03Numbered"/>
       </w:pPr>
-      <w:bookmarkStart w:id="137" w:name="_Toc179465214"/>
+      <w:bookmarkStart w:id="138" w:name="_Toc179465214"/>
       <w:r>
         <w:t>System Outputs</w:t>
       </w:r>
-      <w:bookmarkEnd w:id="137"/>
+      <w:bookmarkEnd w:id="138"/>
     </w:p>
     <w:p>
       <w:pPr>
@@ -9040,10 +9046,10 @@
       <w:pPr>
         <w:pStyle w:val="NRELBullet02"/>
         <w:rPr>
-          <w:del w:id="138" w:author="Li, Yijin" w:date="2024-12-11T12:43:00Z" w16du:dateUtc="2024-12-11T20:43:00Z"/>
+          <w:del w:id="139" w:author="Li, Yijin" w:date="2024-12-11T12:43:00Z" w16du:dateUtc="2024-12-11T20:43:00Z"/>
         </w:rPr>
       </w:pPr>
-      <w:ins w:id="139" w:author="Li, Yijin" w:date="2024-12-11T12:43:00Z" w16du:dateUtc="2024-12-11T20:43:00Z">
+      <w:ins w:id="140" w:author="Li, Yijin" w:date="2024-12-11T12:43:00Z" w16du:dateUtc="2024-12-11T20:43:00Z">
         <w:r>
           <w:t xml:space="preserve">The extent to which demand is met at each node in each </w:t>
         </w:r>
@@ -9059,7 +9065,7 @@
           <w:t xml:space="preserve"> </w:t>
         </w:r>
       </w:ins>
-      <w:del w:id="140" w:author="Li, Yijin" w:date="2024-12-11T12:43:00Z" w16du:dateUtc="2024-12-11T20:43:00Z">
+      <w:del w:id="141" w:author="Li, Yijin" w:date="2024-12-11T12:43:00Z" w16du:dateUtc="2024-12-11T20:43:00Z">
         <w:r>
           <w:delText>How much demand is met at each node in each time period (to verify that input demand is met, or to see when demand is met in the case of flexible demands)</w:delText>
         </w:r>
@@ -9082,11 +9088,11 @@
       <w:pPr>
         <w:pStyle w:val="NRELHead03Numbered"/>
       </w:pPr>
-      <w:bookmarkStart w:id="141" w:name="_Toc179465215"/>
+      <w:bookmarkStart w:id="142" w:name="_Toc179465215"/>
       <w:r>
         <w:t>Recommended Scope</w:t>
       </w:r>
-      <w:bookmarkEnd w:id="141"/>
+      <w:bookmarkEnd w:id="142"/>
     </w:p>
     <w:p>
       <w:pPr>
@@ -9103,7 +9109,7 @@
       <w:r>
         <w:t xml:space="preserve"> capture intra-year storage dynamics. HYPSTAT is also designed to model systems for a full year, but it can be set up to run for shorter model time windows (e.g., for quick solves and testing). </w:t>
       </w:r>
-      <w:ins w:id="142" w:author="Li, Yijin" w:date="2024-12-11T12:45:00Z" w16du:dateUtc="2024-12-11T20:45:00Z">
+      <w:ins w:id="143" w:author="Li, Yijin" w:date="2024-12-11T12:45:00Z" w16du:dateUtc="2024-12-11T20:45:00Z">
         <w:r>
           <w:t xml:space="preserve">In theory, HYPSTAT could be set up to </w:t>
         </w:r>
@@ -9114,12 +9120,12 @@
           <w:t xml:space="preserve"> periods longer than a year, but this has not been tested.</w:t>
         </w:r>
       </w:ins>
-      <w:ins w:id="143" w:author="Li, Yijin" w:date="2024-12-11T12:46:00Z" w16du:dateUtc="2024-12-11T20:46:00Z">
+      <w:ins w:id="144" w:author="Li, Yijin" w:date="2024-12-11T12:46:00Z" w16du:dateUtc="2024-12-11T20:46:00Z">
         <w:r>
           <w:t xml:space="preserve"> </w:t>
         </w:r>
       </w:ins>
-      <w:del w:id="144" w:author="Li, Yijin" w:date="2024-12-11T12:45:00Z" w16du:dateUtc="2024-12-11T20:45:00Z">
+      <w:del w:id="145" w:author="Li, Yijin" w:date="2024-12-11T12:45:00Z" w16du:dateUtc="2024-12-11T20:45:00Z">
         <w:r>
           <w:delText>In theory, it could be set up to run for more than a year, but this has not been tested.</w:delText>
         </w:r>
@@ -9132,12 +9138,12 @@
       <w:r>
         <w:t>While HYPSTAT is inherently flexible for the scope and scale of the systems it represents, we recommend limiting the scope to roughly these ranges</w:t>
       </w:r>
-      <w:ins w:id="145" w:author="Li, Yijin" w:date="2024-12-11T12:46:00Z" w16du:dateUtc="2024-12-11T20:46:00Z">
+      <w:ins w:id="146" w:author="Li, Yijin" w:date="2024-12-11T12:46:00Z" w16du:dateUtc="2024-12-11T20:46:00Z">
         <w:r>
           <w:t xml:space="preserve"> </w:t>
         </w:r>
       </w:ins>
-      <w:ins w:id="146" w:author="Li, Yijin" w:date="2024-12-11T12:48:00Z" w16du:dateUtc="2024-12-11T20:48:00Z">
+      <w:ins w:id="147" w:author="Li, Yijin" w:date="2024-12-11T12:48:00Z" w16du:dateUtc="2024-12-11T20:48:00Z">
         <w:r>
           <w:t xml:space="preserve">for a single HYPSTAT run. However, multiple runs can be submitted either in parallel </w:t>
         </w:r>
@@ -9507,12 +9513,12 @@
       <w:pPr>
         <w:pStyle w:val="NRELHead02Numbered"/>
       </w:pPr>
-      <w:bookmarkStart w:id="147" w:name="_Toc179465216"/>
+      <w:bookmarkStart w:id="148" w:name="_Toc179465216"/>
       <w:r>
         <w:lastRenderedPageBreak/>
         <w:t>Workflow</w:t>
       </w:r>
-      <w:bookmarkEnd w:id="147"/>
+      <w:bookmarkEnd w:id="148"/>
     </w:p>
     <w:p>
       <w:pPr>
@@ -9529,7 +9535,7 @@
       <w:r>
         <w:t xml:space="preserve">HYPSTAT’s default way of solving a problem involves a two-step process which </w:t>
       </w:r>
-      <w:del w:id="148" w:author="Li, Yijin" w:date="2024-12-11T16:23:00Z" w16du:dateUtc="2024-12-12T00:23:00Z">
+      <w:del w:id="149" w:author="Li, Yijin" w:date="2024-12-11T16:23:00Z" w16du:dateUtc="2024-12-12T00:23:00Z">
         <w:r>
           <w:delText xml:space="preserve">actually </w:delText>
         </w:r>
@@ -9542,7 +9548,7 @@
       <w:pPr>
         <w:pStyle w:val="NRELHead03Numbered"/>
       </w:pPr>
-      <w:bookmarkStart w:id="149" w:name="_Toc179465217"/>
+      <w:bookmarkStart w:id="150" w:name="_Toc179465217"/>
       <w:r>
         <w:t xml:space="preserve">Input </w:t>
       </w:r>
@@ -9552,7 +9558,7 @@
       <w:r>
         <w:t>andling</w:t>
       </w:r>
-      <w:bookmarkEnd w:id="149"/>
+      <w:bookmarkEnd w:id="150"/>
     </w:p>
     <w:p>
       <w:pPr>
@@ -9596,12 +9602,12 @@
       <w:r>
         <w:t>The electricity generation and hydrogen storage technologies</w:t>
       </w:r>
-      <w:ins w:id="150" w:author="Li, Yijin" w:date="2024-12-11T16:25:00Z" w16du:dateUtc="2024-12-12T00:25:00Z">
+      <w:ins w:id="151" w:author="Li, Yijin" w:date="2024-12-11T16:25:00Z" w16du:dateUtc="2024-12-12T00:25:00Z">
         <w:r>
           <w:t xml:space="preserve"> </w:t>
         </w:r>
       </w:ins>
-      <w:del w:id="151" w:author="Li, Yijin" w:date="2024-12-11T16:25:00Z" w16du:dateUtc="2024-12-12T00:25:00Z">
+      <w:del w:id="152" w:author="Li, Yijin" w:date="2024-12-11T16:25:00Z" w16du:dateUtc="2024-12-12T00:25:00Z">
         <w:r>
           <w:delText xml:space="preserve"> which are considered </w:delText>
         </w:r>
@@ -9676,7 +9682,7 @@
       <w:pPr>
         <w:pStyle w:val="NRELHead03Numbered"/>
       </w:pPr>
-      <w:bookmarkStart w:id="152" w:name="_Toc179465218"/>
+      <w:bookmarkStart w:id="153" w:name="_Toc179465218"/>
       <w:r>
         <w:t xml:space="preserve">Model </w:t>
       </w:r>
@@ -9686,7 +9692,7 @@
       <w:r>
         <w:t>ormulation</w:t>
       </w:r>
-      <w:bookmarkEnd w:id="152"/>
+      <w:bookmarkEnd w:id="153"/>
     </w:p>
     <w:p>
       <w:pPr>
@@ -9720,7 +9726,7 @@
       <w:pPr>
         <w:pStyle w:val="NRELHead03Numbered"/>
       </w:pPr>
-      <w:bookmarkStart w:id="153" w:name="_Toc179465219"/>
+      <w:bookmarkStart w:id="154" w:name="_Toc179465219"/>
       <w:r>
         <w:t xml:space="preserve">Solving the </w:t>
       </w:r>
@@ -9730,7 +9736,7 @@
       <w:r>
         <w:t>odel</w:t>
       </w:r>
-      <w:bookmarkEnd w:id="153"/>
+      <w:bookmarkEnd w:id="154"/>
     </w:p>
     <w:p>
       <w:pPr>
@@ -9895,11 +9901,11 @@
       <w:pPr>
         <w:pStyle w:val="NRELHead03Numbered"/>
       </w:pPr>
-      <w:bookmarkStart w:id="154" w:name="_Toc179465220"/>
+      <w:bookmarkStart w:id="155" w:name="_Toc179465220"/>
       <w:r>
         <w:t>Recommended Two-Step Solve Process</w:t>
       </w:r>
-      <w:bookmarkEnd w:id="154"/>
+      <w:bookmarkEnd w:id="155"/>
     </w:p>
     <w:p>
       <w:pPr>
@@ -10018,7 +10024,7 @@
       <w:pPr>
         <w:pStyle w:val="NRELHead03Numbered"/>
       </w:pPr>
-      <w:bookmarkStart w:id="155" w:name="_Toc179465221"/>
+      <w:bookmarkStart w:id="156" w:name="_Toc179465221"/>
       <w:r>
         <w:t xml:space="preserve">Writing </w:t>
       </w:r>
@@ -10028,7 +10034,7 @@
       <w:r>
         <w:t>utputs</w:t>
       </w:r>
-      <w:bookmarkEnd w:id="155"/>
+      <w:bookmarkEnd w:id="156"/>
     </w:p>
     <w:p>
       <w:pPr>
@@ -10066,11 +10072,11 @@
       <w:pPr>
         <w:pStyle w:val="NRELHead02Numbered"/>
       </w:pPr>
-      <w:bookmarkStart w:id="156" w:name="_Toc179465222"/>
+      <w:bookmarkStart w:id="157" w:name="_Toc179465222"/>
       <w:r>
         <w:t>Inputs</w:t>
       </w:r>
-      <w:bookmarkEnd w:id="156"/>
+      <w:bookmarkEnd w:id="157"/>
     </w:p>
     <w:p>
       <w:pPr>
@@ -10092,11 +10098,11 @@
       <w:pPr>
         <w:pStyle w:val="NRELHead03Numbered"/>
       </w:pPr>
-      <w:bookmarkStart w:id="157" w:name="_Toc179465223"/>
+      <w:bookmarkStart w:id="158" w:name="_Toc179465223"/>
       <w:r>
         <w:t>YAML File</w:t>
       </w:r>
-      <w:bookmarkEnd w:id="157"/>
+      <w:bookmarkEnd w:id="158"/>
     </w:p>
     <w:p>
       <w:pPr>
@@ -10367,7 +10373,7 @@
       <w:pPr>
         <w:pStyle w:val="NRELHead03Numbered"/>
       </w:pPr>
-      <w:bookmarkStart w:id="158" w:name="_Toc179465224"/>
+      <w:bookmarkStart w:id="159" w:name="_Toc179465224"/>
       <w:r>
         <w:t xml:space="preserve">Individual </w:t>
       </w:r>
@@ -10383,7 +10389,7 @@
       <w:r>
         <w:t>iles</w:t>
       </w:r>
-      <w:bookmarkEnd w:id="158"/>
+      <w:bookmarkEnd w:id="159"/>
     </w:p>
     <w:p>
       <w:pPr>
@@ -16985,11 +16991,11 @@
       <w:pPr>
         <w:pStyle w:val="NRELHead02Numbered"/>
       </w:pPr>
-      <w:bookmarkStart w:id="159" w:name="_Toc179465225"/>
+      <w:bookmarkStart w:id="160" w:name="_Toc179465225"/>
       <w:r>
         <w:t>Outputs</w:t>
       </w:r>
-      <w:bookmarkEnd w:id="159"/>
+      <w:bookmarkEnd w:id="160"/>
     </w:p>
     <w:p>
       <w:pPr>
@@ -17006,11 +17012,11 @@
       <w:pPr>
         <w:pStyle w:val="NRELHead03Numbered"/>
       </w:pPr>
-      <w:bookmarkStart w:id="160" w:name="_Toc179465226"/>
+      <w:bookmarkStart w:id="161" w:name="_Toc179465226"/>
       <w:r>
         <w:t>Output Files</w:t>
       </w:r>
-      <w:bookmarkEnd w:id="160"/>
+      <w:bookmarkEnd w:id="161"/>
     </w:p>
     <w:p>
       <w:pPr>
@@ -17658,7 +17664,25 @@
                 <w:sz w:val="20"/>
                 <w:szCs w:val="20"/>
               </w:rPr>
-              <w:t xml:space="preserve">Shows the capacities of electricity generation technologies, hydrogen production, and hydrogen storage at each node (in their respective capacity units). It also shows a category, ‘H2_Unserved_Capacity’, which is the maximum amount of unserved hydrogen in </w:t>
+              <w:t xml:space="preserve">Shows the capacities of electricity generation technologies, hydrogen production, and hydrogen storage at each node (in their respective capacity units). It also shows a </w:t>
+            </w:r>
+            <w:proofErr w:type="gramStart"/>
+            <w:r>
+              <w:rPr>
+                <w:rFonts w:ascii="Arial" w:hAnsi="Arial" w:cs="Arial"/>
+                <w:sz w:val="20"/>
+                <w:szCs w:val="20"/>
+              </w:rPr>
+              <w:t>category, ‘</w:t>
+            </w:r>
+            <w:proofErr w:type="gramEnd"/>
+            <w:r>
+              <w:rPr>
+                <w:rFonts w:ascii="Arial" w:hAnsi="Arial" w:cs="Arial"/>
+                <w:sz w:val="20"/>
+                <w:szCs w:val="20"/>
+              </w:rPr>
+              <w:t xml:space="preserve">H2_Unserved_Capacity’, which is the maximum amount of unserved hydrogen in </w:t>
             </w:r>
             <w:proofErr w:type="gramStart"/>
             <w:r>
@@ -18770,11 +18794,11 @@
       <w:pPr>
         <w:pStyle w:val="NRELHead03Numbered"/>
       </w:pPr>
-      <w:bookmarkStart w:id="161" w:name="_Toc179465227"/>
+      <w:bookmarkStart w:id="162" w:name="_Toc179465227"/>
       <w:r>
         <w:t>Suggested use of outputs</w:t>
       </w:r>
-      <w:bookmarkEnd w:id="161"/>
+      <w:bookmarkEnd w:id="162"/>
     </w:p>
     <w:p>
       <w:pPr>
@@ -18957,16 +18981,16 @@
       <w:pPr>
         <w:pStyle w:val="NRELHead01Numbered"/>
       </w:pPr>
-      <w:bookmarkStart w:id="162" w:name="_Toc100058849"/>
-      <w:bookmarkStart w:id="163" w:name="_Toc100827778"/>
-      <w:bookmarkStart w:id="164" w:name="_Toc179465228"/>
-      <w:bookmarkEnd w:id="162"/>
+      <w:bookmarkStart w:id="163" w:name="_Toc100058849"/>
+      <w:bookmarkStart w:id="164" w:name="_Toc100827778"/>
+      <w:bookmarkStart w:id="165" w:name="_Toc179465228"/>
       <w:bookmarkEnd w:id="163"/>
+      <w:bookmarkEnd w:id="164"/>
       <w:r>
         <w:lastRenderedPageBreak/>
         <w:t>A Simple Case Study</w:t>
       </w:r>
-      <w:bookmarkEnd w:id="164"/>
+      <w:bookmarkEnd w:id="165"/>
     </w:p>
     <w:p>
       <w:pPr>
@@ -19029,21 +19053,21 @@
       <w:pPr>
         <w:pStyle w:val="NRELHead02Numbered"/>
       </w:pPr>
-      <w:bookmarkStart w:id="165" w:name="_Toc179465229"/>
+      <w:bookmarkStart w:id="166" w:name="_Toc179465229"/>
       <w:r>
         <w:t>Case Design</w:t>
       </w:r>
-      <w:bookmarkEnd w:id="165"/>
+      <w:bookmarkEnd w:id="166"/>
     </w:p>
     <w:p>
       <w:pPr>
         <w:pStyle w:val="NRELHead03Numbered"/>
       </w:pPr>
-      <w:bookmarkStart w:id="166" w:name="_Toc179465230"/>
+      <w:bookmarkStart w:id="167" w:name="_Toc179465230"/>
       <w:r>
         <w:t>Nodes and Network</w:t>
       </w:r>
-      <w:bookmarkEnd w:id="166"/>
+      <w:bookmarkEnd w:id="167"/>
     </w:p>
     <w:p>
       <w:pPr>
@@ -21442,7 +21466,7 @@
       <w:pPr>
         <w:pStyle w:val="NRELHead03Numbered"/>
       </w:pPr>
-      <w:bookmarkStart w:id="167" w:name="_Toc179465231"/>
+      <w:bookmarkStart w:id="168" w:name="_Toc179465231"/>
       <w:r>
         <w:lastRenderedPageBreak/>
         <w:t>Technologies and Cost Reference</w:t>
@@ -21450,7 +21474,7 @@
       <w:r>
         <w:t>s</w:t>
       </w:r>
-      <w:bookmarkEnd w:id="167"/>
+      <w:bookmarkEnd w:id="168"/>
     </w:p>
     <w:p>
       <w:pPr>
@@ -21682,16 +21706,16 @@
             <w:hideMark/>
           </w:tcPr>
           <w:p>
-            <w:commentRangeStart w:id="168"/>
+            <w:commentRangeStart w:id="169"/>
             <w:r>
               <w:t>LCOE from H2@Scale</w:t>
             </w:r>
-            <w:commentRangeEnd w:id="168"/>
+            <w:commentRangeEnd w:id="169"/>
             <w:r>
               <w:rPr>
                 <w:rStyle w:val="CommentReference"/>
               </w:rPr>
-              <w:commentReference w:id="168"/>
+              <w:commentReference w:id="169"/>
             </w:r>
           </w:p>
         </w:tc>
@@ -21994,7 +22018,7 @@
       <w:pPr>
         <w:pStyle w:val="NRELHead02Numbered"/>
       </w:pPr>
-      <w:bookmarkStart w:id="169" w:name="_Toc179465232"/>
+      <w:bookmarkStart w:id="170" w:name="_Toc179465232"/>
       <w:r>
         <w:t xml:space="preserve">Potential Considerations for </w:t>
       </w:r>
@@ -22004,13 +22028,13 @@
       <w:r>
         <w:t xml:space="preserve"> Processing</w:t>
       </w:r>
-      <w:bookmarkEnd w:id="169"/>
+      <w:bookmarkEnd w:id="170"/>
     </w:p>
     <w:p>
       <w:pPr>
         <w:pStyle w:val="NRELHead03Numbered"/>
       </w:pPr>
-      <w:bookmarkStart w:id="170" w:name="_Toc179465233"/>
+      <w:bookmarkStart w:id="171" w:name="_Toc179465233"/>
       <w:r>
         <w:t>Hydrogen Cost Calculation</w:t>
       </w:r>
@@ -22020,7 +22044,7 @@
       <w:r>
         <w:t>: Total CAPEX, OPEX, and Levelized Costs</w:t>
       </w:r>
-      <w:bookmarkEnd w:id="170"/>
+      <w:bookmarkEnd w:id="171"/>
     </w:p>
     <w:p>
       <w:pPr>
@@ -22861,11 +22885,11 @@
       <w:pPr>
         <w:pStyle w:val="NRELHead03Numbered"/>
       </w:pPr>
-      <w:bookmarkStart w:id="171" w:name="_Toc179465234"/>
+      <w:bookmarkStart w:id="172" w:name="_Toc179465234"/>
       <w:r>
         <w:t>System Design</w:t>
       </w:r>
-      <w:bookmarkEnd w:id="171"/>
+      <w:bookmarkEnd w:id="172"/>
     </w:p>
     <w:p>
       <w:pPr>
@@ -22991,11 +23015,11 @@
       <w:pPr>
         <w:pStyle w:val="NRELHead03Numbered"/>
       </w:pPr>
-      <w:bookmarkStart w:id="172" w:name="_Toc179465235"/>
+      <w:bookmarkStart w:id="173" w:name="_Toc179465235"/>
       <w:r>
         <w:t>Operating Dynamics for RE, Electrolyzers, Transmission, and Storage</w:t>
       </w:r>
-      <w:bookmarkEnd w:id="172"/>
+      <w:bookmarkEnd w:id="173"/>
     </w:p>
     <w:p>
       <w:pPr>
@@ -23058,11 +23082,11 @@
       <w:pPr>
         <w:pStyle w:val="NRELHead03Numbered"/>
       </w:pPr>
-      <w:bookmarkStart w:id="173" w:name="_Toc179465236"/>
+      <w:bookmarkStart w:id="174" w:name="_Toc179465236"/>
       <w:r>
         <w:t>Levelized Cost of Electricity (LCOE) and Capacity Factors</w:t>
       </w:r>
-      <w:bookmarkEnd w:id="173"/>
+      <w:bookmarkEnd w:id="174"/>
     </w:p>
     <w:p>
       <w:pPr>
@@ -23321,16 +23345,16 @@
       <w:r>
         <w:br w:type="page"/>
       </w:r>
-      <w:bookmarkStart w:id="174" w:name="_Toc314823692"/>
-      <w:bookmarkStart w:id="175" w:name="_Toc352071762"/>
-      <w:bookmarkStart w:id="176" w:name="_Toc179465237"/>
+      <w:bookmarkStart w:id="175" w:name="_Toc314823692"/>
+      <w:bookmarkStart w:id="176" w:name="_Toc352071762"/>
+      <w:bookmarkStart w:id="177" w:name="_Toc179465237"/>
       <w:r>
         <w:lastRenderedPageBreak/>
         <w:t>Glossary</w:t>
       </w:r>
-      <w:bookmarkEnd w:id="174"/>
       <w:bookmarkEnd w:id="175"/>
       <w:bookmarkEnd w:id="176"/>
+      <w:bookmarkEnd w:id="177"/>
     </w:p>
     <w:tbl>
       <w:tblPr>
@@ -23619,16 +23643,16 @@
       <w:r>
         <w:br w:type="page"/>
       </w:r>
-      <w:bookmarkStart w:id="177" w:name="_Toc314823693"/>
-      <w:bookmarkStart w:id="178" w:name="_Toc352071763"/>
-      <w:bookmarkStart w:id="179" w:name="_Toc179465238"/>
+      <w:bookmarkStart w:id="178" w:name="_Toc314823693"/>
+      <w:bookmarkStart w:id="179" w:name="_Toc352071763"/>
+      <w:bookmarkStart w:id="180" w:name="_Toc179465238"/>
       <w:r>
         <w:lastRenderedPageBreak/>
         <w:t>References</w:t>
       </w:r>
-      <w:bookmarkEnd w:id="177"/>
       <w:bookmarkEnd w:id="178"/>
       <w:bookmarkEnd w:id="179"/>
+      <w:bookmarkEnd w:id="180"/>
       <w:r>
         <w:t xml:space="preserve"> </w:t>
       </w:r>
@@ -23878,7 +23902,7 @@
       <w:pPr>
         <w:pStyle w:val="NRELHead01"/>
       </w:pPr>
-      <w:bookmarkStart w:id="180" w:name="_Toc179465239"/>
+      <w:bookmarkStart w:id="181" w:name="_Toc179465239"/>
       <w:r>
         <w:lastRenderedPageBreak/>
         <w:t xml:space="preserve">Appendix </w:t>
@@ -23886,7 +23910,7 @@
       <w:r>
         <w:t>A: HYPSTAT Optimization Formulation</w:t>
       </w:r>
-      <w:bookmarkEnd w:id="180"/>
+      <w:bookmarkEnd w:id="181"/>
     </w:p>
     <w:bookmarkEnd w:id="0"/>
     <w:bookmarkEnd w:id="1"/>
@@ -24208,7 +24232,15 @@
             </w:r>
             <w:proofErr w:type="gramEnd"/>
             <w:r>
-              <w:t xml:space="preserve"> node, ‘B to A’ does not need to be in the set.</w:t>
+              <w:t xml:space="preserve"> </w:t>
+            </w:r>
+            <w:proofErr w:type="gramStart"/>
+            <w:r>
+              <w:t>node, ‘</w:t>
+            </w:r>
+            <w:proofErr w:type="gramEnd"/>
+            <w:r>
+              <w:t>B to A’ does not need to be in the set.</w:t>
             </w:r>
           </w:p>
         </w:tc>
@@ -26494,7 +26526,15 @@
           </w:tcPr>
           <w:p>
             <w:r>
-              <w:t xml:space="preserve">The amount of hydrogen exported to outside the system at each node in each </w:t>
+              <w:t xml:space="preserve">The amount of hydrogen </w:t>
+            </w:r>
+            <w:proofErr w:type="gramStart"/>
+            <w:r>
+              <w:t>exported to</w:t>
+            </w:r>
+            <w:proofErr w:type="gramEnd"/>
+            <w:r>
+              <w:t xml:space="preserve"> outside the system at each node in each </w:t>
             </w:r>
             <w:proofErr w:type="gramStart"/>
             <w:r>
@@ -27150,7 +27190,15 @@
           </w:tcPr>
           <w:p>
             <w:r>
-              <w:t xml:space="preserve">The hydrogen flow between zones for each link in each </w:t>
+              <w:t xml:space="preserve">The hydrogen </w:t>
+            </w:r>
+            <w:proofErr w:type="gramStart"/>
+            <w:r>
+              <w:t>flow</w:t>
+            </w:r>
+            <w:proofErr w:type="gramEnd"/>
+            <w:r>
+              <w:t xml:space="preserve"> between zones for each link in each </w:t>
             </w:r>
             <w:proofErr w:type="gramStart"/>
             <w:r>
@@ -27291,7 +27339,15 @@
           </w:tcPr>
           <w:p>
             <w:r>
-              <w:t xml:space="preserve">The hydrogen flow between zones for each link in each </w:t>
+              <w:t xml:space="preserve">The hydrogen </w:t>
+            </w:r>
+            <w:proofErr w:type="gramStart"/>
+            <w:r>
+              <w:t>flow</w:t>
+            </w:r>
+            <w:proofErr w:type="gramEnd"/>
+            <w:r>
+              <w:t xml:space="preserve"> between zones for each link in each </w:t>
             </w:r>
             <w:proofErr w:type="gramStart"/>
             <w:r>
@@ -27432,7 +27488,15 @@
           </w:tcPr>
           <w:p>
             <w:r>
-              <w:t xml:space="preserve">The hydrogen flow between zones for each link in each </w:t>
+              <w:t xml:space="preserve">The hydrogen </w:t>
+            </w:r>
+            <w:proofErr w:type="gramStart"/>
+            <w:r>
+              <w:t>flow</w:t>
+            </w:r>
+            <w:proofErr w:type="gramEnd"/>
+            <w:r>
+              <w:t xml:space="preserve"> between zones for each link in each </w:t>
             </w:r>
             <w:proofErr w:type="gramStart"/>
             <w:r>
@@ -27838,7 +27902,7 @@
       <w:pPr>
         <w:pStyle w:val="NRELHead03"/>
       </w:pPr>
-      <w:bookmarkStart w:id="181" w:name="_Toc179465240"/>
+      <w:bookmarkStart w:id="182" w:name="_Toc179465240"/>
       <w:r>
         <w:t xml:space="preserve">Demand </w:t>
       </w:r>
@@ -27848,7 +27912,7 @@
       <w:r>
         <w:t>onstraints</w:t>
       </w:r>
-      <w:bookmarkEnd w:id="181"/>
+      <w:bookmarkEnd w:id="182"/>
     </w:p>
     <w:p>
       <w:pPr>
@@ -28309,7 +28373,7 @@
       <w:pPr>
         <w:pStyle w:val="NRELHead03"/>
       </w:pPr>
-      <w:bookmarkStart w:id="182" w:name="_Toc179465241"/>
+      <w:bookmarkStart w:id="183" w:name="_Toc179465241"/>
       <w:r>
         <w:t xml:space="preserve">Import and </w:t>
       </w:r>
@@ -28325,7 +28389,7 @@
       <w:r>
         <w:t>onstraints</w:t>
       </w:r>
-      <w:bookmarkEnd w:id="182"/>
+      <w:bookmarkEnd w:id="183"/>
     </w:p>
     <w:p>
       <w:pPr>
@@ -28888,14 +28952,14 @@
       <w:pPr>
         <w:pStyle w:val="NRELHead03"/>
       </w:pPr>
-      <w:bookmarkStart w:id="183" w:name="_Toc179465242"/>
+      <w:bookmarkStart w:id="184" w:name="_Toc179465242"/>
       <w:r>
         <w:t xml:space="preserve">Storage </w:t>
       </w:r>
       <w:r>
         <w:t>Constraints</w:t>
       </w:r>
-      <w:bookmarkEnd w:id="183"/>
+      <w:bookmarkEnd w:id="184"/>
     </w:p>
     <w:p>
       <w:pPr>
@@ -30079,14 +30143,14 @@
       <w:pPr>
         <w:pStyle w:val="NRELHead03"/>
       </w:pPr>
-      <w:bookmarkStart w:id="184" w:name="_Toc179465243"/>
+      <w:bookmarkStart w:id="185" w:name="_Toc179465243"/>
       <w:r>
         <w:t xml:space="preserve">Link </w:t>
       </w:r>
       <w:r>
         <w:t>Flow Constraints</w:t>
       </w:r>
-      <w:bookmarkEnd w:id="184"/>
+      <w:bookmarkEnd w:id="185"/>
     </w:p>
     <w:p>
       <w:pPr>
@@ -31445,7 +31509,15 @@
         <w:t xml:space="preserve"> </w:t>
       </w:r>
       <w:r>
-        <w:t xml:space="preserve">is used for a mixed-integer optimization. For a fully linear optimization which only optimizes pipeline sizes and not locations, </w:t>
+        <w:t xml:space="preserve">is used for </w:t>
+      </w:r>
+      <w:proofErr w:type="gramStart"/>
+      <w:r>
+        <w:t>a mixed</w:t>
+      </w:r>
+      <w:proofErr w:type="gramEnd"/>
+      <w:r>
+        <w:t xml:space="preserve">-integer optimization. For a fully linear optimization which only optimizes pipeline sizes and not locations, </w:t>
       </w:r>
       <w:proofErr w:type="spellStart"/>
       <w:r>
@@ -31520,14 +31592,14 @@
       <w:pPr>
         <w:pStyle w:val="NRELHead03"/>
       </w:pPr>
-      <w:bookmarkStart w:id="185" w:name="_Toc179465244"/>
+      <w:bookmarkStart w:id="186" w:name="_Toc179465244"/>
       <w:r>
         <w:t>Production</w:t>
       </w:r>
       <w:r>
         <w:t xml:space="preserve"> Constraints</w:t>
       </w:r>
-      <w:bookmarkEnd w:id="185"/>
+      <w:bookmarkEnd w:id="186"/>
     </w:p>
     <w:p>
       <w:pPr>
@@ -32638,14 +32710,14 @@
       <w:pPr>
         <w:pStyle w:val="NRELHead03"/>
       </w:pPr>
-      <w:bookmarkStart w:id="186" w:name="_Toc179465245"/>
+      <w:bookmarkStart w:id="187" w:name="_Toc179465245"/>
       <w:r>
         <w:t xml:space="preserve">Power </w:t>
       </w:r>
       <w:r>
         <w:t>Balance Constraint</w:t>
       </w:r>
-      <w:bookmarkEnd w:id="186"/>
+      <w:bookmarkEnd w:id="187"/>
     </w:p>
     <w:p>
       <w:pPr>
@@ -33102,7 +33174,7 @@
           <w:iCs/>
         </w:rPr>
       </w:pPr>
-      <w:bookmarkStart w:id="187" w:name="_Toc179465246"/>
+      <w:bookmarkStart w:id="188" w:name="_Toc179465246"/>
       <w:r>
         <w:lastRenderedPageBreak/>
         <w:t xml:space="preserve">Transmission and </w:t>
@@ -33125,7 +33197,7 @@
       <w:r>
         <w:t>onstraints</w:t>
       </w:r>
-      <w:bookmarkEnd w:id="187"/>
+      <w:bookmarkEnd w:id="188"/>
     </w:p>
     <w:p>
       <w:pPr>
@@ -34009,7 +34081,7 @@
       <w:pPr>
         <w:pStyle w:val="NRELHead02Numbered"/>
       </w:pPr>
-      <w:bookmarkStart w:id="188" w:name="_Toc179465247"/>
+      <w:bookmarkStart w:id="189" w:name="_Toc179465247"/>
       <w:r>
         <w:lastRenderedPageBreak/>
         <w:t>O</w:t>
@@ -34023,7 +34095,7 @@
       <w:r>
         <w:t>unction</w:t>
       </w:r>
-      <w:bookmarkEnd w:id="188"/>
+      <w:bookmarkEnd w:id="189"/>
     </w:p>
     <w:p>
       <w:pPr>
@@ -35644,7 +35716,7 @@
 
 <file path=word/comments.xml><?xml version="1.0" encoding="utf-8"?>
 <w:comments xmlns:wpc="http://schemas.microsoft.com/office/word/2010/wordprocessingCanvas" xmlns:cx="http://schemas.microsoft.com/office/drawing/2014/chartex" xmlns:cx1="http://schemas.microsoft.com/office/drawing/2015/9/8/chartex" xmlns:cx2="http://schemas.microsoft.com/office/drawing/2015/10/21/chartex" xmlns:cx3="http://schemas.microsoft.com/office/drawing/2016/5/9/chartex" xmlns:cx4="http://schemas.microsoft.com/office/drawing/2016/5/10/chartex" xmlns:cx5="http://schemas.microsoft.com/office/drawing/2016/5/11/chartex" xmlns:cx6="http://schemas.microsoft.com/office/drawing/2016/5/12/chartex" xmlns:cx7="http://schemas.microsoft.com/office/drawing/2016/5/13/chartex" xmlns:cx8="http://schemas.microsoft.com/office/drawing/2016/5/14/chartex" xmlns:mc="http://schemas.openxmlformats.org/markup-compatibility/2006" xmlns:aink="http://schemas.microsoft.com/office/drawing/2016/ink" xmlns:am3d="http://schemas.microsoft.com/office/drawing/2017/model3d" xmlns:o="urn:schemas-microsoft-com:office:office" xmlns:oel="http://schemas.microsoft.com/office/2019/extlst" xmlns:r="http://schemas.openxmlformats.org/officeDocument/2006/relationships" xmlns:m="http://schemas.openxmlformats.org/officeDocument/2006/math" xmlns:v="urn:schemas-microsoft-com:vml" xmlns:wp14="http://schemas.microsoft.com/office/word/2010/wordprocessingDrawing" xmlns:wp="http://schemas.openxmlformats.org/drawingml/2006/wordprocessingDrawing" xmlns:w10="urn:schemas-microsoft-com:office:word" xmlns:w="http://schemas.openxmlformats.org/wordprocessingml/2006/main" xmlns:w14="http://schemas.microsoft.com/office/word/2010/wordml" xmlns:w15="http://schemas.microsoft.com/office/word/2012/wordml" xmlns:w16cex="http://schemas.microsoft.com/office/word/2018/wordml/cex" xmlns:w16cid="http://schemas.microsoft.com/office/word/2016/wordml/cid" xmlns:w16="http://schemas.microsoft.com/office/word/2018/wordml" xmlns:w16du="http://schemas.microsoft.com/office/word/2023/wordml/word16du" xmlns:w16sdtdh="http://schemas.microsoft.com/office/word/2020/wordml/sdtdatahash" xmlns:w16se="http://schemas.microsoft.com/office/word/2015/wordml/symex" xmlns:wpg="http://schemas.microsoft.com/office/word/2010/wordprocessingGroup" xmlns:wpi="http://schemas.microsoft.com/office/word/2010/wordprocessingInk" xmlns:wne="http://schemas.microsoft.com/office/word/2006/wordml" xmlns:wps="http://schemas.microsoft.com/office/word/2010/wordprocessingShape" mc:Ignorable="w14 w15 w16se w16cid w16 w16cex w16sdtdh w16du wp14">
-  <w:comment w:id="135" w:author="Li, Yijin" w:date="2024-12-11T12:40:00Z" w:initials="YL">
+  <w:comment w:id="136" w:author="Li, Yijin" w:date="2024-12-11T12:40:00Z" w:initials="YL">
     <w:p>
       <w:r>
         <w:rPr>
@@ -35669,7 +35741,7 @@
       </w:r>
     </w:p>
   </w:comment>
-  <w:comment w:id="168" w:author="Li, Yijin" w:date="2024-09-10T20:58:00Z" w:initials="LY">
+  <w:comment w:id="169" w:author="Li, Yijin" w:date="2024-09-10T20:58:00Z" w:initials="LY">
     <w:p>
       <w:r>
         <w:rPr>
@@ -39021,6 +39093,9 @@
 <w15:people xmlns:wpc="http://schemas.microsoft.com/office/word/2010/wordprocessingCanvas" xmlns:cx="http://schemas.microsoft.com/office/drawing/2014/chartex" xmlns:cx1="http://schemas.microsoft.com/office/drawing/2015/9/8/chartex" xmlns:cx2="http://schemas.microsoft.com/office/drawing/2015/10/21/chartex" xmlns:cx3="http://schemas.microsoft.com/office/drawing/2016/5/9/chartex" xmlns:cx4="http://schemas.microsoft.com/office/drawing/2016/5/10/chartex" xmlns:cx5="http://schemas.microsoft.com/office/drawing/2016/5/11/chartex" xmlns:cx6="http://schemas.microsoft.com/office/drawing/2016/5/12/chartex" xmlns:cx7="http://schemas.microsoft.com/office/drawing/2016/5/13/chartex" xmlns:cx8="http://schemas.microsoft.com/office/drawing/2016/5/14/chartex" xmlns:mc="http://schemas.openxmlformats.org/markup-compatibility/2006" xmlns:aink="http://schemas.microsoft.com/office/drawing/2016/ink" xmlns:am3d="http://schemas.microsoft.com/office/drawing/2017/model3d" xmlns:o="urn:schemas-microsoft-com:office:office" xmlns:oel="http://schemas.microsoft.com/office/2019/extlst" xmlns:r="http://schemas.openxmlformats.org/officeDocument/2006/relationships" xmlns:m="http://schemas.openxmlformats.org/officeDocument/2006/math" xmlns:v="urn:schemas-microsoft-com:vml" xmlns:wp14="http://schemas.microsoft.com/office/word/2010/wordprocessingDrawing" xmlns:wp="http://schemas.openxmlformats.org/drawingml/2006/wordprocessingDrawing" xmlns:w10="urn:schemas-microsoft-com:office:word" xmlns:w="http://schemas.openxmlformats.org/wordprocessingml/2006/main" xmlns:w14="http://schemas.microsoft.com/office/word/2010/wordml" xmlns:w15="http://schemas.microsoft.com/office/word/2012/wordml" xmlns:w16cex="http://schemas.microsoft.com/office/word/2018/wordml/cex" xmlns:w16cid="http://schemas.microsoft.com/office/word/2016/wordml/cid" xmlns:w16="http://schemas.microsoft.com/office/word/2018/wordml" xmlns:w16du="http://schemas.microsoft.com/office/word/2023/wordml/word16du" xmlns:w16sdtdh="http://schemas.microsoft.com/office/word/2020/wordml/sdtdatahash" xmlns:w16se="http://schemas.microsoft.com/office/word/2015/wordml/symex" xmlns:wpg="http://schemas.microsoft.com/office/word/2010/wordprocessingGroup" xmlns:wpi="http://schemas.microsoft.com/office/word/2010/wordprocessingInk" xmlns:wne="http://schemas.microsoft.com/office/word/2006/wordml" xmlns:wps="http://schemas.microsoft.com/office/word/2010/wordprocessingShape" mc:Ignorable="w14 w15 w16se w16cid w16 w16cex w16sdtdh w16du wp14">
   <w15:person w15:author="Li, Yijin">
     <w15:presenceInfo w15:providerId="AD" w15:userId="S::yli6@nrel.gov::edae5541-7fb9-41b6-b415-ed39d6d065ce"/>
+  </w15:person>
+  <w15:person w15:author="Brauch, Joe">
+    <w15:presenceInfo w15:providerId="AD" w15:userId="S::jbrauch@nrel.gov::ca12666d-7e87-48c5-8247-4c52ab393435"/>
   </w15:person>
 </w15:people>
 </file>
@@ -41472,12 +41547,6 @@
 </file>
 
 <file path=customXml/item1.xml><?xml version="1.0" encoding="utf-8"?>
-<p:properties xmlns:p="http://schemas.microsoft.com/office/2006/metadata/properties" xmlns:xsi="http://www.w3.org/2001/XMLSchema-instance" xmlns:pc="http://schemas.microsoft.com/office/infopath/2007/PartnerControls">
-  <documentManagement/>
-</p:properties>
-</file>
-
-<file path=customXml/item2.xml><?xml version="1.0" encoding="utf-8"?>
 <ct:contentTypeSchema xmlns:ct="http://schemas.microsoft.com/office/2006/metadata/contentType" xmlns:ma="http://schemas.microsoft.com/office/2006/metadata/properties/metaAttributes" ct:_="" ma:_="" ma:contentTypeName="Document" ma:contentTypeID="0x0101002A753C0138DF7844A934089D77451537" ma:contentTypeVersion="2" ma:contentTypeDescription="Create a new document." ma:contentTypeScope="" ma:versionID="96c54e059acb5f0eb43749fc5d225b23">
   <xsd:schema xmlns:xsd="http://www.w3.org/2001/XMLSchema" xmlns:xs="http://www.w3.org/2001/XMLSchema" xmlns:p="http://schemas.microsoft.com/office/2006/metadata/properties" xmlns:ns2="3d3e8831-6e63-47dc-a67b-b5409d0f3138" targetNamespace="http://schemas.microsoft.com/office/2006/metadata/properties" ma:root="true" ma:fieldsID="549fd1454158b6ccc14cdcf346f4fb16" ns2:_="">
     <xsd:import namespace="3d3e8831-6e63-47dc-a67b-b5409d0f3138"/>
@@ -41609,11 +41678,13 @@
 </ct:contentTypeSchema>
 </file>
 
-<file path=customXml/item3.xml><?xml version="1.0" encoding="utf-8"?>
-<b:Sources xmlns:b="http://schemas.openxmlformats.org/officeDocument/2006/bibliography" xmlns="http://schemas.openxmlformats.org/officeDocument/2006/bibliography" SelectedStyle="\APA.XSL" StyleName="APA Fifth Edition"/>
+<file path=customXml/item2.xml><?xml version="1.0" encoding="utf-8"?>
+<p:properties xmlns:p="http://schemas.microsoft.com/office/2006/metadata/properties" xmlns:xsi="http://www.w3.org/2001/XMLSchema-instance" xmlns:pc="http://schemas.microsoft.com/office/infopath/2007/PartnerControls">
+  <documentManagement/>
+</p:properties>
 </file>
 
-<file path=customXml/item4.xml><?xml version="1.0" encoding="utf-8"?>
+<file path=customXml/item3.xml><?xml version="1.0" encoding="utf-8"?>
 <?mso-contentType ?>
 <FormTemplates xmlns="http://schemas.microsoft.com/sharepoint/v3/contenttype/forms">
   <Display>DocumentLibraryForm</Display>
@@ -41622,16 +41693,11 @@
 </FormTemplates>
 </file>
 
-<file path=customXml/itemProps1.xml><?xml version="1.0" encoding="utf-8"?>
-<ds:datastoreItem xmlns:ds="http://schemas.openxmlformats.org/officeDocument/2006/customXml" ds:itemID="{4DB140F3-9185-4419-B48B-206E6423DF64}">
-  <ds:schemaRefs>
-    <ds:schemaRef ds:uri="http://schemas.microsoft.com/office/2006/metadata/properties"/>
-    <ds:schemaRef ds:uri="http://schemas.microsoft.com/office/infopath/2007/PartnerControls"/>
-  </ds:schemaRefs>
-</ds:datastoreItem>
+<file path=customXml/item4.xml><?xml version="1.0" encoding="utf-8"?>
+<b:Sources xmlns:b="http://schemas.openxmlformats.org/officeDocument/2006/bibliography" xmlns="http://schemas.openxmlformats.org/officeDocument/2006/bibliography" SelectedStyle="\APA.XSL" StyleName="APA Fifth Edition"/>
 </file>
 
-<file path=customXml/itemProps2.xml><?xml version="1.0" encoding="utf-8"?>
+<file path=customXml/itemProps1.xml><?xml version="1.0" encoding="utf-8"?>
 <ds:datastoreItem xmlns:ds="http://schemas.openxmlformats.org/officeDocument/2006/customXml" ds:itemID="{C56DA9F5-F417-4E3E-8F62-40A8378D7EC8}">
   <ds:schemaRefs>
     <ds:schemaRef ds:uri="http://schemas.microsoft.com/office/2006/metadata/contentType"/>
@@ -41649,18 +41715,27 @@
 </ds:datastoreItem>
 </file>
 
+<file path=customXml/itemProps2.xml><?xml version="1.0" encoding="utf-8"?>
+<ds:datastoreItem xmlns:ds="http://schemas.openxmlformats.org/officeDocument/2006/customXml" ds:itemID="{4DB140F3-9185-4419-B48B-206E6423DF64}">
+  <ds:schemaRefs>
+    <ds:schemaRef ds:uri="http://schemas.microsoft.com/office/2006/metadata/properties"/>
+    <ds:schemaRef ds:uri="http://schemas.microsoft.com/office/infopath/2007/PartnerControls"/>
+  </ds:schemaRefs>
+</ds:datastoreItem>
+</file>
+
 <file path=customXml/itemProps3.xml><?xml version="1.0" encoding="utf-8"?>
-<ds:datastoreItem xmlns:ds="http://schemas.openxmlformats.org/officeDocument/2006/customXml" ds:itemID="{22559CBF-6854-4BAD-8423-09C571AC1F1D}">
+<ds:datastoreItem xmlns:ds="http://schemas.openxmlformats.org/officeDocument/2006/customXml" ds:itemID="{D7F14D97-508F-4A59-83FB-5D81588101D8}">
   <ds:schemaRefs>
-    <ds:schemaRef ds:uri="http://schemas.openxmlformats.org/officeDocument/2006/bibliography"/>
+    <ds:schemaRef ds:uri="http://schemas.microsoft.com/sharepoint/v3/contenttype/forms"/>
   </ds:schemaRefs>
 </ds:datastoreItem>
 </file>
 
 <file path=customXml/itemProps4.xml><?xml version="1.0" encoding="utf-8"?>
-<ds:datastoreItem xmlns:ds="http://schemas.openxmlformats.org/officeDocument/2006/customXml" ds:itemID="{D7F14D97-508F-4A59-83FB-5D81588101D8}">
+<ds:datastoreItem xmlns:ds="http://schemas.openxmlformats.org/officeDocument/2006/customXml" ds:itemID="{22559CBF-6854-4BAD-8423-09C571AC1F1D}">
   <ds:schemaRefs>
-    <ds:schemaRef ds:uri="http://schemas.microsoft.com/sharepoint/v3/contenttype/forms"/>
+    <ds:schemaRef ds:uri="http://schemas.openxmlformats.org/officeDocument/2006/bibliography"/>
   </ds:schemaRefs>
 </ds:datastoreItem>
 </file>

</xml_diff>